<commit_message>
Update final manuscript and re-run consistency audit
Re-verified the manuscript against the codebase (55/55 claims
consistent) and refreshed the audit report timestamp and reference
count.

Co-Authored-By: Claude Sonnet 5 <noreply@anthropic.com>
</commit_message>
<xml_diff>
--- a/Economy_financial/Francesco_Romano_EU_Environmental_Claims_ABM_Paper_revised.docx
+++ b/Economy_financial/Francesco_Romano_EU_Environmental_Claims_ABM_Paper_revised.docx
@@ -120,17 +120,26 @@
     <w:p>
       <w:pPr>
         <w:pStyle w:val="Normal"/>
-        <w:rPr/>
-      </w:pPr>
-      <w:r>
-        <w:rPr/>
+        <w:rPr>
+          <w:sz w:val="22"/>
+          <w:szCs w:val="22"/>
+        </w:rPr>
+      </w:pPr>
+      <w:r>
+        <w:rPr>
+          <w:sz w:val="22"/>
+          <w:szCs w:val="22"/>
+        </w:rPr>
         <w:t>Environmental-claim governance combines an information problem with an institutional-capacity problem: regulators observe claims and uncertain evidence rather than firms' latent environmental states, while preventive scrutiny may suppress truthful communication. An information-safe agent-based model links corporate environmental claims to consumer demand, investor valuation, workforce responses, a limit-order-book market, and capacity-constrained supervision. The experiment compares current EU-style ex-post supervision with two proposed institutions: a voluntary algorithmic pre-screening hub and a certified green-data connector. A 28-parameter Latin-hypercube design evaluates 200 configurations at 120, 365, 1,000, and 2,000 days, with three paired common-random-number replications per configuration; a separate executed extension re-evaluates 12 representative configurations at 15 replications. Within the model, the hub reduces exposure-weighted claim severity in 85.0-90.5% of configurations across horizons, but systematically increases greenhushing and public and firm compliance costs. The connector is weak and heterogeneous at 120 days, improves severity in 60.5% of configurations at 365 days, and becomes robust at 1,000 and 2,000 days (97.0% and 100.0%), while remaining cost-intensive and increasing evidence-conflict workload. Default rankings reverse across horizons in 80.5% of matched configurations, showing why policy comparisons must be conditional on time, evidence quality, capacity, participation, and normative weights. A 30-seed stylized-facts validation of the market engine reproduces volatility clustering, positive spread and depth, trade-sign persistence, and cancellation activity; partially reproduces fat tails, the volume-volatility relation, and weak linear return autocorrelation; and does not reproduce positive price impact under the implemented diagnostic. The market layer is therefore reported as endogenous market response and financing context: firm greenwashing, disclosure, and transition-investment rules contain no own-share-price feedback, and no conclusion relies on stock-price discipline of corporate behavior. The results are transparent simulation-based policy orderings, not empirical forecasts or causal estimates.</w:t>
       </w:r>
     </w:p>
     <w:p>
       <w:pPr>
         <w:pStyle w:val="Normal"/>
-        <w:rPr/>
+        <w:rPr>
+          <w:sz w:val="22"/>
+          <w:szCs w:val="22"/>
+        </w:rPr>
       </w:pPr>
       <w:r>
         <w:rPr>
@@ -138,6 +147,7 @@
           <w:b/>
           <w:color w:val="1D2733"/>
           <w:sz w:val="22"/>
+          <w:szCs w:val="22"/>
         </w:rPr>
         <w:t>Keywords:</w:t>
       </w:r>
@@ -146,6 +156,7 @@
           <w:rFonts w:eastAsia="Times New Roman"/>
           <w:color w:val="1D2733"/>
           <w:sz w:val="22"/>
+          <w:szCs w:val="22"/>
         </w:rPr>
         <w:t xml:space="preserve"> agent-based computational economics; greenwashing; greenhushing; environmental claims; sustainable finance; consumer protection; regulatory technology; European Union; global sensitivity analysis; information asymmetry</w:t>
       </w:r>
@@ -163,13 +174,17 @@
     <w:p>
       <w:pPr>
         <w:pStyle w:val="Normal"/>
-        <w:rPr/>
+        <w:rPr>
+          <w:sz w:val="22"/>
+          <w:szCs w:val="22"/>
+        </w:rPr>
       </w:pPr>
       <w:r>
         <w:rPr>
           <w:rFonts w:eastAsia="Times New Roman"/>
           <w:color w:val="1D2733"/>
           <w:sz w:val="22"/>
+          <w:szCs w:val="22"/>
         </w:rPr>
         <w:t>Environmental communication is economically consequential because it can alter consumer choice, investor valuation, employee identification, and access to finance. The same communication is difficult to govern. A claim can be inaccurate because management strategically exaggerates, because the evidence is incomplete, because operational and reporting boundaries are not comparable, or because uncertainty is poorly disclosed. A public authority rarely observes the firm's physical environmental state directly. It works through claims, records, assurance procedures, complaints, public registers, and finite investigative capacity. The regulatory problem is therefore not simply to classify statements as true or false. It is to design procedures that improve the reliability of communication without confusing measurement error with misconduct or inducing firms to withdraw defensible information.</w:t>
       </w:r>
@@ -177,23 +192,44 @@
     <w:p>
       <w:pPr>
         <w:pStyle w:val="Normal"/>
+        <w:rPr>
+          <w:sz w:val="22"/>
+          <w:szCs w:val="22"/>
+        </w:rPr>
+      </w:pPr>
+      <w:r>
+        <w:rPr>
+          <w:sz w:val="22"/>
+          <w:szCs w:val="22"/>
+        </w:rPr>
+        <w:t xml:space="preserve">Research on greenwashing has described institutional, market, organizational, and individual drivers of misleading environmental communication (Delmas and Burbano, 2011), the diversity of practices covered by the term (Lyon and Montgomery, 2015), and the role of accusation and legitimacy in determining how claims are interpreted (Seele and Gatti, 2017). Economic work also shows that stronger scrutiny can deter exaggerated disclosure while causing some firms to disclose less overall (Lyon and Maxwell, 2011). </w:t>
+      </w:r>
+      <w:r>
         <w:rPr/>
-      </w:pPr>
-      <w:r>
-        <w:rPr/>
-        <w:t>Research on greenwashing has described institutional, market, organizational, and individual drivers of misleading environmental communication (Delmas and Burbano, 2011), the diversity of practices covered by the term (Lyon and Montgomery, 2015), and the role of accusation and legitimacy in determining how claims are interpreted (Seele and Gatti, 2017). Economic work also shows that stronger scrutiny can deter exaggerated disclosure while causing some firms to disclose less overall (Lyon and Maxwell, 2011). Field evidence on third-party sustainability ratings similarly indicates that independent evaluation can deter greenwashing (Parguel, Benoit-Moreau, and Larceneux, 2011). Selective disclosure is not reducible to a single firm-level environmental score: it depends on the claim, the omitted information, the audience, and the surrounding evidence (Marquis, Toffel, and Zhou, 2016). Greenhushing - the under-communication of sustainability practices - is established in the literature (Font, Elgammal, and Lamond, 2017), while strategic silence shows how withholding favourable certification information can be used to manage scrutiny and hypocrisy risk (Carlos and Lewis, 2018).</w:t>
+        <w:t>Experimental evidence</w:t>
+      </w:r>
+      <w:r>
+        <w:rPr>
+          <w:sz w:val="22"/>
+          <w:szCs w:val="22"/>
+        </w:rPr>
+        <w:t xml:space="preserve"> on third-party sustainability ratings similarly indicates that independent evaluation can deter greenwashing (Parguel, Benoit-Moreau, and Larceneux, 2011). Selective disclosure is not reducible to a single firm-level environmental score: it depends on the claim, the omitted information, the audience, and the surrounding evidence (Marquis, Toffel, and Zhou, 2016). Greenhushing - the under-communication of sustainability practices - is established in the literature (Font, Elgammal, and Lamond, 2017), while strategic silence shows how withholding favourable certification information can be used to manage scrutiny and hypocrisy risk (Carlos and Lewis, 2018).</w:t>
       </w:r>
     </w:p>
     <w:p>
       <w:pPr>
         <w:pStyle w:val="Normal"/>
-        <w:rPr/>
+        <w:rPr>
+          <w:sz w:val="22"/>
+          <w:szCs w:val="22"/>
+        </w:rPr>
       </w:pPr>
       <w:r>
         <w:rPr>
           <w:rFonts w:eastAsia="Times New Roman"/>
           <w:color w:val="1D2733"/>
           <w:sz w:val="22"/>
+          <w:szCs w:val="22"/>
         </w:rPr>
         <w:t>These observations motivate a computational approach. Agent-based computational economics represents economic processes as dynamic systems generated by heterogeneous, interacting agents (Tesfatsion, 2006). Agent-based finance is especially useful when investor strategies, market microstructure, credit, and feedback between prices and balance sheets matter (LeBaron, 2006). In the present model, corporate environmental investment and communication interact with heterogeneous consumers, fundamentalist and chartist traders, employees, a bank, a central bank, the State, assurance providers, and a capacity-constrained supervisor. The resulting system is not an empirical digital twin. It is a transparent computational laboratory in which institutional mechanisms can be altered while paired economic shocks are held constant.</w:t>
       </w:r>
@@ -201,13 +237,17 @@
     <w:p>
       <w:pPr>
         <w:pStyle w:val="Normal"/>
-        <w:rPr/>
+        <w:rPr>
+          <w:sz w:val="22"/>
+          <w:szCs w:val="22"/>
+        </w:rPr>
       </w:pPr>
       <w:r>
         <w:rPr>
           <w:rFonts w:eastAsia="Times New Roman"/>
           <w:color w:val="1D2733"/>
           <w:sz w:val="22"/>
+          <w:szCs w:val="22"/>
         </w:rPr>
         <w:t>The research question is: under what model conditions do capacity-constrained ex-post supervision, SME algorithmic pre-screening, and certified public environmental-data infrastructure perform differently? The question is comparative and conditional. It does not ask which institution is universally optimal. Policy performance can depend on the horizon, participation, regulatory strictness, administrative capacity, measurement failures, discounting, and the normative weights placed on accuracy, greenhushing, public expenditure, and smaller-firm burden.</w:t>
       </w:r>
@@ -215,23 +255,33 @@
     <w:p>
       <w:pPr>
         <w:pStyle w:val="Normal"/>
-        <w:rPr/>
-      </w:pPr>
-      <w:r>
-        <w:rPr/>
+        <w:rPr>
+          <w:sz w:val="22"/>
+          <w:szCs w:val="22"/>
+        </w:rPr>
+      </w:pPr>
+      <w:r>
+        <w:rPr>
+          <w:sz w:val="22"/>
+          <w:szCs w:val="22"/>
+        </w:rPr>
         <w:t>The analysis isolates two institutional mechanisms. Preventive screening can correct a draft before publication but can also delay or suppress defensible communication. Certified data exchange can improve evidence only as authorization, transfer, reconciliation, and correction accumulate. An information-safe procedural architecture makes false positives, inconclusive cases, evidence conflicts, and greenhushing endogenous. The paired design maps when these mechanisms change claim quality, cost, and communication; it does not estimate real-world policy effects.</w:t>
       </w:r>
     </w:p>
     <w:p>
       <w:pPr>
         <w:pStyle w:val="Normal"/>
-        <w:rPr/>
+        <w:rPr>
+          <w:sz w:val="22"/>
+          <w:szCs w:val="22"/>
+        </w:rPr>
       </w:pPr>
       <w:r>
         <w:rPr>
           <w:rFonts w:eastAsia="Times New Roman"/>
           <w:color w:val="1D2733"/>
           <w:sz w:val="22"/>
+          <w:szCs w:val="22"/>
         </w:rPr>
         <w:t>The legal architecture has a cut-off of 15 July 2026. Binding-law representations are kept distinct from policy experiments. The model represents the Unfair Commercial Practices Directive (UCPD), Directive (EU) 2024/825, corporate sustainability reporting as amended by Directive (EU) 2026/470, the EU Taxonomy, selected issuer-communication rules, the Corporate Sustainability Due Diligence Directive (CSDDD), and the European Green Bond framework. In contrast, the SME pre-screening hub and certified green data connector are proposed experimental institutions. The Commission proposal on substantiation and communication of explicit environmental claims is not treated as baseline law; its pre-verification logic is disabled by default and available only as a counterfactual.</w:t>
       </w:r>
@@ -239,13 +289,17 @@
     <w:p>
       <w:pPr>
         <w:pStyle w:val="Normal"/>
-        <w:rPr/>
+        <w:rPr>
+          <w:sz w:val="22"/>
+          <w:szCs w:val="22"/>
+        </w:rPr>
       </w:pPr>
       <w:r>
         <w:rPr>
           <w:rFonts w:eastAsia="Times New Roman"/>
           <w:color w:val="1D2733"/>
           <w:sz w:val="22"/>
+          <w:szCs w:val="22"/>
         </w:rPr>
         <w:t>The remainder of the paper describes the institutional map, model architecture, experimental design, findings, contributions, limitations, and archival provenance package.</w:t>
       </w:r>
@@ -332,8 +386,8 @@
       </w:tblPr>
       <w:tblGrid>
         <w:gridCol w:w="1500"/>
-        <w:gridCol w:w="3799"/>
-        <w:gridCol w:w="1661"/>
+        <w:gridCol w:w="3795"/>
+        <w:gridCol w:w="1665"/>
         <w:gridCol w:w="2400"/>
       </w:tblGrid>
       <w:tr>
@@ -373,7 +427,7 @@
         </w:tc>
         <w:tc>
           <w:tcPr>
-            <w:tcW w:w="3799" w:type="dxa"/>
+            <w:tcW w:w="3795" w:type="dxa"/>
             <w:tcBorders>
               <w:top w:val="single" w:sz="4" w:space="0" w:color="D4DCE6"/>
               <w:start w:val="single" w:sz="4" w:space="0" w:color="D4DCE6"/>
@@ -403,7 +457,7 @@
         </w:tc>
         <w:tc>
           <w:tcPr>
-            <w:tcW w:w="1661" w:type="dxa"/>
+            <w:tcW w:w="1665" w:type="dxa"/>
             <w:tcBorders>
               <w:top w:val="single" w:sz="4" w:space="0" w:color="D4DCE6"/>
               <w:start w:val="single" w:sz="4" w:space="0" w:color="D4DCE6"/>
@@ -497,7 +551,7 @@
         </w:tc>
         <w:tc>
           <w:tcPr>
-            <w:tcW w:w="3799" w:type="dxa"/>
+            <w:tcW w:w="3795" w:type="dxa"/>
             <w:tcBorders>
               <w:top w:val="single" w:sz="4" w:space="0" w:color="D4DCE6"/>
               <w:start w:val="single" w:sz="4" w:space="0" w:color="D4DCE6"/>
@@ -526,7 +580,7 @@
         </w:tc>
         <w:tc>
           <w:tcPr>
-            <w:tcW w:w="1661" w:type="dxa"/>
+            <w:tcW w:w="1665" w:type="dxa"/>
             <w:tcBorders>
               <w:top w:val="single" w:sz="4" w:space="0" w:color="D4DCE6"/>
               <w:start w:val="single" w:sz="4" w:space="0" w:color="D4DCE6"/>
@@ -619,7 +673,7 @@
         </w:tc>
         <w:tc>
           <w:tcPr>
-            <w:tcW w:w="3799" w:type="dxa"/>
+            <w:tcW w:w="3795" w:type="dxa"/>
             <w:tcBorders>
               <w:top w:val="single" w:sz="4" w:space="0" w:color="D4DCE6"/>
               <w:start w:val="single" w:sz="4" w:space="0" w:color="D4DCE6"/>
@@ -649,7 +703,7 @@
         </w:tc>
         <w:tc>
           <w:tcPr>
-            <w:tcW w:w="1661" w:type="dxa"/>
+            <w:tcW w:w="1665" w:type="dxa"/>
             <w:tcBorders>
               <w:top w:val="single" w:sz="4" w:space="0" w:color="D4DCE6"/>
               <w:start w:val="single" w:sz="4" w:space="0" w:color="D4DCE6"/>
@@ -743,7 +797,7 @@
         </w:tc>
         <w:tc>
           <w:tcPr>
-            <w:tcW w:w="3799" w:type="dxa"/>
+            <w:tcW w:w="3795" w:type="dxa"/>
             <w:tcBorders>
               <w:top w:val="single" w:sz="4" w:space="0" w:color="D4DCE6"/>
               <w:start w:val="single" w:sz="4" w:space="0" w:color="D4DCE6"/>
@@ -772,7 +826,7 @@
         </w:tc>
         <w:tc>
           <w:tcPr>
-            <w:tcW w:w="1661" w:type="dxa"/>
+            <w:tcW w:w="1665" w:type="dxa"/>
             <w:tcBorders>
               <w:top w:val="single" w:sz="4" w:space="0" w:color="D4DCE6"/>
               <w:start w:val="single" w:sz="4" w:space="0" w:color="D4DCE6"/>
@@ -865,7 +919,7 @@
         </w:tc>
         <w:tc>
           <w:tcPr>
-            <w:tcW w:w="3799" w:type="dxa"/>
+            <w:tcW w:w="3795" w:type="dxa"/>
             <w:tcBorders>
               <w:top w:val="single" w:sz="4" w:space="0" w:color="D4DCE6"/>
               <w:start w:val="single" w:sz="4" w:space="0" w:color="D4DCE6"/>
@@ -895,7 +949,7 @@
         </w:tc>
         <w:tc>
           <w:tcPr>
-            <w:tcW w:w="1661" w:type="dxa"/>
+            <w:tcW w:w="1665" w:type="dxa"/>
             <w:tcBorders>
               <w:top w:val="single" w:sz="4" w:space="0" w:color="D4DCE6"/>
               <w:start w:val="single" w:sz="4" w:space="0" w:color="D4DCE6"/>
@@ -989,7 +1043,7 @@
         </w:tc>
         <w:tc>
           <w:tcPr>
-            <w:tcW w:w="3799" w:type="dxa"/>
+            <w:tcW w:w="3795" w:type="dxa"/>
             <w:tcBorders>
               <w:top w:val="single" w:sz="4" w:space="0" w:color="D4DCE6"/>
               <w:start w:val="single" w:sz="4" w:space="0" w:color="D4DCE6"/>
@@ -1018,7 +1072,7 @@
         </w:tc>
         <w:tc>
           <w:tcPr>
-            <w:tcW w:w="1661" w:type="dxa"/>
+            <w:tcW w:w="1665" w:type="dxa"/>
             <w:tcBorders>
               <w:top w:val="single" w:sz="4" w:space="0" w:color="D4DCE6"/>
               <w:start w:val="single" w:sz="4" w:space="0" w:color="D4DCE6"/>
@@ -1115,7 +1169,7 @@
         </w:tc>
         <w:tc>
           <w:tcPr>
-            <w:tcW w:w="3799" w:type="dxa"/>
+            <w:tcW w:w="3795" w:type="dxa"/>
             <w:tcBorders>
               <w:top w:val="single" w:sz="4" w:space="0" w:color="D4DCE6"/>
               <w:start w:val="single" w:sz="4" w:space="0" w:color="D4DCE6"/>
@@ -1145,7 +1199,7 @@
         </w:tc>
         <w:tc>
           <w:tcPr>
-            <w:tcW w:w="1661" w:type="dxa"/>
+            <w:tcW w:w="1665" w:type="dxa"/>
             <w:tcBorders>
               <w:top w:val="single" w:sz="4" w:space="0" w:color="D4DCE6"/>
               <w:start w:val="single" w:sz="4" w:space="0" w:color="D4DCE6"/>
@@ -1243,7 +1297,7 @@
         </w:tc>
         <w:tc>
           <w:tcPr>
-            <w:tcW w:w="3799" w:type="dxa"/>
+            <w:tcW w:w="3795" w:type="dxa"/>
             <w:tcBorders>
               <w:top w:val="single" w:sz="4" w:space="0" w:color="D4DCE6"/>
               <w:start w:val="single" w:sz="4" w:space="0" w:color="D4DCE6"/>
@@ -1272,7 +1326,7 @@
         </w:tc>
         <w:tc>
           <w:tcPr>
-            <w:tcW w:w="1661" w:type="dxa"/>
+            <w:tcW w:w="1665" w:type="dxa"/>
             <w:tcBorders>
               <w:top w:val="single" w:sz="4" w:space="0" w:color="D4DCE6"/>
               <w:start w:val="single" w:sz="4" w:space="0" w:color="D4DCE6"/>
@@ -1365,7 +1419,7 @@
         </w:tc>
         <w:tc>
           <w:tcPr>
-            <w:tcW w:w="3799" w:type="dxa"/>
+            <w:tcW w:w="3795" w:type="dxa"/>
             <w:tcBorders>
               <w:top w:val="single" w:sz="4" w:space="0" w:color="D4DCE6"/>
               <w:start w:val="single" w:sz="4" w:space="0" w:color="D4DCE6"/>
@@ -1395,7 +1449,7 @@
         </w:tc>
         <w:tc>
           <w:tcPr>
-            <w:tcW w:w="1661" w:type="dxa"/>
+            <w:tcW w:w="1665" w:type="dxa"/>
             <w:tcBorders>
               <w:top w:val="single" w:sz="4" w:space="0" w:color="D4DCE6"/>
               <w:start w:val="single" w:sz="4" w:space="0" w:color="D4DCE6"/>
@@ -1482,10 +1536,16 @@
     <w:p>
       <w:pPr>
         <w:pStyle w:val="Normal"/>
-        <w:rPr/>
-      </w:pPr>
-      <w:r>
-        <w:rPr/>
+        <w:rPr>
+          <w:sz w:val="22"/>
+          <w:szCs w:val="22"/>
+        </w:rPr>
+      </w:pPr>
+      <w:r>
+        <w:rPr>
+          <w:sz w:val="22"/>
+          <w:szCs w:val="22"/>
+        </w:rPr>
         <w:t>Directive (EU) 2019/2161 strengthens enforcement and penalty availability for widespread infringements and widespread infringements with a Union dimension (European Parliament and Council, 2019). It requires Member States to set the maximum fine for the relevant infringements at no less than 4% of the trader's annual turnover in the Member State or Member States concerned. It does not establish 4% as a uniform EU ceiling. The unchanged model therefore treats an exact 4% cap as a LEGAL-ANCHOR scenario choice, available only when a case is classified as a coordinated widespread cross-border consumer infringement. Ordinary simulated cases use a separate 1% experimental cap applied to a simulation-scale turnover proxy.</w:t>
       </w:r>
     </w:p>
@@ -1520,20 +1580,32 @@
     <w:p>
       <w:pPr>
         <w:pStyle w:val="Normal"/>
-        <w:rPr/>
-      </w:pPr>
-      <w:r>
-        <w:rPr/>
+        <w:rPr>
+          <w:sz w:val="22"/>
+          <w:szCs w:val="22"/>
+        </w:rPr>
+      </w:pPr>
+      <w:r>
+        <w:rPr>
+          <w:sz w:val="22"/>
+          <w:szCs w:val="22"/>
+        </w:rPr>
         <w:t>Issuer and capital-market communications are screened separately under reduced-form representations of the Market Abuse Regulation, Prospectus Regulation, and Transparency Directive (European Parliament and Council, 2014; 2017; 2004). This is necessary because the UCPD is a consumer-protection instrument and is not used as a universal basis for investor-directed communication. The model also includes a voluntary European Green Bond use-of-proceeds track under Regulation (EU) 2023/2631 (European Parliament and Council, 2023a), with proceeds and expenditure ledgers that preserve the identity between issuance, unspent proceeds, and green expenditure.</w:t>
       </w:r>
     </w:p>
     <w:p>
       <w:pPr>
         <w:pStyle w:val="Normal"/>
-        <w:rPr/>
-      </w:pPr>
-      <w:r>
-        <w:rPr/>
+        <w:rPr>
+          <w:sz w:val="22"/>
+          <w:szCs w:val="22"/>
+        </w:rPr>
+      </w:pPr>
+      <w:r>
+        <w:rPr>
+          <w:sz w:val="22"/>
+          <w:szCs w:val="22"/>
+        </w:rPr>
         <w:t>The CSDDD is represented only as a reduced-form due-diligence procedure (European Parliament and Council, 2024b, as amended in 2026). Its 3% maximum is callable only for due-diligence cases, and the model's application date is 26 July 2029. Directive (EU) 2026/470 also revises the principal undertaking threshold to more than 5,000 employees and more than EUR 1.5 billion net worldwide turnover, with separate group, franchise, and third-country rules. The current model gates CSDDD by date and remedy track but does not implement that complete firm-scope test; it must therefore not be described as a doctrinally complete CSDDD implementation. Greenhushing is not modeled as an offence.</w:t>
       </w:r>
     </w:p>
@@ -1550,30 +1622,48 @@
     <w:p>
       <w:pPr>
         <w:pStyle w:val="Normal"/>
-        <w:rPr/>
-      </w:pPr>
-      <w:r>
-        <w:rPr/>
+        <w:rPr>
+          <w:sz w:val="22"/>
+          <w:szCs w:val="22"/>
+        </w:rPr>
+      </w:pPr>
+      <w:r>
+        <w:rPr>
+          <w:sz w:val="22"/>
+          <w:szCs w:val="22"/>
+        </w:rPr>
         <w:t>Regime B is an original EXPERIMENT institutional design, not an enacted EU pre-verification obligation. It combines the preventive substantiation and verification logic of COM(2023) 166 with RegTech and SupTech screening concepts (European Commission, 2023a; Broeders and Prenio, 2018; Financial Stability Board, 2020). The hub is a voluntary, non-binding drafting and feedback service for undertakings outside mandatory CSRD scope; the model's 1,000-employee eligibility line is a legal anchor for the experimental target group, not a general EU definition of an SME or an exemption from consumer law. Drafts are withheld during review and may be revised, withdrawn, or published, with an explicit no-endorsement disclaimer. This design tests whether early feedback corrects claims at the cost of delay or suppression of truthful communication.</w:t>
       </w:r>
     </w:p>
     <w:p>
       <w:pPr>
         <w:pStyle w:val="Normal"/>
-        <w:rPr/>
-      </w:pPr>
-      <w:r>
-        <w:rPr/>
+        <w:rPr>
+          <w:sz w:val="22"/>
+          <w:szCs w:val="22"/>
+        </w:rPr>
+      </w:pPr>
+      <w:r>
+        <w:rPr>
+          <w:sz w:val="22"/>
+          <w:szCs w:val="22"/>
+        </w:rPr>
         <w:t>Regime C is an original EXPERIMENT public data-governance infrastructure. It is not a physical emissions-monitoring device, a sensor network, a Digital Product Passport, or an enacted EU reporting obligation. Its conceptual basis is the boundary and provenance discipline of corporate GHG accounting and ESRS E1, together with interoperable data-sharing and identifier architectures in the Data Act, the Ecodesign for Sustainable Products Regulation, and the PACT methodology and technical specifications (GHG Protocol, 2004, 2011; European Commission, 2023b; European Parliament and Council, 2023b, 2024c; Partnership for Carbon Transparency, 2025a, 2025b). The connector is an interoperability and evidence-reconciliation layer: it uses data already generated by meters, suppliers, registries, and verified datasets, subject to source-specific authorization, consent and revocation. Provenance, uncertainty, coverage, staleness, mismatches, register errors, corrections, and conflicts remain explicit. It cannot supply missing underlying measurement infrastructure, and a connector record can initiate reconciliation but cannot sanction a firm by itself.</w:t>
       </w:r>
     </w:p>
     <w:p>
       <w:pPr>
         <w:pStyle w:val="Normal"/>
-        <w:rPr/>
-      </w:pPr>
-      <w:r>
-        <w:rPr/>
+        <w:rPr>
+          <w:sz w:val="22"/>
+          <w:szCs w:val="22"/>
+        </w:rPr>
+      </w:pPr>
+      <w:r>
+        <w:rPr>
+          <w:sz w:val="22"/>
+          <w:szCs w:val="22"/>
+        </w:rPr>
         <w:t>The Commission proposal COM(2023) 166 on explicit environmental claims is referenced only to delimit the counterfactual space (European Commission, 2023a). The model's pre-verification switch is off. Accordingly, no result in the baseline campaign should be interpreted as an evaluation of an enacted Green Claims Directive.</w:t>
       </w:r>
     </w:p>
@@ -1590,40 +1680,64 @@
     <w:p>
       <w:pPr>
         <w:pStyle w:val="Normal"/>
-        <w:rPr/>
-      </w:pPr>
-      <w:r>
-        <w:rPr/>
+        <w:rPr>
+          <w:sz w:val="22"/>
+          <w:szCs w:val="22"/>
+        </w:rPr>
+      </w:pPr>
+      <w:r>
+        <w:rPr>
+          <w:sz w:val="22"/>
+          <w:szCs w:val="22"/>
+        </w:rPr>
         <w:t>The greenwashing literature motivates the model's distinction among overstatement, incomplete evidence, selective disclosure, and communication withdrawal. Audit threat can reduce exaggerated disclosure while discouraging some truthful disclosure (Lyon and Maxwell, 2011); scrutiny and organizational norms shape selective disclosure (Marquis, Toffel, and Zhou, 2016); and greenhushing or strategic silence can limit favourable communication (Font, Elgammal, and Lamond, 2017; Carlos and Lewis, 2018). These mechanisms support endogenous revision and withdrawal, but they do not empirically calibrate either experimental institution.</w:t>
       </w:r>
     </w:p>
     <w:p>
       <w:pPr>
         <w:pStyle w:val="Normal"/>
-        <w:rPr/>
-      </w:pPr>
-      <w:r>
-        <w:rPr/>
+        <w:rPr>
+          <w:sz w:val="22"/>
+          <w:szCs w:val="22"/>
+        </w:rPr>
+      </w:pPr>
+      <w:r>
+        <w:rPr>
+          <w:sz w:val="22"/>
+          <w:szCs w:val="22"/>
+        </w:rPr>
         <w:t>RegTech and SupTech research emphasizes automated data collection and screening, prospective surveillance, supervisory capacity, data quality, explainability, and operational risk (Broeders and Prenio, 2018; Financial Stability Board, 2020). Corporate GHG standards, ESRS E1, the Data Act, Digital Product Passport architecture, and PACT specifications provide closer foundations for accounting boundaries, provenance, identifiers, and interoperable value-chain data exchange. They motivate design dimensions of the connector rather than validate its parameters or make it an implementation of an existing obligation.</w:t>
       </w:r>
     </w:p>
     <w:p>
       <w:pPr>
         <w:pStyle w:val="Normal"/>
-        <w:rPr/>
-      </w:pPr>
-      <w:r>
-        <w:rPr/>
+        <w:rPr>
+          <w:sz w:val="22"/>
+          <w:szCs w:val="22"/>
+        </w:rPr>
+      </w:pPr>
+      <w:r>
+        <w:rPr>
+          <w:sz w:val="22"/>
+          <w:szCs w:val="22"/>
+        </w:rPr>
         <w:t>Financial agent-based models are commonly assessed against fat-tailed returns, volatility clustering, and limited linear return predictability (Cont, 2001; Lux and Marchesi, 1999). Reproducing selected stylized facts is weaker than empirical calibration or out-of-sample validation. This paper therefore reports each diagnostic as reproduced, partially reproduced, or not reproduced.</w:t>
       </w:r>
     </w:p>
     <w:p>
       <w:pPr>
         <w:pStyle w:val="Normal"/>
-        <w:rPr/>
-      </w:pPr>
-      <w:r>
-        <w:rPr/>
+        <w:rPr>
+          <w:sz w:val="22"/>
+          <w:szCs w:val="22"/>
+        </w:rPr>
+      </w:pPr>
+      <w:r>
+        <w:rPr>
+          <w:sz w:val="22"/>
+          <w:szCs w:val="22"/>
+        </w:rPr>
         <w:t>Against these literatures, the comparison asks how preventive screening, interoperable evidence, and ex-post supervision differ when evidence remains uncertain and administrative capacity is scarce. The contribution is the joint mechanism test under common shocks, not a claim that the individual components are novel or that the experiment estimates policy effects.</w:t>
       </w:r>
     </w:p>
@@ -1688,10 +1802,16 @@
     <w:p>
       <w:pPr>
         <w:pStyle w:val="Normal"/>
-        <w:rPr/>
-      </w:pPr>
-      <w:r>
-        <w:rPr/>
+        <w:rPr>
+          <w:sz w:val="22"/>
+          <w:szCs w:val="22"/>
+        </w:rPr>
+      </w:pPr>
+      <w:r>
+        <w:rPr>
+          <w:sz w:val="22"/>
+          <w:szCs w:val="22"/>
+        </w:rPr>
         <w:t>INFORMATION-SAFE STYLIZATION: the architecture separates the physical or latent environmental state from the information available to every operational decision-maker. This boundary is substantive: claim accuracy and supervisory performance must arise from evidence and procedure rather than oracle access.</w:t>
       </w:r>
     </w:p>
@@ -1742,10 +1862,10 @@
         <w:tblLook w:val="04a0" w:firstRow="1" w:noVBand="1" w:lastRow="0" w:firstColumn="1" w:lastColumn="0" w:noHBand="0"/>
       </w:tblPr>
       <w:tblGrid>
-        <w:gridCol w:w="1249"/>
-        <w:gridCol w:w="1201"/>
-        <w:gridCol w:w="4049"/>
-        <w:gridCol w:w="2861"/>
+        <w:gridCol w:w="1245"/>
+        <w:gridCol w:w="1205"/>
+        <w:gridCol w:w="4045"/>
+        <w:gridCol w:w="2865"/>
       </w:tblGrid>
       <w:tr>
         <w:trPr>
@@ -1754,7 +1874,7 @@
         </w:trPr>
         <w:tc>
           <w:tcPr>
-            <w:tcW w:w="1249" w:type="dxa"/>
+            <w:tcW w:w="1245" w:type="dxa"/>
             <w:tcBorders>
               <w:top w:val="single" w:sz="4" w:space="0" w:color="D4DCE6"/>
               <w:start w:val="single" w:sz="4" w:space="0" w:color="D4DCE6"/>
@@ -1784,7 +1904,7 @@
         </w:tc>
         <w:tc>
           <w:tcPr>
-            <w:tcW w:w="1201" w:type="dxa"/>
+            <w:tcW w:w="1205" w:type="dxa"/>
             <w:tcBorders>
               <w:top w:val="single" w:sz="4" w:space="0" w:color="D4DCE6"/>
               <w:start w:val="single" w:sz="4" w:space="0" w:color="D4DCE6"/>
@@ -1814,7 +1934,7 @@
         </w:tc>
         <w:tc>
           <w:tcPr>
-            <w:tcW w:w="4049" w:type="dxa"/>
+            <w:tcW w:w="4045" w:type="dxa"/>
             <w:tcBorders>
               <w:top w:val="single" w:sz="4" w:space="0" w:color="D4DCE6"/>
               <w:start w:val="single" w:sz="4" w:space="0" w:color="D4DCE6"/>
@@ -1844,7 +1964,7 @@
         </w:tc>
         <w:tc>
           <w:tcPr>
-            <w:tcW w:w="2861" w:type="dxa"/>
+            <w:tcW w:w="2865" w:type="dxa"/>
             <w:tcBorders>
               <w:top w:val="single" w:sz="4" w:space="0" w:color="D4DCE6"/>
               <w:start w:val="single" w:sz="4" w:space="0" w:color="D4DCE6"/>
@@ -1879,7 +1999,7 @@
         </w:trPr>
         <w:tc>
           <w:tcPr>
-            <w:tcW w:w="1249" w:type="dxa"/>
+            <w:tcW w:w="1245" w:type="dxa"/>
             <w:tcBorders>
               <w:top w:val="single" w:sz="4" w:space="0" w:color="D4DCE6"/>
               <w:start w:val="single" w:sz="4" w:space="0" w:color="D4DCE6"/>
@@ -1908,7 +2028,7 @@
         </w:tc>
         <w:tc>
           <w:tcPr>
-            <w:tcW w:w="1201" w:type="dxa"/>
+            <w:tcW w:w="1205" w:type="dxa"/>
             <w:tcBorders>
               <w:top w:val="single" w:sz="4" w:space="0" w:color="D4DCE6"/>
               <w:start w:val="single" w:sz="4" w:space="0" w:color="D4DCE6"/>
@@ -1937,7 +2057,7 @@
         </w:tc>
         <w:tc>
           <w:tcPr>
-            <w:tcW w:w="4049" w:type="dxa"/>
+            <w:tcW w:w="4045" w:type="dxa"/>
             <w:tcBorders>
               <w:top w:val="single" w:sz="4" w:space="0" w:color="D4DCE6"/>
               <w:start w:val="single" w:sz="4" w:space="0" w:color="D4DCE6"/>
@@ -1966,7 +2086,7 @@
         </w:tc>
         <w:tc>
           <w:tcPr>
-            <w:tcW w:w="2861" w:type="dxa"/>
+            <w:tcW w:w="2865" w:type="dxa"/>
             <w:tcBorders>
               <w:top w:val="single" w:sz="4" w:space="0" w:color="D4DCE6"/>
               <w:start w:val="single" w:sz="4" w:space="0" w:color="D4DCE6"/>
@@ -2000,7 +2120,7 @@
         </w:trPr>
         <w:tc>
           <w:tcPr>
-            <w:tcW w:w="1249" w:type="dxa"/>
+            <w:tcW w:w="1245" w:type="dxa"/>
             <w:tcBorders>
               <w:top w:val="single" w:sz="4" w:space="0" w:color="D4DCE6"/>
               <w:start w:val="single" w:sz="4" w:space="0" w:color="D4DCE6"/>
@@ -2030,7 +2150,7 @@
         </w:tc>
         <w:tc>
           <w:tcPr>
-            <w:tcW w:w="1201" w:type="dxa"/>
+            <w:tcW w:w="1205" w:type="dxa"/>
             <w:tcBorders>
               <w:top w:val="single" w:sz="4" w:space="0" w:color="D4DCE6"/>
               <w:start w:val="single" w:sz="4" w:space="0" w:color="D4DCE6"/>
@@ -2060,7 +2180,7 @@
         </w:tc>
         <w:tc>
           <w:tcPr>
-            <w:tcW w:w="4049" w:type="dxa"/>
+            <w:tcW w:w="4045" w:type="dxa"/>
             <w:tcBorders>
               <w:top w:val="single" w:sz="4" w:space="0" w:color="D4DCE6"/>
               <w:start w:val="single" w:sz="4" w:space="0" w:color="D4DCE6"/>
@@ -2090,7 +2210,7 @@
         </w:tc>
         <w:tc>
           <w:tcPr>
-            <w:tcW w:w="2861" w:type="dxa"/>
+            <w:tcW w:w="2865" w:type="dxa"/>
             <w:tcBorders>
               <w:top w:val="single" w:sz="4" w:space="0" w:color="D4DCE6"/>
               <w:start w:val="single" w:sz="4" w:space="0" w:color="D4DCE6"/>
@@ -2125,7 +2245,7 @@
         </w:trPr>
         <w:tc>
           <w:tcPr>
-            <w:tcW w:w="1249" w:type="dxa"/>
+            <w:tcW w:w="1245" w:type="dxa"/>
             <w:tcBorders>
               <w:top w:val="single" w:sz="4" w:space="0" w:color="D4DCE6"/>
               <w:start w:val="single" w:sz="4" w:space="0" w:color="D4DCE6"/>
@@ -2154,7 +2274,7 @@
         </w:tc>
         <w:tc>
           <w:tcPr>
-            <w:tcW w:w="1201" w:type="dxa"/>
+            <w:tcW w:w="1205" w:type="dxa"/>
             <w:tcBorders>
               <w:top w:val="single" w:sz="4" w:space="0" w:color="D4DCE6"/>
               <w:start w:val="single" w:sz="4" w:space="0" w:color="D4DCE6"/>
@@ -2183,7 +2303,7 @@
         </w:tc>
         <w:tc>
           <w:tcPr>
-            <w:tcW w:w="4049" w:type="dxa"/>
+            <w:tcW w:w="4045" w:type="dxa"/>
             <w:tcBorders>
               <w:top w:val="single" w:sz="4" w:space="0" w:color="D4DCE6"/>
               <w:start w:val="single" w:sz="4" w:space="0" w:color="D4DCE6"/>
@@ -2212,7 +2332,7 @@
         </w:tc>
         <w:tc>
           <w:tcPr>
-            <w:tcW w:w="2861" w:type="dxa"/>
+            <w:tcW w:w="2865" w:type="dxa"/>
             <w:tcBorders>
               <w:top w:val="single" w:sz="4" w:space="0" w:color="D4DCE6"/>
               <w:start w:val="single" w:sz="4" w:space="0" w:color="D4DCE6"/>
@@ -2246,7 +2366,7 @@
         </w:trPr>
         <w:tc>
           <w:tcPr>
-            <w:tcW w:w="1249" w:type="dxa"/>
+            <w:tcW w:w="1245" w:type="dxa"/>
             <w:tcBorders>
               <w:top w:val="single" w:sz="4" w:space="0" w:color="D4DCE6"/>
               <w:start w:val="single" w:sz="4" w:space="0" w:color="D4DCE6"/>
@@ -2276,7 +2396,7 @@
         </w:tc>
         <w:tc>
           <w:tcPr>
-            <w:tcW w:w="1201" w:type="dxa"/>
+            <w:tcW w:w="1205" w:type="dxa"/>
             <w:tcBorders>
               <w:top w:val="single" w:sz="4" w:space="0" w:color="D4DCE6"/>
               <w:start w:val="single" w:sz="4" w:space="0" w:color="D4DCE6"/>
@@ -2306,7 +2426,7 @@
         </w:tc>
         <w:tc>
           <w:tcPr>
-            <w:tcW w:w="4049" w:type="dxa"/>
+            <w:tcW w:w="4045" w:type="dxa"/>
             <w:tcBorders>
               <w:top w:val="single" w:sz="4" w:space="0" w:color="D4DCE6"/>
               <w:start w:val="single" w:sz="4" w:space="0" w:color="D4DCE6"/>
@@ -2336,7 +2456,7 @@
         </w:tc>
         <w:tc>
           <w:tcPr>
-            <w:tcW w:w="2861" w:type="dxa"/>
+            <w:tcW w:w="2865" w:type="dxa"/>
             <w:tcBorders>
               <w:top w:val="single" w:sz="4" w:space="0" w:color="D4DCE6"/>
               <w:start w:val="single" w:sz="4" w:space="0" w:color="D4DCE6"/>
@@ -2371,7 +2491,7 @@
         </w:trPr>
         <w:tc>
           <w:tcPr>
-            <w:tcW w:w="1249" w:type="dxa"/>
+            <w:tcW w:w="1245" w:type="dxa"/>
             <w:tcBorders>
               <w:top w:val="single" w:sz="4" w:space="0" w:color="D4DCE6"/>
               <w:start w:val="single" w:sz="4" w:space="0" w:color="D4DCE6"/>
@@ -2400,7 +2520,7 @@
         </w:tc>
         <w:tc>
           <w:tcPr>
-            <w:tcW w:w="1201" w:type="dxa"/>
+            <w:tcW w:w="1205" w:type="dxa"/>
             <w:tcBorders>
               <w:top w:val="single" w:sz="4" w:space="0" w:color="D4DCE6"/>
               <w:start w:val="single" w:sz="4" w:space="0" w:color="D4DCE6"/>
@@ -2429,7 +2549,7 @@
         </w:tc>
         <w:tc>
           <w:tcPr>
-            <w:tcW w:w="4049" w:type="dxa"/>
+            <w:tcW w:w="4045" w:type="dxa"/>
             <w:tcBorders>
               <w:top w:val="single" w:sz="4" w:space="0" w:color="D4DCE6"/>
               <w:start w:val="single" w:sz="4" w:space="0" w:color="D4DCE6"/>
@@ -2458,7 +2578,7 @@
         </w:tc>
         <w:tc>
           <w:tcPr>
-            <w:tcW w:w="2861" w:type="dxa"/>
+            <w:tcW w:w="2865" w:type="dxa"/>
             <w:tcBorders>
               <w:top w:val="single" w:sz="4" w:space="0" w:color="D4DCE6"/>
               <w:start w:val="single" w:sz="4" w:space="0" w:color="D4DCE6"/>
@@ -2492,7 +2612,7 @@
         </w:trPr>
         <w:tc>
           <w:tcPr>
-            <w:tcW w:w="1249" w:type="dxa"/>
+            <w:tcW w:w="1245" w:type="dxa"/>
             <w:tcBorders>
               <w:top w:val="single" w:sz="4" w:space="0" w:color="D4DCE6"/>
               <w:start w:val="single" w:sz="4" w:space="0" w:color="D4DCE6"/>
@@ -2522,7 +2642,7 @@
         </w:tc>
         <w:tc>
           <w:tcPr>
-            <w:tcW w:w="1201" w:type="dxa"/>
+            <w:tcW w:w="1205" w:type="dxa"/>
             <w:tcBorders>
               <w:top w:val="single" w:sz="4" w:space="0" w:color="D4DCE6"/>
               <w:start w:val="single" w:sz="4" w:space="0" w:color="D4DCE6"/>
@@ -2552,7 +2672,7 @@
         </w:tc>
         <w:tc>
           <w:tcPr>
-            <w:tcW w:w="4049" w:type="dxa"/>
+            <w:tcW w:w="4045" w:type="dxa"/>
             <w:tcBorders>
               <w:top w:val="single" w:sz="4" w:space="0" w:color="D4DCE6"/>
               <w:start w:val="single" w:sz="4" w:space="0" w:color="D4DCE6"/>
@@ -2582,7 +2702,7 @@
         </w:tc>
         <w:tc>
           <w:tcPr>
-            <w:tcW w:w="2861" w:type="dxa"/>
+            <w:tcW w:w="2865" w:type="dxa"/>
             <w:tcBorders>
               <w:top w:val="single" w:sz="4" w:space="0" w:color="D4DCE6"/>
               <w:start w:val="single" w:sz="4" w:space="0" w:color="D4DCE6"/>
@@ -2617,7 +2737,7 @@
         </w:trPr>
         <w:tc>
           <w:tcPr>
-            <w:tcW w:w="1249" w:type="dxa"/>
+            <w:tcW w:w="1245" w:type="dxa"/>
             <w:tcBorders>
               <w:top w:val="single" w:sz="4" w:space="0" w:color="D4DCE6"/>
               <w:start w:val="single" w:sz="4" w:space="0" w:color="D4DCE6"/>
@@ -2646,7 +2766,7 @@
         </w:tc>
         <w:tc>
           <w:tcPr>
-            <w:tcW w:w="1201" w:type="dxa"/>
+            <w:tcW w:w="1205" w:type="dxa"/>
             <w:tcBorders>
               <w:top w:val="single" w:sz="4" w:space="0" w:color="D4DCE6"/>
               <w:start w:val="single" w:sz="4" w:space="0" w:color="D4DCE6"/>
@@ -2675,7 +2795,7 @@
         </w:tc>
         <w:tc>
           <w:tcPr>
-            <w:tcW w:w="4049" w:type="dxa"/>
+            <w:tcW w:w="4045" w:type="dxa"/>
             <w:tcBorders>
               <w:top w:val="single" w:sz="4" w:space="0" w:color="D4DCE6"/>
               <w:start w:val="single" w:sz="4" w:space="0" w:color="D4DCE6"/>
@@ -2704,7 +2824,7 @@
         </w:tc>
         <w:tc>
           <w:tcPr>
-            <w:tcW w:w="2861" w:type="dxa"/>
+            <w:tcW w:w="2865" w:type="dxa"/>
             <w:tcBorders>
               <w:top w:val="single" w:sz="4" w:space="0" w:color="D4DCE6"/>
               <w:start w:val="single" w:sz="4" w:space="0" w:color="D4DCE6"/>
@@ -2784,10 +2904,16 @@
     <w:p>
       <w:pPr>
         <w:pStyle w:val="Normal"/>
-        <w:rPr/>
-      </w:pPr>
-      <w:r>
-        <w:rPr/>
+        <w:rPr>
+          <w:sz w:val="22"/>
+          <w:szCs w:val="22"/>
+        </w:rPr>
+      </w:pPr>
+      <w:r>
+        <w:rPr>
+          <w:sz w:val="22"/>
+          <w:szCs w:val="22"/>
+        </w:rPr>
         <w:t>The environmental fact vector records Scope 1, 2, and 3 emissions; energy use and renewable share; water; waste and recycling; pollution; biodiversity pressure; Taxonomy-eligible and aligned turnover, capital expenditure, and operating expenditure; real environmental capital expenditure; and offsets separated from gross emissions. Records carry periods, group or operational boundaries, methodologies, and uncertainty. Scope categories and boundary metadata are motivated by GHG Protocol and ESRS E1 reporting architecture, but the vector is a STYLIZATION, not a complete compliant inventory or lifecycle assessment (GHG Protocol, 2004, 2011; European Commission, 2023b).</w:t>
       </w:r>
     </w:p>
@@ -2837,14 +2963,18 @@
       <w:pPr>
         <w:pStyle w:val="Equation"/>
         <w:jc w:val="center"/>
-        <w:rPr/>
+        <w:rPr>
+          <w:sz w:val="22"/>
+          <w:szCs w:val="22"/>
+        </w:rPr>
       </w:pPr>
       <w:r>
         <w:rPr>
           <w:rFonts w:eastAsia="Cambria Math" w:ascii="Cambria Math" w:hAnsi="Cambria Math"/>
           <w:i/>
           <w:color w:val="17365D"/>
-          <w:sz w:val="21"/>
+          <w:sz w:val="22"/>
+          <w:szCs w:val="22"/>
         </w:rPr>
         <w:t>d = asserted value - evidence estimate,</w:t>
       </w:r>
@@ -2867,14 +2997,18 @@
       <w:pPr>
         <w:pStyle w:val="Equation"/>
         <w:jc w:val="center"/>
-        <w:rPr/>
+        <w:rPr>
+          <w:sz w:val="22"/>
+          <w:szCs w:val="22"/>
+        </w:rPr>
       </w:pPr>
       <w:r>
         <w:rPr>
           <w:rFonts w:eastAsia="Cambria Math" w:ascii="Cambria Math" w:hAnsi="Cambria Math"/>
           <w:i/>
           <w:color w:val="17365D"/>
-          <w:sz w:val="21"/>
+          <w:sz w:val="22"/>
+          <w:szCs w:val="22"/>
         </w:rPr>
         <w:t>z_over = max(0, d) / sqrt(evidence error^2 + stated uncertainty^2 + positive floor).</w:t>
       </w:r>
@@ -2920,23 +3054,33 @@
     <w:p>
       <w:pPr>
         <w:pStyle w:val="Normal"/>
-        <w:rPr/>
-      </w:pPr>
-      <w:r>
-        <w:rPr/>
+        <w:rPr>
+          <w:sz w:val="22"/>
+          <w:szCs w:val="22"/>
+        </w:rPr>
+      </w:pPr>
+      <w:r>
+        <w:rPr>
+          <w:sz w:val="22"/>
+          <w:szCs w:val="22"/>
+        </w:rPr>
         <w:t>CORPORATE-CHOICE STYLIZATION: at reporting epochs, the firm searches a transparent discrete grid over real environmental investment, voluntary communication intensity, qualification, evidence effort, and possible overstatement. The objective contains a green communication premium, missed truthful premium, investment and evidence costs, qualification cost, compliance burden, and expected enforcement. The discrete grid keeps the mechanism inspectable; its coefficients and choice responses are not behaviorally estimated.</w:t>
       </w:r>
     </w:p>
     <w:p>
       <w:pPr>
         <w:pStyle w:val="Normal"/>
-        <w:rPr/>
+        <w:rPr>
+          <w:sz w:val="22"/>
+          <w:szCs w:val="22"/>
+        </w:rPr>
       </w:pPr>
       <w:r>
         <w:rPr>
           <w:rFonts w:eastAsia="Times New Roman"/>
           <w:color w:val="1D2733"/>
           <w:sz w:val="22"/>
+          <w:szCs w:val="22"/>
         </w:rPr>
         <w:t>The truthful communication benchmark is:</w:t>
       </w:r>
@@ -2945,14 +3089,18 @@
       <w:pPr>
         <w:pStyle w:val="Equation"/>
         <w:jc w:val="center"/>
-        <w:rPr/>
+        <w:rPr>
+          <w:sz w:val="22"/>
+          <w:szCs w:val="22"/>
+        </w:rPr>
       </w:pPr>
       <w:r>
         <w:rPr>
           <w:rFonts w:eastAsia="Cambria Math" w:ascii="Cambria Math" w:hAnsi="Cambria Math"/>
           <w:i/>
           <w:color w:val="17365D"/>
-          <w:sz w:val="21"/>
+          <w:sz w:val="22"/>
+          <w:szCs w:val="22"/>
         </w:rPr>
         <w:t>q_truthful = clip(0.20 + 0.70 x real environmental score, 0, 1),</w:t>
       </w:r>
@@ -2960,13 +3108,17 @@
     <w:p>
       <w:pPr>
         <w:pStyle w:val="Normal"/>
-        <w:rPr/>
+        <w:rPr>
+          <w:sz w:val="22"/>
+          <w:szCs w:val="22"/>
+        </w:rPr>
       </w:pPr>
       <w:r>
         <w:rPr>
           <w:rFonts w:eastAsia="Times New Roman"/>
           <w:color w:val="1D2733"/>
           <w:sz w:val="22"/>
+          <w:szCs w:val="22"/>
         </w:rPr>
         <w:t>and the greenhushing gap is:</w:t>
       </w:r>
@@ -2975,14 +3127,18 @@
       <w:pPr>
         <w:pStyle w:val="Equation"/>
         <w:jc w:val="center"/>
-        <w:rPr/>
+        <w:rPr>
+          <w:sz w:val="22"/>
+          <w:szCs w:val="22"/>
+        </w:rPr>
       </w:pPr>
       <w:r>
         <w:rPr>
           <w:rFonts w:eastAsia="Cambria Math" w:ascii="Cambria Math" w:hAnsi="Cambria Math"/>
           <w:i/>
           <w:color w:val="17365D"/>
-          <w:sz w:val="21"/>
+          <w:sz w:val="22"/>
+          <w:szCs w:val="22"/>
         </w:rPr>
         <w:t>greenhushing gap = max(0, q_truthful - q_chosen).</w:t>
       </w:r>
@@ -2990,23 +3146,33 @@
     <w:p>
       <w:pPr>
         <w:pStyle w:val="Normal"/>
-        <w:rPr/>
-      </w:pPr>
-      <w:r>
-        <w:rPr/>
+        <w:rPr>
+          <w:sz w:val="22"/>
+          <w:szCs w:val="22"/>
+        </w:rPr>
+      </w:pPr>
+      <w:r>
+        <w:rPr>
+          <w:sz w:val="22"/>
+          <w:szCs w:val="22"/>
+        </w:rPr>
         <w:t>GREENHUSHING STYLIZATION: the gap compares the communication that the firm's current environmental score could truthfully support with the voluntary communication it chooses. It captures suppression relative to an internally available truthful benchmark, not an observed legal violation or a claim about managerial intent. Mandatory reporting remains separate. A firm can therefore reduce voluntary truthful communication without violating a reporting obligation; that choice eliminates the relevant voluntary claim, so the model does not invent a sanction for silence, but it reduces visibility and the truthful green premium.</w:t>
       </w:r>
     </w:p>
     <w:p>
       <w:pPr>
         <w:pStyle w:val="Normal"/>
-        <w:rPr/>
+        <w:rPr>
+          <w:sz w:val="22"/>
+          <w:szCs w:val="22"/>
+        </w:rPr>
       </w:pPr>
       <w:r>
         <w:rPr>
           <w:rFonts w:eastAsia="Times New Roman"/>
           <w:color w:val="1D2733"/>
           <w:sz w:val="22"/>
+          <w:szCs w:val="22"/>
         </w:rPr>
         <w:t>The hub can alter this choice by imposing a review delay, producing warnings, encouraging meaningful revision, or prompting withdrawal. The model distinguishes prevention of good-faith errors from withdrawal-induced suppression. It reports intention-to-treat participation and treatment-on-the-treated revision measures, while corporate strategy labels remain research-only.</w:t>
       </w:r>
@@ -3067,14 +3233,18 @@
       <w:pPr>
         <w:pStyle w:val="Equation"/>
         <w:jc w:val="center"/>
-        <w:rPr/>
+        <w:rPr>
+          <w:sz w:val="22"/>
+          <w:szCs w:val="22"/>
+        </w:rPr>
       </w:pPr>
       <w:r>
         <w:rPr>
           <w:rFonts w:eastAsia="Cambria Math" w:ascii="Cambria Math" w:hAnsi="Cambria Math"/>
           <w:i/>
           <w:color w:val="17365D"/>
-          <w:sz w:val="21"/>
+          <w:sz w:val="22"/>
+          <w:szCs w:val="22"/>
         </w:rPr>
         <w:t>calculated sanction = 1.5 x estimated benefit + 0.02 x affected revenue x severity x confidence.</w:t>
       </w:r>
@@ -3148,10 +3318,16 @@
     <w:p>
       <w:pPr>
         <w:pStyle w:val="Normal"/>
-        <w:rPr/>
-      </w:pPr>
-      <w:r>
-        <w:rPr/>
+        <w:rPr>
+          <w:sz w:val="22"/>
+          <w:szCs w:val="22"/>
+        </w:rPr>
+      </w:pPr>
+      <w:r>
+        <w:rPr>
+          <w:sz w:val="22"/>
+          <w:szCs w:val="22"/>
+        </w:rPr>
         <w:t>The connector authorizes each firm-source pair independently. Eight default source types cover Scope 1 and 2, renewable share, water, waste and recycling, pollution, partial Scope 3, and environmental capital expenditure. The model assumes that an underlying source record exists and operates at firm-source level rather than representing every facility, machine, subsidiary, supplier, or service-production boundary. Provenance is hashed over the payload, methodology version, period, uncertainty, completeness, and correction status, and hashes are verified before use. Data can be stale, incomplete, mismatched, unavailable, or wrong; coverage widens effective uncertainty. Reconciliation classifies matched data, rounding noise, methodological difference, incomplete coverage, source conflict, correction required, suspicious override, material overstatement, or repeated manipulation. Reconciliation itself never imposes a sanction.</w:t>
       </w:r>
     </w:p>
@@ -3169,16 +3345,16 @@
       <w:pPr>
         <w:pStyle w:val="Normal"/>
         <w:rPr>
-          <w:sz w:val="21"/>
-          <w:szCs w:val="21"/>
+          <w:sz w:val="22"/>
+          <w:szCs w:val="22"/>
         </w:rPr>
       </w:pPr>
       <w:r>
         <w:rPr>
           <w:rFonts w:eastAsia="Times New Roman"/>
           <w:color w:val="1D2733"/>
-          <w:sz w:val="21"/>
-          <w:szCs w:val="21"/>
+          <w:sz w:val="22"/>
+          <w:szCs w:val="22"/>
         </w:rPr>
         <w:t>Consumers allocate an exogenous EUR 1,000 daily budget across firms through logit utility. Segment-level environmental preferences, attention, sophistication, and memory determine the effect of claims and evidence. Accessible claim-evidence divergence reduces utility. Greenhushing reduces visibility and foregone truthful premium but does not create a controversy signal. The budget is an explicit external injection: daily gross product revenue equals the configured budget, and gross revenue is reconciled with production cost and corporate margin.</w:t>
       </w:r>
@@ -3187,16 +3363,16 @@
       <w:pPr>
         <w:pStyle w:val="Normal"/>
         <w:rPr>
-          <w:sz w:val="21"/>
-          <w:szCs w:val="21"/>
+          <w:sz w:val="22"/>
+          <w:szCs w:val="22"/>
         </w:rPr>
       </w:pPr>
       <w:r>
         <w:rPr>
           <w:rFonts w:eastAsia="Times New Roman"/>
           <w:color w:val="1D2733"/>
-          <w:sz w:val="21"/>
-          <w:szCs w:val="21"/>
+          <w:sz w:val="22"/>
+          <w:szCs w:val="22"/>
         </w:rPr>
         <w:t>Fundamentalist investors receive an environmental context, not truth. Their environmental fair value is:</w:t>
       </w:r>
@@ -3206,8 +3382,8 @@
         <w:pStyle w:val="Equation"/>
         <w:jc w:val="center"/>
         <w:rPr>
-          <w:sz w:val="21"/>
-          <w:szCs w:val="21"/>
+          <w:sz w:val="22"/>
+          <w:szCs w:val="22"/>
         </w:rPr>
       </w:pPr>
       <w:r>
@@ -3215,8 +3391,8 @@
           <w:rFonts w:eastAsia="Cambria Math" w:ascii="Cambria Math" w:hAnsi="Cambria Math"/>
           <w:i/>
           <w:color w:val="17365D"/>
-          <w:sz w:val="21"/>
-          <w:szCs w:val="21"/>
+          <w:sz w:val="22"/>
+          <w:szCs w:val="22"/>
         </w:rPr>
         <w:t>V_fair = V_fundamental x (1 + greenium gamma x posterior score x credibility) x (1 - controversy discount).</w:t>
       </w:r>
@@ -3225,16 +3401,16 @@
       <w:pPr>
         <w:pStyle w:val="Normal"/>
         <w:rPr>
-          <w:sz w:val="21"/>
-          <w:szCs w:val="21"/>
+          <w:sz w:val="22"/>
+          <w:szCs w:val="22"/>
         </w:rPr>
       </w:pPr>
       <w:r>
         <w:rPr>
           <w:rFonts w:eastAsia="Times New Roman"/>
           <w:color w:val="1D2733"/>
-          <w:sz w:val="21"/>
-          <w:szCs w:val="21"/>
+          <w:sz w:val="22"/>
+          <w:szCs w:val="22"/>
         </w:rPr>
         <w:t>Sophisticated investors inspect linked evidence and respond more quickly to controversy; unsophisticated investors update more slowly. Chartists retain an indirect price-only channel. Market makers supply liquidity, other trader types place orders, and the order book determines transaction prices. Credit, collateral, margin calls, liquidation, interest, dividends, and bank exposure propagate environmental communication into financial outcomes without directly inserting the latent environmental vector into trading rules.</w:t>
       </w:r>
@@ -3243,14 +3419,14 @@
       <w:pPr>
         <w:pStyle w:val="Normal"/>
         <w:rPr>
-          <w:sz w:val="21"/>
-          <w:szCs w:val="21"/>
-        </w:rPr>
-      </w:pPr>
-      <w:r>
-        <w:rPr>
-          <w:sz w:val="21"/>
-          <w:szCs w:val="21"/>
+          <w:sz w:val="22"/>
+          <w:szCs w:val="22"/>
+        </w:rPr>
+      </w:pPr>
+      <w:r>
+        <w:rPr>
+          <w:sz w:val="22"/>
+          <w:szCs w:val="22"/>
         </w:rPr>
         <w:t>The direction of this financial layer must be stated precisely, because it bounds what the model can claim. Claims, evidence, and published supervisory outcomes move investor valuation and hence order flow and prices, and market prices affect corporate financing proceeds when the corporate policy sells treasury shares against the order-book midpoint. A static audit of every identified firm decision method (results/audits/) finds no other direct or indirect own-share-price input: greenwashing, disclosure, qualification, and transition-investment rules never read the firm's own price, order book, or market valuation. The equity market is therefore an endogenous market-response and financing context, not a demonstrated price-discipline mechanism, and no result in this paper relies on stock prices disciplining corporate environmental behavior.</w:t>
       </w:r>
@@ -3259,16 +3435,16 @@
       <w:pPr>
         <w:pStyle w:val="Normal"/>
         <w:rPr>
-          <w:sz w:val="21"/>
-          <w:szCs w:val="21"/>
+          <w:sz w:val="22"/>
+          <w:szCs w:val="22"/>
         </w:rPr>
       </w:pPr>
       <w:r>
         <w:rPr>
           <w:rFonts w:eastAsia="Times New Roman"/>
           <w:color w:val="1D2733"/>
-          <w:sz w:val="21"/>
-          <w:szCs w:val="21"/>
+          <w:sz w:val="22"/>
+          <w:szCs w:val="22"/>
         </w:rPr>
         <w:t>Employees update trust from an evidence-accessible internal discrepancy and from published decisions. Quiet truthful periods allow slower recovery. Productivity affects product cost once:</w:t>
       </w:r>
@@ -3278,8 +3454,8 @@
         <w:pStyle w:val="Equation"/>
         <w:jc w:val="center"/>
         <w:rPr>
-          <w:sz w:val="21"/>
-          <w:szCs w:val="21"/>
+          <w:sz w:val="22"/>
+          <w:szCs w:val="22"/>
         </w:rPr>
       </w:pPr>
       <w:r>
@@ -3287,8 +3463,8 @@
           <w:rFonts w:eastAsia="Cambria Math" w:ascii="Cambria Math" w:hAnsi="Cambria Math"/>
           <w:i/>
           <w:color w:val="17365D"/>
-          <w:sz w:val="21"/>
-          <w:szCs w:val="21"/>
+          <w:sz w:val="22"/>
+          <w:szCs w:val="22"/>
         </w:rPr>
         <w:t>productivity multiplier = 1 - 0.03 x (1 - trust).</w:t>
       </w:r>
@@ -3297,16 +3473,16 @@
       <w:pPr>
         <w:pStyle w:val="Normal"/>
         <w:rPr>
-          <w:sz w:val="21"/>
-          <w:szCs w:val="21"/>
+          <w:sz w:val="22"/>
+          <w:szCs w:val="22"/>
         </w:rPr>
       </w:pPr>
       <w:r>
         <w:rPr>
           <w:rFonts w:eastAsia="Times New Roman"/>
           <w:color w:val="1D2733"/>
-          <w:sz w:val="21"/>
-          <w:szCs w:val="21"/>
+          <w:sz w:val="22"/>
+          <w:szCs w:val="22"/>
         </w:rPr>
         <w:t>Annual workforce turnover begins at 10%, is capped at 30%, and is converted to a daily hazard. Departures, vacancies, hiring, 30-day onboarding, and replacement costs feed corporate accounts. The rolling 365-day employee average subsequently enters the reporting-scope test.</w:t>
       </w:r>
@@ -3315,14 +3491,14 @@
       <w:pPr>
         <w:pStyle w:val="Heading2"/>
         <w:rPr>
-          <w:sz w:val="21"/>
-          <w:szCs w:val="21"/>
-        </w:rPr>
-      </w:pPr>
-      <w:r>
-        <w:rPr>
-          <w:sz w:val="21"/>
-          <w:szCs w:val="21"/>
+          <w:sz w:val="25"/>
+          <w:szCs w:val="25"/>
+        </w:rPr>
+      </w:pPr>
+      <w:r>
+        <w:rPr>
+          <w:sz w:val="25"/>
+          <w:szCs w:val="25"/>
         </w:rPr>
         <w:t>3.8 Event order, random streams, and accounting invariants</w:t>
       </w:r>
@@ -3331,16 +3507,16 @@
       <w:pPr>
         <w:pStyle w:val="Normal"/>
         <w:rPr>
-          <w:sz w:val="21"/>
-          <w:szCs w:val="21"/>
+          <w:sz w:val="22"/>
+          <w:szCs w:val="22"/>
         </w:rPr>
       </w:pPr>
       <w:r>
         <w:rPr>
           <w:rFonts w:eastAsia="Times New Roman"/>
           <w:color w:val="1D2733"/>
-          <w:sz w:val="21"/>
-          <w:szCs w:val="21"/>
+          <w:sz w:val="22"/>
+          <w:szCs w:val="22"/>
         </w:rPr>
         <w:t>On each active market day the simulation: maps the legal date; updates fundamentals and environmental transition; processes prior public information through the workforce; runs product demand and books revenue and cost; creates scheduled reports and voluntary claims; performs limited assurance; screens claims and advances cases; forms information-safe investor and banking inputs; runs trading, credit, interest, dividends, and evolutionary review; and logs and validates ledgers.</w:t>
       </w:r>
@@ -3349,16 +3525,16 @@
       <w:pPr>
         <w:pStyle w:val="Normal"/>
         <w:rPr>
-          <w:sz w:val="21"/>
-          <w:szCs w:val="21"/>
+          <w:sz w:val="22"/>
+          <w:szCs w:val="22"/>
         </w:rPr>
       </w:pPr>
       <w:r>
         <w:rPr>
           <w:rFonts w:eastAsia="Times New Roman"/>
           <w:color w:val="1D2733"/>
-          <w:sz w:val="21"/>
-          <w:szCs w:val="21"/>
+          <w:sz w:val="22"/>
+          <w:szCs w:val="22"/>
         </w:rPr>
         <w:t>This schedule prevents a claim created during the current day from affecting that day's earlier consumer demand. Same-day financial trading can respond only after a public supervisory output exists. Communications, assurance, supervision, consumer, and workforce draws use separate pseudo-random streams derived from the supervision seed. Legacy random trajectories remain unchanged when the environmental-claim module is disabled.</w:t>
       </w:r>
@@ -3367,16 +3543,16 @@
       <w:pPr>
         <w:pStyle w:val="Normal"/>
         <w:rPr>
-          <w:sz w:val="21"/>
-          <w:szCs w:val="21"/>
+          <w:sz w:val="22"/>
+          <w:szCs w:val="22"/>
         </w:rPr>
       </w:pPr>
       <w:r>
         <w:rPr>
           <w:rFonts w:eastAsia="Times New Roman"/>
           <w:color w:val="1D2733"/>
-          <w:sz w:val="21"/>
-          <w:szCs w:val="21"/>
+          <w:sz w:val="22"/>
+          <w:szCs w:val="22"/>
         </w:rPr>
         <w:t>Accounting checks enforce single-entry pathways for corporate margin, productivity, sanctions, subsidies, evidence and replacement costs, and green-bond proceeds. A sanction received by the State equals the amount removed from corporate balances. Controversy changes demand or valuation but does not reduce the same fundamental twice.</w:t>
       </w:r>
@@ -3422,10 +3598,10 @@
         <w:tblLook w:val="04a0" w:firstRow="1" w:noVBand="1" w:lastRow="0" w:firstColumn="1" w:lastColumn="0" w:noHBand="0"/>
       </w:tblPr>
       <w:tblGrid>
-        <w:gridCol w:w="619"/>
-        <w:gridCol w:w="2201"/>
-        <w:gridCol w:w="4539"/>
-        <w:gridCol w:w="2001"/>
+        <w:gridCol w:w="615"/>
+        <w:gridCol w:w="2205"/>
+        <w:gridCol w:w="4536"/>
+        <w:gridCol w:w="2004"/>
       </w:tblGrid>
       <w:tr>
         <w:trPr>
@@ -3434,7 +3610,7 @@
         </w:trPr>
         <w:tc>
           <w:tcPr>
-            <w:tcW w:w="619" w:type="dxa"/>
+            <w:tcW w:w="615" w:type="dxa"/>
             <w:tcBorders>
               <w:top w:val="single" w:sz="4" w:space="0" w:color="D4DCE6"/>
               <w:start w:val="single" w:sz="4" w:space="0" w:color="D4DCE6"/>
@@ -3464,7 +3640,7 @@
         </w:tc>
         <w:tc>
           <w:tcPr>
-            <w:tcW w:w="2201" w:type="dxa"/>
+            <w:tcW w:w="2205" w:type="dxa"/>
             <w:tcBorders>
               <w:top w:val="single" w:sz="4" w:space="0" w:color="D4DCE6"/>
               <w:start w:val="single" w:sz="4" w:space="0" w:color="D4DCE6"/>
@@ -3494,7 +3670,7 @@
         </w:tc>
         <w:tc>
           <w:tcPr>
-            <w:tcW w:w="4539" w:type="dxa"/>
+            <w:tcW w:w="4536" w:type="dxa"/>
             <w:tcBorders>
               <w:top w:val="single" w:sz="4" w:space="0" w:color="D4DCE6"/>
               <w:start w:val="single" w:sz="4" w:space="0" w:color="D4DCE6"/>
@@ -3524,7 +3700,7 @@
         </w:tc>
         <w:tc>
           <w:tcPr>
-            <w:tcW w:w="2001" w:type="dxa"/>
+            <w:tcW w:w="2004" w:type="dxa"/>
             <w:tcBorders>
               <w:top w:val="single" w:sz="4" w:space="0" w:color="D4DCE6"/>
               <w:start w:val="single" w:sz="4" w:space="0" w:color="D4DCE6"/>
@@ -3559,7 +3735,7 @@
         </w:trPr>
         <w:tc>
           <w:tcPr>
-            <w:tcW w:w="619" w:type="dxa"/>
+            <w:tcW w:w="615" w:type="dxa"/>
             <w:tcBorders>
               <w:top w:val="single" w:sz="4" w:space="0" w:color="D4DCE6"/>
               <w:start w:val="single" w:sz="4" w:space="0" w:color="D4DCE6"/>
@@ -3588,7 +3764,7 @@
         </w:tc>
         <w:tc>
           <w:tcPr>
-            <w:tcW w:w="2201" w:type="dxa"/>
+            <w:tcW w:w="2205" w:type="dxa"/>
             <w:tcBorders>
               <w:top w:val="single" w:sz="4" w:space="0" w:color="D4DCE6"/>
               <w:start w:val="single" w:sz="4" w:space="0" w:color="D4DCE6"/>
@@ -3617,7 +3793,7 @@
         </w:tc>
         <w:tc>
           <w:tcPr>
-            <w:tcW w:w="4539" w:type="dxa"/>
+            <w:tcW w:w="4536" w:type="dxa"/>
             <w:tcBorders>
               <w:top w:val="single" w:sz="4" w:space="0" w:color="D4DCE6"/>
               <w:start w:val="single" w:sz="4" w:space="0" w:color="D4DCE6"/>
@@ -3646,7 +3822,7 @@
         </w:tc>
         <w:tc>
           <w:tcPr>
-            <w:tcW w:w="2001" w:type="dxa"/>
+            <w:tcW w:w="2004" w:type="dxa"/>
             <w:tcBorders>
               <w:top w:val="single" w:sz="4" w:space="0" w:color="D4DCE6"/>
               <w:start w:val="single" w:sz="4" w:space="0" w:color="D4DCE6"/>
@@ -3680,7 +3856,7 @@
         </w:trPr>
         <w:tc>
           <w:tcPr>
-            <w:tcW w:w="619" w:type="dxa"/>
+            <w:tcW w:w="615" w:type="dxa"/>
             <w:tcBorders>
               <w:top w:val="single" w:sz="4" w:space="0" w:color="D4DCE6"/>
               <w:start w:val="single" w:sz="4" w:space="0" w:color="D4DCE6"/>
@@ -3710,7 +3886,7 @@
         </w:tc>
         <w:tc>
           <w:tcPr>
-            <w:tcW w:w="2201" w:type="dxa"/>
+            <w:tcW w:w="2205" w:type="dxa"/>
             <w:tcBorders>
               <w:top w:val="single" w:sz="4" w:space="0" w:color="D4DCE6"/>
               <w:start w:val="single" w:sz="4" w:space="0" w:color="D4DCE6"/>
@@ -3740,7 +3916,7 @@
         </w:tc>
         <w:tc>
           <w:tcPr>
-            <w:tcW w:w="4539" w:type="dxa"/>
+            <w:tcW w:w="4536" w:type="dxa"/>
             <w:tcBorders>
               <w:top w:val="single" w:sz="4" w:space="0" w:color="D4DCE6"/>
               <w:start w:val="single" w:sz="4" w:space="0" w:color="D4DCE6"/>
@@ -3770,7 +3946,7 @@
         </w:tc>
         <w:tc>
           <w:tcPr>
-            <w:tcW w:w="2001" w:type="dxa"/>
+            <w:tcW w:w="2004" w:type="dxa"/>
             <w:tcBorders>
               <w:top w:val="single" w:sz="4" w:space="0" w:color="D4DCE6"/>
               <w:start w:val="single" w:sz="4" w:space="0" w:color="D4DCE6"/>
@@ -3805,7 +3981,7 @@
         </w:trPr>
         <w:tc>
           <w:tcPr>
-            <w:tcW w:w="619" w:type="dxa"/>
+            <w:tcW w:w="615" w:type="dxa"/>
             <w:tcBorders>
               <w:top w:val="single" w:sz="4" w:space="0" w:color="D4DCE6"/>
               <w:start w:val="single" w:sz="4" w:space="0" w:color="D4DCE6"/>
@@ -3834,7 +4010,7 @@
         </w:tc>
         <w:tc>
           <w:tcPr>
-            <w:tcW w:w="2201" w:type="dxa"/>
+            <w:tcW w:w="2205" w:type="dxa"/>
             <w:tcBorders>
               <w:top w:val="single" w:sz="4" w:space="0" w:color="D4DCE6"/>
               <w:start w:val="single" w:sz="4" w:space="0" w:color="D4DCE6"/>
@@ -3863,7 +4039,7 @@
         </w:tc>
         <w:tc>
           <w:tcPr>
-            <w:tcW w:w="4539" w:type="dxa"/>
+            <w:tcW w:w="4536" w:type="dxa"/>
             <w:tcBorders>
               <w:top w:val="single" w:sz="4" w:space="0" w:color="D4DCE6"/>
               <w:start w:val="single" w:sz="4" w:space="0" w:color="D4DCE6"/>
@@ -3892,7 +4068,7 @@
         </w:tc>
         <w:tc>
           <w:tcPr>
-            <w:tcW w:w="2001" w:type="dxa"/>
+            <w:tcW w:w="2004" w:type="dxa"/>
             <w:tcBorders>
               <w:top w:val="single" w:sz="4" w:space="0" w:color="D4DCE6"/>
               <w:start w:val="single" w:sz="4" w:space="0" w:color="D4DCE6"/>
@@ -3982,13 +4158,17 @@
     <w:p>
       <w:pPr>
         <w:pStyle w:val="Normal"/>
-        <w:rPr/>
+        <w:rPr>
+          <w:sz w:val="22"/>
+          <w:szCs w:val="22"/>
+        </w:rPr>
       </w:pPr>
       <w:r>
         <w:rPr>
           <w:rFonts w:eastAsia="Times New Roman"/>
           <w:color w:val="1D2733"/>
           <w:sz w:val="22"/>
+          <w:szCs w:val="22"/>
         </w:rPr>
         <w:t>For draw j and replication r, the attached campaign uses:</w:t>
       </w:r>
@@ -3997,14 +4177,18 @@
       <w:pPr>
         <w:pStyle w:val="Equation"/>
         <w:jc w:val="center"/>
-        <w:rPr/>
+        <w:rPr>
+          <w:sz w:val="22"/>
+          <w:szCs w:val="22"/>
+        </w:rPr>
       </w:pPr>
       <w:r>
         <w:rPr>
           <w:rFonts w:eastAsia="Cambria Math" w:ascii="Cambria Math" w:hAnsi="Cambria Math"/>
           <w:i/>
           <w:color w:val="17365D"/>
-          <w:sz w:val="21"/>
+          <w:sz w:val="22"/>
+          <w:szCs w:val="22"/>
         </w:rPr>
         <w:t>market seed = 20,260,716 + 1,000,000 x j + 1,000 x r,</w:t>
       </w:r>
@@ -4013,14 +4197,18 @@
       <w:pPr>
         <w:pStyle w:val="Equation"/>
         <w:jc w:val="center"/>
-        <w:rPr/>
+        <w:rPr>
+          <w:sz w:val="22"/>
+          <w:szCs w:val="22"/>
+        </w:rPr>
       </w:pPr>
       <w:r>
         <w:rPr>
           <w:rFonts w:eastAsia="Cambria Math" w:ascii="Cambria Math" w:hAnsi="Cambria Math"/>
           <w:i/>
           <w:color w:val="17365D"/>
-          <w:sz w:val="21"/>
+          <w:sz w:val="22"/>
+          <w:szCs w:val="22"/>
         </w:rPr>
         <w:t>supervision seed = 104,729 + 104,729 x j + 7,919 x r.</w:t>
       </w:r>
@@ -4110,11 +4298,11 @@
         <w:tblLook w:val="04a0" w:firstRow="1" w:noVBand="1" w:lastRow="0" w:firstColumn="1" w:lastColumn="0" w:noHBand="0"/>
       </w:tblPr>
       <w:tblGrid>
-        <w:gridCol w:w="1599"/>
-        <w:gridCol w:w="1501"/>
+        <w:gridCol w:w="1595"/>
+        <w:gridCol w:w="1505"/>
         <w:gridCol w:w="1500"/>
-        <w:gridCol w:w="1299"/>
-        <w:gridCol w:w="1501"/>
+        <w:gridCol w:w="1295"/>
+        <w:gridCol w:w="1505"/>
         <w:gridCol w:w="1960"/>
       </w:tblGrid>
       <w:tr>
@@ -4124,7 +4312,7 @@
         </w:trPr>
         <w:tc>
           <w:tcPr>
-            <w:tcW w:w="1599" w:type="dxa"/>
+            <w:tcW w:w="1595" w:type="dxa"/>
             <w:tcBorders>
               <w:top w:val="single" w:sz="4" w:space="0" w:color="D4DCE6"/>
               <w:start w:val="single" w:sz="4" w:space="0" w:color="D4DCE6"/>
@@ -4154,7 +4342,7 @@
         </w:tc>
         <w:tc>
           <w:tcPr>
-            <w:tcW w:w="1501" w:type="dxa"/>
+            <w:tcW w:w="1505" w:type="dxa"/>
             <w:tcBorders>
               <w:top w:val="single" w:sz="4" w:space="0" w:color="D4DCE6"/>
               <w:start w:val="single" w:sz="4" w:space="0" w:color="D4DCE6"/>
@@ -4214,7 +4402,7 @@
         </w:tc>
         <w:tc>
           <w:tcPr>
-            <w:tcW w:w="1299" w:type="dxa"/>
+            <w:tcW w:w="1295" w:type="dxa"/>
             <w:tcBorders>
               <w:top w:val="single" w:sz="4" w:space="0" w:color="D4DCE6"/>
               <w:start w:val="single" w:sz="4" w:space="0" w:color="D4DCE6"/>
@@ -4244,7 +4432,7 @@
         </w:tc>
         <w:tc>
           <w:tcPr>
-            <w:tcW w:w="1501" w:type="dxa"/>
+            <w:tcW w:w="1505" w:type="dxa"/>
             <w:tcBorders>
               <w:top w:val="single" w:sz="4" w:space="0" w:color="D4DCE6"/>
               <w:start w:val="single" w:sz="4" w:space="0" w:color="D4DCE6"/>
@@ -4309,7 +4497,7 @@
         </w:trPr>
         <w:tc>
           <w:tcPr>
-            <w:tcW w:w="1599" w:type="dxa"/>
+            <w:tcW w:w="1595" w:type="dxa"/>
             <w:tcBorders>
               <w:top w:val="single" w:sz="4" w:space="0" w:color="D4DCE6"/>
               <w:start w:val="single" w:sz="4" w:space="0" w:color="D4DCE6"/>
@@ -4338,7 +4526,7 @@
         </w:tc>
         <w:tc>
           <w:tcPr>
-            <w:tcW w:w="1501" w:type="dxa"/>
+            <w:tcW w:w="1505" w:type="dxa"/>
             <w:tcBorders>
               <w:top w:val="single" w:sz="4" w:space="0" w:color="D4DCE6"/>
               <w:start w:val="single" w:sz="4" w:space="0" w:color="D4DCE6"/>
@@ -4396,7 +4584,7 @@
         </w:tc>
         <w:tc>
           <w:tcPr>
-            <w:tcW w:w="1299" w:type="dxa"/>
+            <w:tcW w:w="1295" w:type="dxa"/>
             <w:tcBorders>
               <w:top w:val="single" w:sz="4" w:space="0" w:color="D4DCE6"/>
               <w:start w:val="single" w:sz="4" w:space="0" w:color="D4DCE6"/>
@@ -4425,7 +4613,7 @@
         </w:tc>
         <w:tc>
           <w:tcPr>
-            <w:tcW w:w="1501" w:type="dxa"/>
+            <w:tcW w:w="1505" w:type="dxa"/>
             <w:tcBorders>
               <w:top w:val="single" w:sz="4" w:space="0" w:color="D4DCE6"/>
               <w:start w:val="single" w:sz="4" w:space="0" w:color="D4DCE6"/>
@@ -4488,7 +4676,7 @@
         </w:trPr>
         <w:tc>
           <w:tcPr>
-            <w:tcW w:w="1599" w:type="dxa"/>
+            <w:tcW w:w="1595" w:type="dxa"/>
             <w:tcBorders>
               <w:top w:val="single" w:sz="4" w:space="0" w:color="D4DCE6"/>
               <w:start w:val="single" w:sz="4" w:space="0" w:color="D4DCE6"/>
@@ -4518,7 +4706,7 @@
         </w:tc>
         <w:tc>
           <w:tcPr>
-            <w:tcW w:w="1501" w:type="dxa"/>
+            <w:tcW w:w="1505" w:type="dxa"/>
             <w:tcBorders>
               <w:top w:val="single" w:sz="4" w:space="0" w:color="D4DCE6"/>
               <w:start w:val="single" w:sz="4" w:space="0" w:color="D4DCE6"/>
@@ -4578,7 +4766,7 @@
         </w:tc>
         <w:tc>
           <w:tcPr>
-            <w:tcW w:w="1299" w:type="dxa"/>
+            <w:tcW w:w="1295" w:type="dxa"/>
             <w:tcBorders>
               <w:top w:val="single" w:sz="4" w:space="0" w:color="D4DCE6"/>
               <w:start w:val="single" w:sz="4" w:space="0" w:color="D4DCE6"/>
@@ -4608,7 +4796,7 @@
         </w:tc>
         <w:tc>
           <w:tcPr>
-            <w:tcW w:w="1501" w:type="dxa"/>
+            <w:tcW w:w="1505" w:type="dxa"/>
             <w:tcBorders>
               <w:top w:val="single" w:sz="4" w:space="0" w:color="D4DCE6"/>
               <w:start w:val="single" w:sz="4" w:space="0" w:color="D4DCE6"/>
@@ -4673,7 +4861,7 @@
         </w:trPr>
         <w:tc>
           <w:tcPr>
-            <w:tcW w:w="1599" w:type="dxa"/>
+            <w:tcW w:w="1595" w:type="dxa"/>
             <w:tcBorders>
               <w:top w:val="single" w:sz="4" w:space="0" w:color="D4DCE6"/>
               <w:start w:val="single" w:sz="4" w:space="0" w:color="D4DCE6"/>
@@ -4702,7 +4890,7 @@
         </w:tc>
         <w:tc>
           <w:tcPr>
-            <w:tcW w:w="1501" w:type="dxa"/>
+            <w:tcW w:w="1505" w:type="dxa"/>
             <w:tcBorders>
               <w:top w:val="single" w:sz="4" w:space="0" w:color="D4DCE6"/>
               <w:start w:val="single" w:sz="4" w:space="0" w:color="D4DCE6"/>
@@ -4760,7 +4948,7 @@
         </w:tc>
         <w:tc>
           <w:tcPr>
-            <w:tcW w:w="1299" w:type="dxa"/>
+            <w:tcW w:w="1295" w:type="dxa"/>
             <w:tcBorders>
               <w:top w:val="single" w:sz="4" w:space="0" w:color="D4DCE6"/>
               <w:start w:val="single" w:sz="4" w:space="0" w:color="D4DCE6"/>
@@ -4789,7 +4977,7 @@
         </w:tc>
         <w:tc>
           <w:tcPr>
-            <w:tcW w:w="1501" w:type="dxa"/>
+            <w:tcW w:w="1505" w:type="dxa"/>
             <w:tcBorders>
               <w:top w:val="single" w:sz="4" w:space="0" w:color="D4DCE6"/>
               <w:start w:val="single" w:sz="4" w:space="0" w:color="D4DCE6"/>
@@ -4852,7 +5040,7 @@
         </w:trPr>
         <w:tc>
           <w:tcPr>
-            <w:tcW w:w="1599" w:type="dxa"/>
+            <w:tcW w:w="1595" w:type="dxa"/>
             <w:tcBorders>
               <w:top w:val="single" w:sz="4" w:space="0" w:color="D4DCE6"/>
               <w:start w:val="single" w:sz="4" w:space="0" w:color="D4DCE6"/>
@@ -4882,7 +5070,7 @@
         </w:tc>
         <w:tc>
           <w:tcPr>
-            <w:tcW w:w="1501" w:type="dxa"/>
+            <w:tcW w:w="1505" w:type="dxa"/>
             <w:tcBorders>
               <w:top w:val="single" w:sz="4" w:space="0" w:color="D4DCE6"/>
               <w:start w:val="single" w:sz="4" w:space="0" w:color="D4DCE6"/>
@@ -4942,7 +5130,7 @@
         </w:tc>
         <w:tc>
           <w:tcPr>
-            <w:tcW w:w="1299" w:type="dxa"/>
+            <w:tcW w:w="1295" w:type="dxa"/>
             <w:tcBorders>
               <w:top w:val="single" w:sz="4" w:space="0" w:color="D4DCE6"/>
               <w:start w:val="single" w:sz="4" w:space="0" w:color="D4DCE6"/>
@@ -4972,7 +5160,7 @@
         </w:tc>
         <w:tc>
           <w:tcPr>
-            <w:tcW w:w="1501" w:type="dxa"/>
+            <w:tcW w:w="1505" w:type="dxa"/>
             <w:tcBorders>
               <w:top w:val="single" w:sz="4" w:space="0" w:color="D4DCE6"/>
               <w:start w:val="single" w:sz="4" w:space="0" w:color="D4DCE6"/>
@@ -5037,7 +5225,7 @@
         </w:trPr>
         <w:tc>
           <w:tcPr>
-            <w:tcW w:w="1599" w:type="dxa"/>
+            <w:tcW w:w="1595" w:type="dxa"/>
             <w:tcBorders>
               <w:top w:val="single" w:sz="4" w:space="0" w:color="D4DCE6"/>
               <w:start w:val="single" w:sz="4" w:space="0" w:color="D4DCE6"/>
@@ -5066,7 +5254,7 @@
         </w:tc>
         <w:tc>
           <w:tcPr>
-            <w:tcW w:w="1501" w:type="dxa"/>
+            <w:tcW w:w="1505" w:type="dxa"/>
             <w:tcBorders>
               <w:top w:val="single" w:sz="4" w:space="0" w:color="D4DCE6"/>
               <w:start w:val="single" w:sz="4" w:space="0" w:color="D4DCE6"/>
@@ -5124,7 +5312,7 @@
         </w:tc>
         <w:tc>
           <w:tcPr>
-            <w:tcW w:w="1299" w:type="dxa"/>
+            <w:tcW w:w="1295" w:type="dxa"/>
             <w:tcBorders>
               <w:top w:val="single" w:sz="4" w:space="0" w:color="D4DCE6"/>
               <w:start w:val="single" w:sz="4" w:space="0" w:color="D4DCE6"/>
@@ -5153,7 +5341,7 @@
         </w:tc>
         <w:tc>
           <w:tcPr>
-            <w:tcW w:w="1501" w:type="dxa"/>
+            <w:tcW w:w="1505" w:type="dxa"/>
             <w:tcBorders>
               <w:top w:val="single" w:sz="4" w:space="0" w:color="D4DCE6"/>
               <w:start w:val="single" w:sz="4" w:space="0" w:color="D4DCE6"/>
@@ -5238,10 +5426,16 @@
     <w:p>
       <w:pPr>
         <w:pStyle w:val="Normal"/>
-        <w:rPr/>
-      </w:pPr>
-      <w:r>
-        <w:rPr/>
+        <w:rPr>
+          <w:sz w:val="22"/>
+          <w:szCs w:val="22"/>
+        </w:rPr>
+      </w:pPr>
+      <w:r>
+        <w:rPr>
+          <w:sz w:val="22"/>
+          <w:szCs w:val="22"/>
+        </w:rPr>
         <w:t>The authoritative design is the machine-readable configuration in results/configuration.json: all four horizons have subset: null and all four summaries contain 200 draws. The current reproducibility guide and data dictionary have been synchronized to this layout. Historical selective-confirmation commands are not part of the reported design.</w:t>
       </w:r>
     </w:p>
@@ -5300,10 +5494,16 @@
     <w:p>
       <w:pPr>
         <w:pStyle w:val="Normal"/>
-        <w:rPr/>
-      </w:pPr>
-      <w:r>
-        <w:rPr/>
+        <w:rPr>
+          <w:sz w:val="22"/>
+          <w:szCs w:val="22"/>
+        </w:rPr>
+      </w:pPr>
+      <w:r>
+        <w:rPr>
+          <w:sz w:val="22"/>
+          <w:szCs w:val="22"/>
+        </w:rPr>
         <w:t>Composite rankings use five discrete experimental weight scenarios: default, accuracy-focused, anti-greenhushing, cost-focused, and SME-protective. Within each draw, each criterion is min-max normalized across the three regimes before the weighted values are summed. The resulting score is therefore a relative ranking device, not an absolute welfare function; its construction and weights are normative EXPERIMENT choices (OECD and European Commission, Joint Research Centre, 2008). Raw metrics, four-axis Pareto membership, and rank frequency are reported alongside it. Standardized regression coefficients and partial rank correlation coefficients summarize parameter dependence, but these associational diagnostics can miss interactions and nonlinearity (Marino et al., 2008; Pianosi et al., 2016).</w:t>
       </w:r>
     </w:p>
@@ -5320,20 +5520,32 @@
     <w:p>
       <w:pPr>
         <w:pStyle w:val="Normal"/>
-        <w:rPr/>
-      </w:pPr>
-      <w:r>
-        <w:rPr/>
+        <w:rPr>
+          <w:sz w:val="22"/>
+          <w:szCs w:val="22"/>
+        </w:rPr>
+      </w:pPr>
+      <w:r>
+        <w:rPr>
+          <w:sz w:val="22"/>
+          <w:szCs w:val="22"/>
+        </w:rPr>
         <w:t>Three paired replications per LHS draw are appropriate for broad global screening but can under-sample rare escalation, institutional failure, and tail outcomes. A separate dry-run-first workflow deterministically selects 12 configurations by maximin coverage of standardized cross-horizon outcomes and targets 15 paired replications by default (configurable from 10 to 20). It preserves the authoritative first three replications and adds only replications 4-15 under the same paired seed schedule.</w:t>
       </w:r>
     </w:p>
     <w:p>
       <w:pPr>
         <w:pStyle w:val="Normal"/>
-        <w:rPr/>
-      </w:pPr>
-      <w:r>
-        <w:rPr/>
+        <w:rPr>
+          <w:sz w:val="22"/>
+          <w:szCs w:val="22"/>
+        </w:rPr>
+      </w:pPr>
+      <w:r>
+        <w:rPr>
+          <w:sz w:val="22"/>
+          <w:szCs w:val="22"/>
+        </w:rPr>
         <w:t>The extension has been executed. Draws 41, 42, 69, 71, 75, 104, 109, 136, 144, 147, 180, and 187 were extended to 15 paired replications at each horizon, and all 48 draw-horizon extension files pass validation. Moving from three to 15 replications narrows the paired 95% interval in 92.3% of the 1,743 draw-metric-policy cells with a finite comparison, with a median half-width ratio of 0.26. The default-weight winner computed at three replications is confirmed at 15 replications in 32 of 48 draw-horizon cells (9, 9, 8, and 6 of 12 at 120, 365, 1,000, and 2,000 days), and the complete three-regime ranking is confirmed in 60.4% of cells. Draw-level winner labels under three replications are therefore noisy, especially at long horizons; the paper accordingly emphasizes distributional effects, improvement fractions, and Pareto membership across the 200 draws rather than draw-level league tables. The first three replications remain the authoritative campaign, and extension outputs are stored separately in results/replication_robustness/.</w:t>
       </w:r>
     </w:p>
@@ -5360,10 +5572,16 @@
     <w:p>
       <w:pPr>
         <w:pStyle w:val="Normal"/>
-        <w:rPr/>
-      </w:pPr>
-      <w:r>
-        <w:rPr/>
+        <w:rPr>
+          <w:sz w:val="22"/>
+          <w:szCs w:val="22"/>
+        </w:rPr>
+      </w:pPr>
+      <w:r>
+        <w:rPr>
+          <w:sz w:val="22"/>
+          <w:szCs w:val="22"/>
+        </w:rPr>
         <w:t>Ranking instability explains why the two policy mechanisms must be reported conditionally rather than collapsed into a universal league table. The default-weight winner changes across horizons for 161 of 200 matched parameter draws (80.5%). Within a horizon, changing normative weights changes the winner in 70.0% of 120-day draws, 63.0% of 365-day draws, 58.0% of 1,000-day draws, and 45.5% of 2,000-day draws. These reversals are consequences of distinct accuracy, greenhushing, cost, and timing trade-offs, not evidence that comparison is impossible.</w:t>
       </w:r>
     </w:p>
@@ -5414,11 +5632,11 @@
         <w:tblLook w:val="04a0" w:firstRow="1" w:noVBand="1" w:lastRow="0" w:firstColumn="1" w:lastColumn="0" w:noHBand="0"/>
       </w:tblPr>
       <w:tblGrid>
-        <w:gridCol w:w="1259"/>
-        <w:gridCol w:w="2120"/>
-        <w:gridCol w:w="1980"/>
+        <w:gridCol w:w="1257"/>
+        <w:gridCol w:w="2121"/>
+        <w:gridCol w:w="1977"/>
         <w:gridCol w:w="1900"/>
-        <w:gridCol w:w="2101"/>
+        <w:gridCol w:w="2105"/>
       </w:tblGrid>
       <w:tr>
         <w:trPr>
@@ -5427,7 +5645,7 @@
         </w:trPr>
         <w:tc>
           <w:tcPr>
-            <w:tcW w:w="1259" w:type="dxa"/>
+            <w:tcW w:w="1257" w:type="dxa"/>
             <w:tcBorders>
               <w:top w:val="single" w:sz="4" w:space="0" w:color="D4DCE6"/>
               <w:start w:val="single" w:sz="4" w:space="0" w:color="D4DCE6"/>
@@ -5457,7 +5675,7 @@
         </w:tc>
         <w:tc>
           <w:tcPr>
-            <w:tcW w:w="2120" w:type="dxa"/>
+            <w:tcW w:w="2121" w:type="dxa"/>
             <w:tcBorders>
               <w:top w:val="single" w:sz="4" w:space="0" w:color="D4DCE6"/>
               <w:start w:val="single" w:sz="4" w:space="0" w:color="D4DCE6"/>
@@ -5487,7 +5705,7 @@
         </w:tc>
         <w:tc>
           <w:tcPr>
-            <w:tcW w:w="1980" w:type="dxa"/>
+            <w:tcW w:w="1977" w:type="dxa"/>
             <w:tcBorders>
               <w:top w:val="single" w:sz="4" w:space="0" w:color="D4DCE6"/>
               <w:start w:val="single" w:sz="4" w:space="0" w:color="D4DCE6"/>
@@ -5547,7 +5765,7 @@
         </w:tc>
         <w:tc>
           <w:tcPr>
-            <w:tcW w:w="2101" w:type="dxa"/>
+            <w:tcW w:w="2105" w:type="dxa"/>
             <w:tcBorders>
               <w:top w:val="single" w:sz="4" w:space="0" w:color="D4DCE6"/>
               <w:start w:val="single" w:sz="4" w:space="0" w:color="D4DCE6"/>
@@ -5582,7 +5800,7 @@
         </w:trPr>
         <w:tc>
           <w:tcPr>
-            <w:tcW w:w="1259" w:type="dxa"/>
+            <w:tcW w:w="1257" w:type="dxa"/>
             <w:tcBorders>
               <w:top w:val="single" w:sz="4" w:space="0" w:color="D4DCE6"/>
               <w:start w:val="single" w:sz="4" w:space="0" w:color="D4DCE6"/>
@@ -5611,7 +5829,7 @@
         </w:tc>
         <w:tc>
           <w:tcPr>
-            <w:tcW w:w="2120" w:type="dxa"/>
+            <w:tcW w:w="2121" w:type="dxa"/>
             <w:tcBorders>
               <w:top w:val="single" w:sz="4" w:space="0" w:color="D4DCE6"/>
               <w:start w:val="single" w:sz="4" w:space="0" w:color="D4DCE6"/>
@@ -5640,7 +5858,7 @@
         </w:tc>
         <w:tc>
           <w:tcPr>
-            <w:tcW w:w="1980" w:type="dxa"/>
+            <w:tcW w:w="1977" w:type="dxa"/>
             <w:tcBorders>
               <w:top w:val="single" w:sz="4" w:space="0" w:color="D4DCE6"/>
               <w:start w:val="single" w:sz="4" w:space="0" w:color="D4DCE6"/>
@@ -5698,7 +5916,7 @@
         </w:tc>
         <w:tc>
           <w:tcPr>
-            <w:tcW w:w="2101" w:type="dxa"/>
+            <w:tcW w:w="2105" w:type="dxa"/>
             <w:tcBorders>
               <w:top w:val="single" w:sz="4" w:space="0" w:color="D4DCE6"/>
               <w:start w:val="single" w:sz="4" w:space="0" w:color="D4DCE6"/>
@@ -5732,7 +5950,7 @@
         </w:trPr>
         <w:tc>
           <w:tcPr>
-            <w:tcW w:w="1259" w:type="dxa"/>
+            <w:tcW w:w="1257" w:type="dxa"/>
             <w:tcBorders>
               <w:top w:val="single" w:sz="4" w:space="0" w:color="D4DCE6"/>
               <w:start w:val="single" w:sz="4" w:space="0" w:color="D4DCE6"/>
@@ -5762,7 +5980,7 @@
         </w:tc>
         <w:tc>
           <w:tcPr>
-            <w:tcW w:w="2120" w:type="dxa"/>
+            <w:tcW w:w="2121" w:type="dxa"/>
             <w:tcBorders>
               <w:top w:val="single" w:sz="4" w:space="0" w:color="D4DCE6"/>
               <w:start w:val="single" w:sz="4" w:space="0" w:color="D4DCE6"/>
@@ -5792,7 +6010,7 @@
         </w:tc>
         <w:tc>
           <w:tcPr>
-            <w:tcW w:w="1980" w:type="dxa"/>
+            <w:tcW w:w="1977" w:type="dxa"/>
             <w:tcBorders>
               <w:top w:val="single" w:sz="4" w:space="0" w:color="D4DCE6"/>
               <w:start w:val="single" w:sz="4" w:space="0" w:color="D4DCE6"/>
@@ -5852,7 +6070,7 @@
         </w:tc>
         <w:tc>
           <w:tcPr>
-            <w:tcW w:w="2101" w:type="dxa"/>
+            <w:tcW w:w="2105" w:type="dxa"/>
             <w:tcBorders>
               <w:top w:val="single" w:sz="4" w:space="0" w:color="D4DCE6"/>
               <w:start w:val="single" w:sz="4" w:space="0" w:color="D4DCE6"/>
@@ -5887,7 +6105,7 @@
         </w:trPr>
         <w:tc>
           <w:tcPr>
-            <w:tcW w:w="1259" w:type="dxa"/>
+            <w:tcW w:w="1257" w:type="dxa"/>
             <w:tcBorders>
               <w:top w:val="single" w:sz="4" w:space="0" w:color="D4DCE6"/>
               <w:start w:val="single" w:sz="4" w:space="0" w:color="D4DCE6"/>
@@ -5916,7 +6134,7 @@
         </w:tc>
         <w:tc>
           <w:tcPr>
-            <w:tcW w:w="2120" w:type="dxa"/>
+            <w:tcW w:w="2121" w:type="dxa"/>
             <w:tcBorders>
               <w:top w:val="single" w:sz="4" w:space="0" w:color="D4DCE6"/>
               <w:start w:val="single" w:sz="4" w:space="0" w:color="D4DCE6"/>
@@ -5945,7 +6163,7 @@
         </w:tc>
         <w:tc>
           <w:tcPr>
-            <w:tcW w:w="1980" w:type="dxa"/>
+            <w:tcW w:w="1977" w:type="dxa"/>
             <w:tcBorders>
               <w:top w:val="single" w:sz="4" w:space="0" w:color="D4DCE6"/>
               <w:start w:val="single" w:sz="4" w:space="0" w:color="D4DCE6"/>
@@ -6003,7 +6221,7 @@
         </w:tc>
         <w:tc>
           <w:tcPr>
-            <w:tcW w:w="2101" w:type="dxa"/>
+            <w:tcW w:w="2105" w:type="dxa"/>
             <w:tcBorders>
               <w:top w:val="single" w:sz="4" w:space="0" w:color="D4DCE6"/>
               <w:start w:val="single" w:sz="4" w:space="0" w:color="D4DCE6"/>
@@ -6037,7 +6255,7 @@
         </w:trPr>
         <w:tc>
           <w:tcPr>
-            <w:tcW w:w="1259" w:type="dxa"/>
+            <w:tcW w:w="1257" w:type="dxa"/>
             <w:tcBorders>
               <w:top w:val="single" w:sz="4" w:space="0" w:color="D4DCE6"/>
               <w:start w:val="single" w:sz="4" w:space="0" w:color="D4DCE6"/>
@@ -6067,7 +6285,7 @@
         </w:tc>
         <w:tc>
           <w:tcPr>
-            <w:tcW w:w="2120" w:type="dxa"/>
+            <w:tcW w:w="2121" w:type="dxa"/>
             <w:tcBorders>
               <w:top w:val="single" w:sz="4" w:space="0" w:color="D4DCE6"/>
               <w:start w:val="single" w:sz="4" w:space="0" w:color="D4DCE6"/>
@@ -6097,7 +6315,7 @@
         </w:tc>
         <w:tc>
           <w:tcPr>
-            <w:tcW w:w="1980" w:type="dxa"/>
+            <w:tcW w:w="1977" w:type="dxa"/>
             <w:tcBorders>
               <w:top w:val="single" w:sz="4" w:space="0" w:color="D4DCE6"/>
               <w:start w:val="single" w:sz="4" w:space="0" w:color="D4DCE6"/>
@@ -6157,7 +6375,7 @@
         </w:tc>
         <w:tc>
           <w:tcPr>
-            <w:tcW w:w="2101" w:type="dxa"/>
+            <w:tcW w:w="2105" w:type="dxa"/>
             <w:tcBorders>
               <w:top w:val="single" w:sz="4" w:space="0" w:color="D4DCE6"/>
               <w:start w:val="single" w:sz="4" w:space="0" w:color="D4DCE6"/>
@@ -6200,10 +6418,16 @@
     <w:p>
       <w:pPr>
         <w:pStyle w:val="Normal"/>
-        <w:rPr/>
-      </w:pPr>
-      <w:r>
-        <w:rPr/>
+        <w:rPr>
+          <w:sz w:val="22"/>
+          <w:szCs w:val="22"/>
+        </w:rPr>
+      </w:pPr>
+      <w:r>
+        <w:rPr>
+          <w:sz w:val="22"/>
+          <w:szCs w:val="22"/>
+        </w:rPr>
         <w:t>At 120 days, current supervision and the hub are nearly tied under default weights, winning 47.5% and 48.0% of draws; the connector wins 4.5%. At 365 days, current supervision leads at 53.0%, followed by the hub at 38.0% and the connector at 9.0%. The ordering changes at long horizons: the connector wins 51.0% at 1,000 days and 59.5% at 2,000 days, while the hub falls to 13.5% and 7.0%. The hub does not cease to improve claim-quality metrics; it loses default-weight competitiveness because review and revision costs recur, participation is selective, and greenhushing is penalized, while connector evidence accumulates. Current supervision remains competitive because cost and greenhushing enter the composite. These frequencies are not probabilities that a policy will succeed in the European economy. They are shares of the model's 200 stratified parameter configurations.</w:t>
       </w:r>
     </w:p>
@@ -6288,10 +6512,16 @@
     <w:p>
       <w:pPr>
         <w:pStyle w:val="Normal"/>
-        <w:rPr/>
-      </w:pPr>
-      <w:r>
-        <w:rPr/>
+        <w:rPr>
+          <w:sz w:val="22"/>
+          <w:szCs w:val="22"/>
+        </w:rPr>
+      </w:pPr>
+      <w:r>
+        <w:rPr>
+          <w:sz w:val="22"/>
+          <w:szCs w:val="22"/>
+        </w:rPr>
         <w:t>The five weight scenarios explain why no regime dominates. At 120 days, the accuracy-focused scenario selects the hub in 119 of 200 draws, while the cost-focused and anti-greenhushing scenarios select current supervision in 168 and 179 draws. Under the SME-protective weights, current supervision wins 198 draws because the experimental hub adds burden and the connector adds cost. In this model, a regime lies on the four-axis Pareto frontier when no alternative is at least as good on exposure severity, public cost, greenhushing, and accuracy and strictly better on at least one of those criteria. Current supervision is on that frontier in all 200 draws at every horizon; the hub appears in 183, 180, 180, and 184 draws; and the connector appears in 164, 174, 200, and 200 draws at 120, 365, 1,000, and 2,000 days. A high Pareto frequency means that a regime is not strictly dominated on the selected criteria, not that it is preferred under all values or that it dominates the other regimes.</w:t>
       </w:r>
     </w:p>
@@ -6366,8 +6596,8 @@
         <w:tblLook w:val="04a0" w:firstRow="1" w:noVBand="1" w:lastRow="0" w:firstColumn="1" w:lastColumn="0" w:noHBand="0"/>
       </w:tblPr>
       <w:tblGrid>
-        <w:gridCol w:w="649"/>
-        <w:gridCol w:w="1281"/>
+        <w:gridCol w:w="645"/>
+        <w:gridCol w:w="1285"/>
         <w:gridCol w:w="1560"/>
         <w:gridCol w:w="1570"/>
         <w:gridCol w:w="1900"/>
@@ -6380,7 +6610,7 @@
         </w:trPr>
         <w:tc>
           <w:tcPr>
-            <w:tcW w:w="649" w:type="dxa"/>
+            <w:tcW w:w="645" w:type="dxa"/>
             <w:tcBorders>
               <w:top w:val="single" w:sz="4" w:space="0" w:color="D4DCE6"/>
               <w:start w:val="single" w:sz="4" w:space="0" w:color="D4DCE6"/>
@@ -6410,7 +6640,7 @@
         </w:tc>
         <w:tc>
           <w:tcPr>
-            <w:tcW w:w="1281" w:type="dxa"/>
+            <w:tcW w:w="1285" w:type="dxa"/>
             <w:tcBorders>
               <w:top w:val="single" w:sz="4" w:space="0" w:color="D4DCE6"/>
               <w:start w:val="single" w:sz="4" w:space="0" w:color="D4DCE6"/>
@@ -6565,7 +6795,7 @@
         </w:trPr>
         <w:tc>
           <w:tcPr>
-            <w:tcW w:w="649" w:type="dxa"/>
+            <w:tcW w:w="645" w:type="dxa"/>
             <w:tcBorders>
               <w:top w:val="single" w:sz="4" w:space="0" w:color="D4DCE6"/>
               <w:start w:val="single" w:sz="4" w:space="0" w:color="D4DCE6"/>
@@ -6594,7 +6824,7 @@
         </w:tc>
         <w:tc>
           <w:tcPr>
-            <w:tcW w:w="1281" w:type="dxa"/>
+            <w:tcW w:w="1285" w:type="dxa"/>
             <w:tcBorders>
               <w:top w:val="single" w:sz="4" w:space="0" w:color="D4DCE6"/>
               <w:start w:val="single" w:sz="4" w:space="0" w:color="D4DCE6"/>
@@ -6744,7 +6974,7 @@
         </w:trPr>
         <w:tc>
           <w:tcPr>
-            <w:tcW w:w="649" w:type="dxa"/>
+            <w:tcW w:w="645" w:type="dxa"/>
             <w:tcBorders>
               <w:top w:val="single" w:sz="4" w:space="0" w:color="D4DCE6"/>
               <w:start w:val="single" w:sz="4" w:space="0" w:color="D4DCE6"/>
@@ -6774,7 +7004,7 @@
         </w:tc>
         <w:tc>
           <w:tcPr>
-            <w:tcW w:w="1281" w:type="dxa"/>
+            <w:tcW w:w="1285" w:type="dxa"/>
             <w:tcBorders>
               <w:top w:val="single" w:sz="4" w:space="0" w:color="D4DCE6"/>
               <w:start w:val="single" w:sz="4" w:space="0" w:color="D4DCE6"/>
@@ -6929,7 +7159,7 @@
         </w:trPr>
         <w:tc>
           <w:tcPr>
-            <w:tcW w:w="649" w:type="dxa"/>
+            <w:tcW w:w="645" w:type="dxa"/>
             <w:tcBorders>
               <w:top w:val="single" w:sz="4" w:space="0" w:color="D4DCE6"/>
               <w:start w:val="single" w:sz="4" w:space="0" w:color="D4DCE6"/>
@@ -6958,7 +7188,7 @@
         </w:tc>
         <w:tc>
           <w:tcPr>
-            <w:tcW w:w="1281" w:type="dxa"/>
+            <w:tcW w:w="1285" w:type="dxa"/>
             <w:tcBorders>
               <w:top w:val="single" w:sz="4" w:space="0" w:color="D4DCE6"/>
               <w:start w:val="single" w:sz="4" w:space="0" w:color="D4DCE6"/>
@@ -7108,7 +7338,7 @@
         </w:trPr>
         <w:tc>
           <w:tcPr>
-            <w:tcW w:w="649" w:type="dxa"/>
+            <w:tcW w:w="645" w:type="dxa"/>
             <w:tcBorders>
               <w:top w:val="single" w:sz="4" w:space="0" w:color="D4DCE6"/>
               <w:start w:val="single" w:sz="4" w:space="0" w:color="D4DCE6"/>
@@ -7138,7 +7368,7 @@
         </w:tc>
         <w:tc>
           <w:tcPr>
-            <w:tcW w:w="1281" w:type="dxa"/>
+            <w:tcW w:w="1285" w:type="dxa"/>
             <w:tcBorders>
               <w:top w:val="single" w:sz="4" w:space="0" w:color="D4DCE6"/>
               <w:start w:val="single" w:sz="4" w:space="0" w:color="D4DCE6"/>
@@ -7293,7 +7523,7 @@
         </w:trPr>
         <w:tc>
           <w:tcPr>
-            <w:tcW w:w="649" w:type="dxa"/>
+            <w:tcW w:w="645" w:type="dxa"/>
             <w:tcBorders>
               <w:top w:val="single" w:sz="4" w:space="0" w:color="D4DCE6"/>
               <w:start w:val="single" w:sz="4" w:space="0" w:color="D4DCE6"/>
@@ -7322,7 +7552,7 @@
         </w:tc>
         <w:tc>
           <w:tcPr>
-            <w:tcW w:w="1281" w:type="dxa"/>
+            <w:tcW w:w="1285" w:type="dxa"/>
             <w:tcBorders>
               <w:top w:val="single" w:sz="4" w:space="0" w:color="D4DCE6"/>
               <w:start w:val="single" w:sz="4" w:space="0" w:color="D4DCE6"/>
@@ -7472,7 +7702,7 @@
         </w:trPr>
         <w:tc>
           <w:tcPr>
-            <w:tcW w:w="649" w:type="dxa"/>
+            <w:tcW w:w="645" w:type="dxa"/>
             <w:tcBorders>
               <w:top w:val="single" w:sz="4" w:space="0" w:color="D4DCE6"/>
               <w:start w:val="single" w:sz="4" w:space="0" w:color="D4DCE6"/>
@@ -7502,7 +7732,7 @@
         </w:tc>
         <w:tc>
           <w:tcPr>
-            <w:tcW w:w="1281" w:type="dxa"/>
+            <w:tcW w:w="1285" w:type="dxa"/>
             <w:tcBorders>
               <w:top w:val="single" w:sz="4" w:space="0" w:color="D4DCE6"/>
               <w:start w:val="single" w:sz="4" w:space="0" w:color="D4DCE6"/>
@@ -7657,7 +7887,7 @@
         </w:trPr>
         <w:tc>
           <w:tcPr>
-            <w:tcW w:w="649" w:type="dxa"/>
+            <w:tcW w:w="645" w:type="dxa"/>
             <w:tcBorders>
               <w:top w:val="single" w:sz="4" w:space="0" w:color="D4DCE6"/>
               <w:start w:val="single" w:sz="4" w:space="0" w:color="D4DCE6"/>
@@ -7686,7 +7916,7 @@
         </w:tc>
         <w:tc>
           <w:tcPr>
-            <w:tcW w:w="1281" w:type="dxa"/>
+            <w:tcW w:w="1285" w:type="dxa"/>
             <w:tcBorders>
               <w:top w:val="single" w:sz="4" w:space="0" w:color="D4DCE6"/>
               <w:start w:val="single" w:sz="4" w:space="0" w:color="D4DCE6"/>
@@ -7836,7 +8066,7 @@
         </w:trPr>
         <w:tc>
           <w:tcPr>
-            <w:tcW w:w="649" w:type="dxa"/>
+            <w:tcW w:w="645" w:type="dxa"/>
             <w:tcBorders>
               <w:top w:val="single" w:sz="4" w:space="0" w:color="D4DCE6"/>
               <w:start w:val="single" w:sz="4" w:space="0" w:color="D4DCE6"/>
@@ -7866,7 +8096,7 @@
         </w:tc>
         <w:tc>
           <w:tcPr>
-            <w:tcW w:w="1281" w:type="dxa"/>
+            <w:tcW w:w="1285" w:type="dxa"/>
             <w:tcBorders>
               <w:top w:val="single" w:sz="4" w:space="0" w:color="D4DCE6"/>
               <w:start w:val="single" w:sz="4" w:space="0" w:color="D4DCE6"/>
@@ -8095,10 +8325,16 @@
     <w:p>
       <w:pPr>
         <w:pStyle w:val="Normal"/>
-        <w:rPr/>
-      </w:pPr>
-      <w:r>
-        <w:rPr/>
+        <w:rPr>
+          <w:sz w:val="22"/>
+          <w:szCs w:val="22"/>
+        </w:rPr>
+      </w:pPr>
+      <w:r>
+        <w:rPr>
+          <w:sz w:val="22"/>
+          <w:szCs w:val="22"/>
+        </w:rPr>
         <w:t>These full-space long-horizon findings are stronger than the earlier subset results described in the documentation. They remain model results under the sampled ranges. The connector's long-run claim-quality advantage arises from recurring evidence transfers, accumulated provenance, repeated comparison, correction, and better population detection. Its one-time setup and per-firm integration costs become a smaller share of the accumulated comparison at longer horizons, while daily operating and governance costs continue; the model applies no accounting depreciation schedule. This does not demonstrate that a real public data connector would be effective or cost-beneficial.</w:t>
       </w:r>
     </w:p>
@@ -8427,8 +8663,8 @@
       </w:tblPr>
       <w:tblGrid>
         <w:gridCol w:w="2000"/>
-        <w:gridCol w:w="3399"/>
-        <w:gridCol w:w="3961"/>
+        <w:gridCol w:w="3396"/>
+        <w:gridCol w:w="3964"/>
       </w:tblGrid>
       <w:tr>
         <w:trPr>
@@ -8467,7 +8703,7 @@
         </w:tc>
         <w:tc>
           <w:tcPr>
-            <w:tcW w:w="3399" w:type="dxa"/>
+            <w:tcW w:w="3396" w:type="dxa"/>
             <w:tcBorders>
               <w:top w:val="single" w:sz="4" w:space="0" w:color="D4DCE6"/>
               <w:start w:val="single" w:sz="4" w:space="0" w:color="D4DCE6"/>
@@ -8497,7 +8733,7 @@
         </w:tc>
         <w:tc>
           <w:tcPr>
-            <w:tcW w:w="3961" w:type="dxa"/>
+            <w:tcW w:w="3964" w:type="dxa"/>
             <w:tcBorders>
               <w:top w:val="single" w:sz="4" w:space="0" w:color="D4DCE6"/>
               <w:start w:val="single" w:sz="4" w:space="0" w:color="D4DCE6"/>
@@ -8561,7 +8797,7 @@
         </w:tc>
         <w:tc>
           <w:tcPr>
-            <w:tcW w:w="3399" w:type="dxa"/>
+            <w:tcW w:w="3396" w:type="dxa"/>
             <w:tcBorders>
               <w:top w:val="single" w:sz="4" w:space="0" w:color="D4DCE6"/>
               <w:start w:val="single" w:sz="4" w:space="0" w:color="D4DCE6"/>
@@ -8590,7 +8826,7 @@
         </w:tc>
         <w:tc>
           <w:tcPr>
-            <w:tcW w:w="3961" w:type="dxa"/>
+            <w:tcW w:w="3964" w:type="dxa"/>
             <w:tcBorders>
               <w:top w:val="single" w:sz="4" w:space="0" w:color="D4DCE6"/>
               <w:start w:val="single" w:sz="4" w:space="0" w:color="D4DCE6"/>
@@ -8654,7 +8890,7 @@
         </w:tc>
         <w:tc>
           <w:tcPr>
-            <w:tcW w:w="3399" w:type="dxa"/>
+            <w:tcW w:w="3396" w:type="dxa"/>
             <w:tcBorders>
               <w:top w:val="single" w:sz="4" w:space="0" w:color="D4DCE6"/>
               <w:start w:val="single" w:sz="4" w:space="0" w:color="D4DCE6"/>
@@ -8684,7 +8920,7 @@
         </w:tc>
         <w:tc>
           <w:tcPr>
-            <w:tcW w:w="3961" w:type="dxa"/>
+            <w:tcW w:w="3964" w:type="dxa"/>
             <w:tcBorders>
               <w:top w:val="single" w:sz="4" w:space="0" w:color="D4DCE6"/>
               <w:start w:val="single" w:sz="4" w:space="0" w:color="D4DCE6"/>
@@ -8748,7 +8984,7 @@
         </w:tc>
         <w:tc>
           <w:tcPr>
-            <w:tcW w:w="3399" w:type="dxa"/>
+            <w:tcW w:w="3396" w:type="dxa"/>
             <w:tcBorders>
               <w:top w:val="single" w:sz="4" w:space="0" w:color="D4DCE6"/>
               <w:start w:val="single" w:sz="4" w:space="0" w:color="D4DCE6"/>
@@ -8777,7 +9013,7 @@
         </w:tc>
         <w:tc>
           <w:tcPr>
-            <w:tcW w:w="3961" w:type="dxa"/>
+            <w:tcW w:w="3964" w:type="dxa"/>
             <w:tcBorders>
               <w:top w:val="single" w:sz="4" w:space="0" w:color="D4DCE6"/>
               <w:start w:val="single" w:sz="4" w:space="0" w:color="D4DCE6"/>
@@ -8841,7 +9077,7 @@
         </w:tc>
         <w:tc>
           <w:tcPr>
-            <w:tcW w:w="3399" w:type="dxa"/>
+            <w:tcW w:w="3396" w:type="dxa"/>
             <w:tcBorders>
               <w:top w:val="single" w:sz="4" w:space="0" w:color="D4DCE6"/>
               <w:start w:val="single" w:sz="4" w:space="0" w:color="D4DCE6"/>
@@ -8871,7 +9107,7 @@
         </w:tc>
         <w:tc>
           <w:tcPr>
-            <w:tcW w:w="3961" w:type="dxa"/>
+            <w:tcW w:w="3964" w:type="dxa"/>
             <w:tcBorders>
               <w:top w:val="single" w:sz="4" w:space="0" w:color="D4DCE6"/>
               <w:start w:val="single" w:sz="4" w:space="0" w:color="D4DCE6"/>
@@ -8935,7 +9171,7 @@
         </w:tc>
         <w:tc>
           <w:tcPr>
-            <w:tcW w:w="3399" w:type="dxa"/>
+            <w:tcW w:w="3396" w:type="dxa"/>
             <w:tcBorders>
               <w:top w:val="single" w:sz="4" w:space="0" w:color="D4DCE6"/>
               <w:start w:val="single" w:sz="4" w:space="0" w:color="D4DCE6"/>
@@ -8964,7 +9200,7 @@
         </w:tc>
         <w:tc>
           <w:tcPr>
-            <w:tcW w:w="3961" w:type="dxa"/>
+            <w:tcW w:w="3964" w:type="dxa"/>
             <w:tcBorders>
               <w:top w:val="single" w:sz="4" w:space="0" w:color="D4DCE6"/>
               <w:start w:val="single" w:sz="4" w:space="0" w:color="D4DCE6"/>
@@ -9028,7 +9264,7 @@
         </w:tc>
         <w:tc>
           <w:tcPr>
-            <w:tcW w:w="3399" w:type="dxa"/>
+            <w:tcW w:w="3396" w:type="dxa"/>
             <w:tcBorders>
               <w:top w:val="single" w:sz="4" w:space="0" w:color="D4DCE6"/>
               <w:start w:val="single" w:sz="4" w:space="0" w:color="D4DCE6"/>
@@ -9058,7 +9294,7 @@
         </w:tc>
         <w:tc>
           <w:tcPr>
-            <w:tcW w:w="3961" w:type="dxa"/>
+            <w:tcW w:w="3964" w:type="dxa"/>
             <w:tcBorders>
               <w:top w:val="single" w:sz="4" w:space="0" w:color="D4DCE6"/>
               <w:start w:val="single" w:sz="4" w:space="0" w:color="D4DCE6"/>
@@ -9125,10 +9361,16 @@
     <w:p>
       <w:pPr>
         <w:pStyle w:val="Normal"/>
-        <w:rPr/>
-      </w:pPr>
-      <w:r>
-        <w:rPr/>
+        <w:rPr>
+          <w:sz w:val="22"/>
+          <w:szCs w:val="22"/>
+        </w:rPr>
+      </w:pPr>
+      <w:r>
+        <w:rPr>
+          <w:sz w:val="22"/>
+          <w:szCs w:val="22"/>
+        </w:rPr>
         <w:t>The market engine is validated in a dedicated fixed-parameter campaign, separate from the policy LHS: 30 independently seeded 10,000-day paths under the baseline current-supervision regime, each discarding a 2,000-day burn-in and exporting the daily market series and the primary listing's complete order-book event stream (about 256,000-298,000 events per seed). Every seed carries a provenance manifest recording the full configuration, independent market and supervision seeds, schema versions, and content hashes. Diagnostics are computed per seed under rules declared before execution, and cross-seed statements use the seed as the unit of inference; raw returns are never pooled across paths. An earlier illustrative diagnostic of the detached single-path simulation_results.csv is superseded by this campaign.</w:t>
       </w:r>
     </w:p>
@@ -9166,7 +9408,7 @@
         <w:tblStyle w:val="TableGrid"/>
         <w:tblW w:w="9222" w:type="dxa"/>
         <w:jc w:val="start"/>
-        <w:tblInd w:w="138" w:type="dxa"/>
+        <w:tblInd w:w="137" w:type="dxa"/>
         <w:tblLayout w:type="fixed"/>
         <w:tblCellMar>
           <w:top w:w="0" w:type="dxa"/>
@@ -9177,9 +9419,9 @@
         <w:tblLook w:val="04a0" w:firstRow="1" w:noVBand="1" w:lastRow="0" w:firstColumn="1" w:lastColumn="0" w:noHBand="0"/>
       </w:tblPr>
       <w:tblGrid>
-        <w:gridCol w:w="2205"/>
-        <w:gridCol w:w="2340"/>
-        <w:gridCol w:w="2340"/>
+        <w:gridCol w:w="2204"/>
+        <w:gridCol w:w="2337"/>
+        <w:gridCol w:w="2344"/>
         <w:gridCol w:w="2337"/>
       </w:tblGrid>
       <w:tr>
@@ -9189,13 +9431,14 @@
         </w:trPr>
         <w:tc>
           <w:tcPr>
-            <w:tcW w:w="2205" w:type="dxa"/>
+            <w:tcW w:w="2204" w:type="dxa"/>
             <w:tcBorders/>
             <w:shd w:fill="1F4E78" w:val="clear"/>
           </w:tcPr>
           <w:p>
             <w:pPr>
               <w:pStyle w:val="Normal"/>
+              <w:suppressAutoHyphens w:val="true"/>
               <w:spacing w:before="0" w:after="120"/>
               <w:rPr>
                 <w:rFonts w:eastAsia="ＭＳ 明朝" w:cs=""/>
@@ -9221,13 +9464,14 @@
         </w:tc>
         <w:tc>
           <w:tcPr>
-            <w:tcW w:w="2340" w:type="dxa"/>
+            <w:tcW w:w="2337" w:type="dxa"/>
             <w:tcBorders/>
             <w:shd w:fill="1F4E78" w:val="clear"/>
           </w:tcPr>
           <w:p>
             <w:pPr>
               <w:pStyle w:val="Normal"/>
+              <w:suppressAutoHyphens w:val="true"/>
               <w:spacing w:before="0" w:after="120"/>
               <w:rPr>
                 <w:rFonts w:eastAsia="ＭＳ 明朝" w:cs=""/>
@@ -9253,13 +9497,14 @@
         </w:tc>
         <w:tc>
           <w:tcPr>
-            <w:tcW w:w="2340" w:type="dxa"/>
+            <w:tcW w:w="2344" w:type="dxa"/>
             <w:tcBorders/>
             <w:shd w:fill="1F4E78" w:val="clear"/>
           </w:tcPr>
           <w:p>
             <w:pPr>
               <w:pStyle w:val="Normal"/>
+              <w:suppressAutoHyphens w:val="true"/>
               <w:spacing w:before="0" w:after="120"/>
               <w:rPr>
                 <w:rFonts w:eastAsia="ＭＳ 明朝" w:cs=""/>
@@ -9292,6 +9537,7 @@
           <w:p>
             <w:pPr>
               <w:pStyle w:val="Normal"/>
+              <w:suppressAutoHyphens w:val="true"/>
               <w:spacing w:before="0" w:after="120"/>
               <w:rPr>
                 <w:rFonts w:eastAsia="ＭＳ 明朝" w:cs=""/>
@@ -9322,12 +9568,13 @@
         </w:trPr>
         <w:tc>
           <w:tcPr>
-            <w:tcW w:w="2205" w:type="dxa"/>
+            <w:tcW w:w="2204" w:type="dxa"/>
             <w:tcBorders/>
           </w:tcPr>
           <w:p>
             <w:pPr>
               <w:pStyle w:val="Normal"/>
+              <w:suppressAutoHyphens w:val="true"/>
               <w:spacing w:before="0" w:after="120"/>
               <w:rPr>
                 <w:sz w:val="16"/>
@@ -9345,12 +9592,13 @@
         </w:tc>
         <w:tc>
           <w:tcPr>
-            <w:tcW w:w="2340" w:type="dxa"/>
+            <w:tcW w:w="2337" w:type="dxa"/>
             <w:tcBorders/>
           </w:tcPr>
           <w:p>
             <w:pPr>
               <w:pStyle w:val="Normal"/>
+              <w:suppressAutoHyphens w:val="true"/>
               <w:spacing w:before="0" w:after="120"/>
               <w:rPr>
                 <w:rFonts w:eastAsia="ＭＳ 明朝" w:cs=""/>
@@ -9374,12 +9622,13 @@
         </w:tc>
         <w:tc>
           <w:tcPr>
-            <w:tcW w:w="2340" w:type="dxa"/>
+            <w:tcW w:w="2344" w:type="dxa"/>
             <w:tcBorders/>
           </w:tcPr>
           <w:p>
             <w:pPr>
               <w:pStyle w:val="Normal"/>
+              <w:suppressAutoHyphens w:val="true"/>
               <w:spacing w:before="0" w:after="120"/>
               <w:rPr>
                 <w:rFonts w:eastAsia="ＭＳ 明朝" w:cs=""/>
@@ -9409,6 +9658,7 @@
           <w:p>
             <w:pPr>
               <w:pStyle w:val="Normal"/>
+              <w:suppressAutoHyphens w:val="true"/>
               <w:spacing w:before="0" w:after="120"/>
               <w:rPr>
                 <w:rFonts w:eastAsia="ＭＳ 明朝" w:cs=""/>
@@ -9437,12 +9687,13 @@
         </w:trPr>
         <w:tc>
           <w:tcPr>
-            <w:tcW w:w="2205" w:type="dxa"/>
+            <w:tcW w:w="2204" w:type="dxa"/>
             <w:tcBorders/>
           </w:tcPr>
           <w:p>
             <w:pPr>
               <w:pStyle w:val="Normal"/>
+              <w:suppressAutoHyphens w:val="true"/>
               <w:spacing w:before="0" w:after="120"/>
               <w:rPr>
                 <w:rFonts w:eastAsia="ＭＳ 明朝" w:cs=""/>
@@ -9466,12 +9717,13 @@
         </w:tc>
         <w:tc>
           <w:tcPr>
-            <w:tcW w:w="2340" w:type="dxa"/>
+            <w:tcW w:w="2337" w:type="dxa"/>
             <w:tcBorders/>
           </w:tcPr>
           <w:p>
             <w:pPr>
               <w:pStyle w:val="Normal"/>
+              <w:suppressAutoHyphens w:val="true"/>
               <w:spacing w:before="0" w:after="120"/>
               <w:rPr>
                 <w:rFonts w:eastAsia="ＭＳ 明朝" w:cs=""/>
@@ -9495,12 +9747,13 @@
         </w:tc>
         <w:tc>
           <w:tcPr>
-            <w:tcW w:w="2340" w:type="dxa"/>
+            <w:tcW w:w="2344" w:type="dxa"/>
             <w:tcBorders/>
           </w:tcPr>
           <w:p>
             <w:pPr>
               <w:pStyle w:val="Normal"/>
+              <w:suppressAutoHyphens w:val="true"/>
               <w:spacing w:before="0" w:after="120"/>
               <w:rPr>
                 <w:rFonts w:eastAsia="ＭＳ 明朝" w:cs=""/>
@@ -9530,6 +9783,7 @@
           <w:p>
             <w:pPr>
               <w:pStyle w:val="Normal"/>
+              <w:suppressAutoHyphens w:val="true"/>
               <w:spacing w:before="0" w:after="120"/>
               <w:rPr>
                 <w:rFonts w:eastAsia="ＭＳ 明朝" w:cs=""/>
@@ -9558,12 +9812,13 @@
         </w:trPr>
         <w:tc>
           <w:tcPr>
-            <w:tcW w:w="2205" w:type="dxa"/>
+            <w:tcW w:w="2204" w:type="dxa"/>
             <w:tcBorders/>
           </w:tcPr>
           <w:p>
             <w:pPr>
               <w:pStyle w:val="Normal"/>
+              <w:suppressAutoHyphens w:val="true"/>
               <w:spacing w:before="0" w:after="120"/>
               <w:rPr>
                 <w:rFonts w:eastAsia="ＭＳ 明朝" w:cs=""/>
@@ -9587,12 +9842,13 @@
         </w:tc>
         <w:tc>
           <w:tcPr>
-            <w:tcW w:w="2340" w:type="dxa"/>
+            <w:tcW w:w="2337" w:type="dxa"/>
             <w:tcBorders/>
           </w:tcPr>
           <w:p>
             <w:pPr>
               <w:pStyle w:val="Normal"/>
+              <w:suppressAutoHyphens w:val="true"/>
               <w:spacing w:before="0" w:after="120"/>
               <w:rPr>
                 <w:rFonts w:eastAsia="ＭＳ 明朝" w:cs=""/>
@@ -9616,12 +9872,13 @@
         </w:tc>
         <w:tc>
           <w:tcPr>
-            <w:tcW w:w="2340" w:type="dxa"/>
+            <w:tcW w:w="2344" w:type="dxa"/>
             <w:tcBorders/>
           </w:tcPr>
           <w:p>
             <w:pPr>
               <w:pStyle w:val="Normal"/>
+              <w:suppressAutoHyphens w:val="true"/>
               <w:spacing w:before="0" w:after="120"/>
               <w:rPr>
                 <w:rFonts w:eastAsia="ＭＳ 明朝" w:cs=""/>
@@ -9651,6 +9908,7 @@
           <w:p>
             <w:pPr>
               <w:pStyle w:val="Normal"/>
+              <w:suppressAutoHyphens w:val="true"/>
               <w:spacing w:before="0" w:after="120"/>
               <w:rPr>
                 <w:rFonts w:eastAsia="ＭＳ 明朝" w:cs=""/>
@@ -9679,12 +9937,13 @@
         </w:trPr>
         <w:tc>
           <w:tcPr>
-            <w:tcW w:w="2205" w:type="dxa"/>
+            <w:tcW w:w="2204" w:type="dxa"/>
             <w:tcBorders/>
           </w:tcPr>
           <w:p>
             <w:pPr>
               <w:pStyle w:val="Normal"/>
+              <w:suppressAutoHyphens w:val="true"/>
               <w:spacing w:before="0" w:after="120"/>
               <w:rPr>
                 <w:rFonts w:eastAsia="ＭＳ 明朝" w:cs=""/>
@@ -9708,12 +9967,13 @@
         </w:tc>
         <w:tc>
           <w:tcPr>
-            <w:tcW w:w="2340" w:type="dxa"/>
+            <w:tcW w:w="2337" w:type="dxa"/>
             <w:tcBorders/>
           </w:tcPr>
           <w:p>
             <w:pPr>
               <w:pStyle w:val="Normal"/>
+              <w:suppressAutoHyphens w:val="true"/>
               <w:spacing w:before="0" w:after="120"/>
               <w:rPr>
                 <w:rFonts w:eastAsia="ＭＳ 明朝" w:cs=""/>
@@ -9737,12 +9997,13 @@
         </w:tc>
         <w:tc>
           <w:tcPr>
-            <w:tcW w:w="2340" w:type="dxa"/>
+            <w:tcW w:w="2344" w:type="dxa"/>
             <w:tcBorders/>
           </w:tcPr>
           <w:p>
             <w:pPr>
               <w:pStyle w:val="Normal"/>
+              <w:suppressAutoHyphens w:val="true"/>
               <w:spacing w:before="0" w:after="120"/>
               <w:rPr>
                 <w:rFonts w:eastAsia="ＭＳ 明朝" w:cs=""/>
@@ -9772,6 +10033,7 @@
           <w:p>
             <w:pPr>
               <w:pStyle w:val="Normal"/>
+              <w:suppressAutoHyphens w:val="true"/>
               <w:spacing w:before="0" w:after="120"/>
               <w:rPr>
                 <w:rFonts w:eastAsia="ＭＳ 明朝" w:cs=""/>
@@ -9800,12 +10062,13 @@
         </w:trPr>
         <w:tc>
           <w:tcPr>
-            <w:tcW w:w="2205" w:type="dxa"/>
+            <w:tcW w:w="2204" w:type="dxa"/>
             <w:tcBorders/>
           </w:tcPr>
           <w:p>
             <w:pPr>
               <w:pStyle w:val="Normal"/>
+              <w:suppressAutoHyphens w:val="true"/>
               <w:spacing w:before="0" w:after="120"/>
               <w:rPr>
                 <w:rFonts w:eastAsia="ＭＳ 明朝" w:cs=""/>
@@ -9829,12 +10092,13 @@
         </w:tc>
         <w:tc>
           <w:tcPr>
-            <w:tcW w:w="2340" w:type="dxa"/>
+            <w:tcW w:w="2337" w:type="dxa"/>
             <w:tcBorders/>
           </w:tcPr>
           <w:p>
             <w:pPr>
               <w:pStyle w:val="Normal"/>
+              <w:suppressAutoHyphens w:val="true"/>
               <w:spacing w:before="0" w:after="120"/>
               <w:rPr>
                 <w:rFonts w:eastAsia="ＭＳ 明朝" w:cs=""/>
@@ -9858,12 +10122,13 @@
         </w:tc>
         <w:tc>
           <w:tcPr>
-            <w:tcW w:w="2340" w:type="dxa"/>
+            <w:tcW w:w="2344" w:type="dxa"/>
             <w:tcBorders/>
           </w:tcPr>
           <w:p>
             <w:pPr>
               <w:pStyle w:val="Normal"/>
+              <w:suppressAutoHyphens w:val="true"/>
               <w:spacing w:before="0" w:after="120"/>
               <w:rPr>
                 <w:rFonts w:eastAsia="ＭＳ 明朝" w:cs=""/>
@@ -9893,6 +10158,7 @@
           <w:p>
             <w:pPr>
               <w:pStyle w:val="Normal"/>
+              <w:suppressAutoHyphens w:val="true"/>
               <w:spacing w:before="0" w:after="120"/>
               <w:rPr>
                 <w:rFonts w:eastAsia="ＭＳ 明朝" w:cs=""/>
@@ -9921,12 +10187,13 @@
         </w:trPr>
         <w:tc>
           <w:tcPr>
-            <w:tcW w:w="2205" w:type="dxa"/>
+            <w:tcW w:w="2204" w:type="dxa"/>
             <w:tcBorders/>
           </w:tcPr>
           <w:p>
             <w:pPr>
               <w:pStyle w:val="Normal"/>
+              <w:suppressAutoHyphens w:val="true"/>
               <w:spacing w:before="0" w:after="120"/>
               <w:rPr>
                 <w:rFonts w:eastAsia="ＭＳ 明朝" w:cs=""/>
@@ -9950,12 +10217,13 @@
         </w:tc>
         <w:tc>
           <w:tcPr>
-            <w:tcW w:w="2340" w:type="dxa"/>
+            <w:tcW w:w="2337" w:type="dxa"/>
             <w:tcBorders/>
           </w:tcPr>
           <w:p>
             <w:pPr>
               <w:pStyle w:val="Normal"/>
+              <w:suppressAutoHyphens w:val="true"/>
               <w:spacing w:before="0" w:after="120"/>
               <w:rPr>
                 <w:rFonts w:eastAsia="ＭＳ 明朝" w:cs=""/>
@@ -9979,12 +10247,13 @@
         </w:tc>
         <w:tc>
           <w:tcPr>
-            <w:tcW w:w="2340" w:type="dxa"/>
+            <w:tcW w:w="2344" w:type="dxa"/>
             <w:tcBorders/>
           </w:tcPr>
           <w:p>
             <w:pPr>
               <w:pStyle w:val="Normal"/>
+              <w:suppressAutoHyphens w:val="true"/>
               <w:spacing w:before="0" w:after="120"/>
               <w:rPr>
                 <w:rFonts w:eastAsia="ＭＳ 明朝" w:cs=""/>
@@ -10014,6 +10283,7 @@
           <w:p>
             <w:pPr>
               <w:pStyle w:val="Normal"/>
+              <w:suppressAutoHyphens w:val="true"/>
               <w:spacing w:before="0" w:after="120"/>
               <w:rPr>
                 <w:rFonts w:eastAsia="ＭＳ 明朝" w:cs=""/>
@@ -10042,12 +10312,13 @@
         </w:trPr>
         <w:tc>
           <w:tcPr>
-            <w:tcW w:w="2205" w:type="dxa"/>
+            <w:tcW w:w="2204" w:type="dxa"/>
             <w:tcBorders/>
           </w:tcPr>
           <w:p>
             <w:pPr>
               <w:pStyle w:val="Normal"/>
+              <w:suppressAutoHyphens w:val="true"/>
               <w:spacing w:before="0" w:after="120"/>
               <w:rPr>
                 <w:rFonts w:eastAsia="ＭＳ 明朝" w:cs=""/>
@@ -10071,12 +10342,13 @@
         </w:tc>
         <w:tc>
           <w:tcPr>
-            <w:tcW w:w="2340" w:type="dxa"/>
+            <w:tcW w:w="2337" w:type="dxa"/>
             <w:tcBorders/>
           </w:tcPr>
           <w:p>
             <w:pPr>
               <w:pStyle w:val="Normal"/>
+              <w:suppressAutoHyphens w:val="true"/>
               <w:spacing w:before="0" w:after="120"/>
               <w:rPr>
                 <w:rFonts w:eastAsia="ＭＳ 明朝" w:cs=""/>
@@ -10100,12 +10372,13 @@
         </w:tc>
         <w:tc>
           <w:tcPr>
-            <w:tcW w:w="2340" w:type="dxa"/>
+            <w:tcW w:w="2344" w:type="dxa"/>
             <w:tcBorders/>
           </w:tcPr>
           <w:p>
             <w:pPr>
               <w:pStyle w:val="Normal"/>
+              <w:suppressAutoHyphens w:val="true"/>
               <w:spacing w:before="0" w:after="120"/>
               <w:rPr>
                 <w:rFonts w:eastAsia="ＭＳ 明朝" w:cs=""/>
@@ -10135,6 +10408,7 @@
           <w:p>
             <w:pPr>
               <w:pStyle w:val="Normal"/>
+              <w:suppressAutoHyphens w:val="true"/>
               <w:spacing w:before="0" w:after="120"/>
               <w:rPr>
                 <w:rFonts w:eastAsia="ＭＳ 明朝" w:cs=""/>
@@ -10159,17 +10433,18 @@
       </w:tr>
       <w:tr>
         <w:trPr>
-          <w:trHeight w:val="1233" w:hRule="atLeast"/>
+          <w:trHeight w:val="996" w:hRule="atLeast"/>
           <w:cantSplit/>
         </w:trPr>
         <w:tc>
           <w:tcPr>
-            <w:tcW w:w="2205" w:type="dxa"/>
+            <w:tcW w:w="2204" w:type="dxa"/>
             <w:tcBorders/>
           </w:tcPr>
           <w:p>
             <w:pPr>
               <w:pStyle w:val="Normal"/>
+              <w:suppressAutoHyphens w:val="true"/>
               <w:spacing w:before="0" w:after="120"/>
               <w:rPr>
                 <w:rFonts w:eastAsia="ＭＳ 明朝" w:cs=""/>
@@ -10193,12 +10468,13 @@
         </w:tc>
         <w:tc>
           <w:tcPr>
-            <w:tcW w:w="2340" w:type="dxa"/>
+            <w:tcW w:w="2337" w:type="dxa"/>
             <w:tcBorders/>
           </w:tcPr>
           <w:p>
             <w:pPr>
               <w:pStyle w:val="Normal"/>
+              <w:suppressAutoHyphens w:val="true"/>
               <w:spacing w:before="0" w:after="120"/>
               <w:rPr>
                 <w:rFonts w:eastAsia="ＭＳ 明朝" w:cs=""/>
@@ -10222,12 +10498,13 @@
         </w:tc>
         <w:tc>
           <w:tcPr>
-            <w:tcW w:w="2340" w:type="dxa"/>
+            <w:tcW w:w="2344" w:type="dxa"/>
             <w:tcBorders/>
           </w:tcPr>
           <w:p>
             <w:pPr>
               <w:pStyle w:val="Normal"/>
+              <w:suppressAutoHyphens w:val="true"/>
               <w:spacing w:before="0" w:after="120"/>
               <w:rPr>
                 <w:rFonts w:eastAsia="ＭＳ 明朝" w:cs=""/>
@@ -10257,6 +10534,7 @@
           <w:p>
             <w:pPr>
               <w:pStyle w:val="Normal"/>
+              <w:suppressAutoHyphens w:val="true"/>
               <w:spacing w:before="0" w:after="120"/>
               <w:rPr>
                 <w:rFonts w:eastAsia="ＭＳ 明朝" w:cs=""/>
@@ -10292,30 +10570,48 @@
     <w:p>
       <w:pPr>
         <w:pStyle w:val="Normal"/>
-        <w:rPr/>
-      </w:pPr>
-      <w:r>
-        <w:rPr/>
+        <w:rPr>
+          <w:sz w:val="22"/>
+          <w:szCs w:val="22"/>
+        </w:rPr>
+      </w:pPr>
+      <w:r>
+        <w:rPr>
+          <w:sz w:val="22"/>
+          <w:szCs w:val="22"/>
+        </w:rPr>
         <w:t>Four microstructure and volatility facts are reproduced in every seed. Two return-distribution facts are borderline. Excess kurtosis is positive in all seeds but exceeds 3 in only a minority, and Hill tail exponents average 5.4, so simulated tails are heavier than Gaussian yet thinner than the empirical 2-5 reference band in most seeds. Linear return autocorrelation is small but negative beyond the white-noise band at short lags, so the weak-autocorrelation criterion is only partially met. The multi-seed result also reverses the earlier single-path impression that fat tails were strong and linear predictability was severe; that detached path was unrepresentative, which is precisely why cross-seed validation is required.</w:t>
       </w:r>
     </w:p>
     <w:p>
       <w:pPr>
         <w:pStyle w:val="Normal"/>
-        <w:rPr/>
-      </w:pPr>
-      <w:r>
-        <w:rPr/>
+        <w:rPr>
+          <w:sz w:val="22"/>
+          <w:szCs w:val="22"/>
+        </w:rPr>
+      </w:pPr>
+      <w:r>
+        <w:rPr>
+          <w:sz w:val="22"/>
+          <w:szCs w:val="22"/>
+        </w:rPr>
         <w:t>Positive price impact is not reproduced. The implemented diagnostic correlates log trade volume with the immediate absolute mid-price movement; across seeds the mean correlation is -0.013 with a cross-seed 95% half-width of 0.004, classified as not reproduced in 26 of 30 seeds and never as reproduced. Under this unsigned immediate-horizon measure, the engine's mid-price does not respond to trade size in the way empirical impact regularities require. A signed event-level diagnostic - trade sign multiplied by the future mid-price change over multiple event horizons, with seed-level uncertainty - is the sharper standard test and is identified as future work; under the pre-declared rule the fact is currently not reproduced and the paper reports it as such.</w:t>
       </w:r>
     </w:p>
     <w:p>
       <w:pPr>
         <w:pStyle w:val="Normal"/>
-        <w:rPr/>
-      </w:pPr>
-      <w:r>
-        <w:rPr/>
+        <w:rPr>
+          <w:sz w:val="22"/>
+          <w:szCs w:val="22"/>
+        </w:rPr>
+      </w:pPr>
+      <w:r>
+        <w:rPr>
+          <w:sz w:val="22"/>
+          <w:szCs w:val="22"/>
+        </w:rPr>
         <w:t>These results bound interpretation rather than invalidate the policy comparison. The policy outcomes in Sections 5.1-5.6 are claim-quality, greenhushing, procedural, and cost metrics generated by enforcement, information, and capacity mechanisms. As established in Section 3.7, firm environmental decisions contain no own-share-price feedback, so no policy ranking depends on price-mediated corporate incentives. What the partial validation does restrict is the reading of market-side quantities: investor signal distortion and price paths are internal model responses, and the financial market must not be described as empirically validated.</w:t>
       </w:r>
     </w:p>
@@ -10332,30 +10628,48 @@
     <w:p>
       <w:pPr>
         <w:pStyle w:val="Normal"/>
-        <w:rPr/>
-      </w:pPr>
-      <w:r>
-        <w:rPr/>
+        <w:rPr>
+          <w:sz w:val="22"/>
+          <w:szCs w:val="22"/>
+        </w:rPr>
+      </w:pPr>
+      <w:r>
+        <w:rPr>
+          <w:sz w:val="22"/>
+          <w:szCs w:val="22"/>
+        </w:rPr>
         <w:t>The central contribution is a mechanism-based comparison of ex-post supervision, preventive drafting support, and certified environmental-data exchange within one financial and real-economy simulation. The comparison shows how the timing and information architecture of an institution can change claim quality, communication, cost, and administrative workload without treating any experimental regime as enacted law. The financial market is an endogenous response and financing layer, not a source of own-share-price discipline over corporate environmental choices.</w:t>
       </w:r>
     </w:p>
     <w:p>
       <w:pPr>
         <w:pStyle w:val="Normal"/>
-        <w:rPr/>
-      </w:pPr>
-      <w:r>
-        <w:rPr/>
+        <w:rPr>
+          <w:sz w:val="22"/>
+          <w:szCs w:val="22"/>
+        </w:rPr>
+      </w:pPr>
+      <w:r>
+        <w:rPr>
+          <w:sz w:val="22"/>
+          <w:szCs w:val="22"/>
+        </w:rPr>
         <w:t>The information-safe procedural design is essential to that comparison. Supervisors and assurance providers receive uncertain records rather than latent truth; cases proceed through screening, evidence requests, correction, investigation, decision, publication, and closure; and conflicts consume capacity without supporting sanctions unless evidence is corroborated. This makes false positives, inconclusive cases, exposure duration, and greenhushing outcomes of institutional procedure rather than assumptions away from the analysis.</w:t>
       </w:r>
     </w:p>
     <w:p>
       <w:pPr>
         <w:pStyle w:val="Normal"/>
-        <w:rPr/>
-      </w:pPr>
-      <w:r>
-        <w:rPr/>
+        <w:rPr>
+          <w:sz w:val="22"/>
+          <w:szCs w:val="22"/>
+        </w:rPr>
+      </w:pPr>
+      <w:r>
+        <w:rPr>
+          <w:sz w:val="22"/>
+          <w:szCs w:val="22"/>
+        </w:rPr>
         <w:t>The paired global design then tests these mechanisms across uncertain environments and normative choices. Raw effects, Pareto membership, rank frequency, parameter sensitivity, and alternative weights constrain interpretation of the composite score. The LEGAL, LEGAL-ANCHOR, EXPERIMENT, and STYLIZATION registry makes the source and role of assumptions visible without implying empirical calibration.</w:t>
       </w:r>
     </w:p>
@@ -10372,70 +10686,112 @@
     <w:p>
       <w:pPr>
         <w:pStyle w:val="Normal"/>
-        <w:rPr/>
-      </w:pPr>
-      <w:r>
-        <w:rPr/>
+        <w:rPr>
+          <w:sz w:val="22"/>
+          <w:szCs w:val="22"/>
+        </w:rPr>
+      </w:pPr>
+      <w:r>
+        <w:rPr>
+          <w:sz w:val="22"/>
+          <w:szCs w:val="22"/>
+        </w:rPr>
         <w:t>Six limitations bound the interpretation of the experiment.</w:t>
       </w:r>
     </w:p>
     <w:p>
       <w:pPr>
         <w:pStyle w:val="Normal"/>
-        <w:rPr/>
-      </w:pPr>
-      <w:r>
-        <w:rPr/>
+        <w:rPr>
+          <w:sz w:val="22"/>
+          <w:szCs w:val="22"/>
+        </w:rPr>
+      </w:pPr>
+      <w:r>
+        <w:rPr>
+          <w:sz w:val="22"/>
+          <w:szCs w:val="22"/>
+        </w:rPr>
         <w:t>First, the model is neither empirically calibrated nor a source of causal inference. Enforcement frequencies, claim prevalence, behavioral responses, emissions, administrative costs, and the mappings from claims to demand, valuation, trust, productivity, and turnover are not estimated from observed data. The LHS campaign tests robustness to chosen ranges rather than validating them; paired common shocks identify differences only within the simulation. Voluntary participation is endogenous, so intention-to-treat and treatment-on-the-treated quantities remain descriptive. The outputs are not real-world forecasts.</w:t>
       </w:r>
     </w:p>
     <w:p>
       <w:pPr>
         <w:pStyle w:val="Normal"/>
-        <w:rPr/>
-      </w:pPr>
-      <w:r>
-        <w:rPr/>
+        <w:rPr>
+          <w:sz w:val="22"/>
+          <w:szCs w:val="22"/>
+        </w:rPr>
+      </w:pPr>
+      <w:r>
+        <w:rPr>
+          <w:sz w:val="22"/>
+          <w:szCs w:val="22"/>
+        </w:rPr>
         <w:t>Second, legal and institutional implementation is reduced-form and scenario-specific. National transposition, jurisdiction, appeals, remedies, enforcement cooperation, complete CSDDD undertaking scope, the full ESRS datapoint architecture, Taxonomy technical criteria, lifecycle assessment, assurance standards, and European Green Bond workflows require separate legal and technical treatment. The connector also abstracts from the engineering, governance, lawful-basis, cybersecurity, and organizational requirements of GDPR and NIS2. The paper is not legal advice.</w:t>
       </w:r>
     </w:p>
     <w:p>
       <w:pPr>
         <w:pStyle w:val="Normal"/>
-        <w:rPr/>
-      </w:pPr>
-      <w:r>
-        <w:rPr/>
+        <w:rPr>
+          <w:sz w:val="22"/>
+          <w:szCs w:val="22"/>
+        </w:rPr>
+      </w:pPr>
+      <w:r>
+        <w:rPr>
+          <w:sz w:val="22"/>
+          <w:szCs w:val="22"/>
+        </w:rPr>
         <w:t>Third, measurement interoperability and environmental coverage are partial. The model detects unit mismatch but does not represent conversion evidence; Scope 3, facilities, subsidiaries, individual machines, service-production boundaries, and supply chains are incomplete. Methodology changes, boundary differences, staleness, and missing coverage enter through stylized uncertainty. The detector also cannot resolve production-driven absolute reductions, intensity-versus-absolute framing without production evidence, coordinated narratives, or audience perceptions of technically true claims. The connector reconciles available records but cannot create missing meters, supplier data, or a complete environmental truth system. Claim-quality outcomes must therefore be distinguished from physical-emissions outcomes.</w:t>
       </w:r>
     </w:p>
     <w:p>
       <w:pPr>
         <w:pStyle w:val="Normal"/>
-        <w:rPr/>
-      </w:pPr>
-      <w:r>
-        <w:rPr/>
+        <w:rPr>
+          <w:sz w:val="22"/>
+          <w:szCs w:val="22"/>
+        </w:rPr>
+      </w:pPr>
+      <w:r>
+        <w:rPr>
+          <w:sz w:val="22"/>
+          <w:szCs w:val="22"/>
+        </w:rPr>
         <w:t>Fourth, the composite score and its weights are normative EXPERIMENT aggregations, not an absolute welfare function. Default winner shares describe one value system; alternative weights and frequent Pareto co-membership show that rankings depend on accuracy, greenhushing, cost, participation, and burden priorities. The exogenous EUR 1,000 consumer budget, simulation-scale corporate balances, and simulation euros are accounting devices and cannot be read as EU fiscal costs or firm forecasts.</w:t>
       </w:r>
     </w:p>
     <w:p>
       <w:pPr>
         <w:pStyle w:val="Normal"/>
-        <w:rPr/>
-      </w:pPr>
-      <w:r>
-        <w:rPr/>
+        <w:rPr>
+          <w:sz w:val="22"/>
+          <w:szCs w:val="22"/>
+        </w:rPr>
+      </w:pPr>
+      <w:r>
+        <w:rPr>
+          <w:sz w:val="22"/>
+          <w:szCs w:val="22"/>
+        </w:rPr>
         <w:t>Fifth, statistical and computational reproducibility are limited. The authoritative campaign uses three paired replications per draw, so rare events and draw-level rankings can remain noisy. The executed 15-replication extension on 12 representative configurations narrows paired intervals in 92.3% of comparable cells yet confirms the three-replication default-weight winner in only 32 of 48 draw-horizon cells; distributional effects, improvement fractions, and Pareto membership are therefore more reliable than draw-level league tables. Partial rank correlations and standardized coefficients can miss non-monotonicity and interactions. In addition, the shipped campaign manifests record a git hash suffixed +dirty. The archival provenance package preserves the authoritative outputs, configuration, seed schedules, recoverable environment information, and SHA-256 checksums, but the original dirty diff was not retained. A later direct-child commit is only a partially reconstructed candidate source snapshot; recovery of the original dirty worktree and bit-level reproducibility are not claimed.</w:t>
       </w:r>
     </w:p>
     <w:p>
       <w:pPr>
         <w:pStyle w:val="Normal"/>
-        <w:rPr/>
-      </w:pPr>
-      <w:r>
-        <w:rPr/>
+        <w:rPr>
+          <w:sz w:val="22"/>
+          <w:szCs w:val="22"/>
+        </w:rPr>
+      </w:pPr>
+      <w:r>
+        <w:rPr>
+          <w:sz w:val="22"/>
+          <w:szCs w:val="22"/>
+        </w:rPr>
         <w:t>Sixth, financial-market validation is limited and the model contains no own-share-price feedback into corporate greenwashing, disclosure, or transition investment. Across 30 independent seeds, volatility clustering, positive spread and depth, trade-sign persistence, and cancellation activity are reproduced; fat tails, the volume-volatility relation, and weak linear return autocorrelation are only partially reproduced; and positive price impact is not reproduced under the implemented immediate-impact diagnostic. Market-side quantities are therefore internal responses, and no policy ranking is evidence of equity-price discipline over corporate environmental behavior.</w:t>
       </w:r>
     </w:p>
@@ -10452,30 +10808,48 @@
     <w:p>
       <w:pPr>
         <w:pStyle w:val="Normal"/>
-        <w:rPr/>
-      </w:pPr>
-      <w:r>
-        <w:rPr/>
+        <w:rPr>
+          <w:sz w:val="22"/>
+          <w:szCs w:val="22"/>
+        </w:rPr>
+      </w:pPr>
+      <w:r>
+        <w:rPr>
+          <w:sz w:val="22"/>
+          <w:szCs w:val="22"/>
+        </w:rPr>
         <w:t>Within the experiment, preventive pre-screening frequently lowers material overstatement and exposure-weighted severity because it acts before publication, but recurrent review and revision costs, selective participation, delay, and withdrawal raise greenhushing and reduce its default-weight competitiveness over longer horizons. The hub therefore continues to improve claim quality in a large share of draws; it does not simply fail.</w:t>
       </w:r>
     </w:p>
     <w:p>
       <w:pPr>
         <w:pStyle w:val="Normal"/>
-        <w:rPr/>
-      </w:pPr>
-      <w:r>
-        <w:rPr/>
+        <w:rPr>
+          <w:sz w:val="22"/>
+          <w:szCs w:val="22"/>
+        </w:rPr>
+      </w:pPr>
+      <w:r>
+        <w:rPr>
+          <w:sz w:val="22"/>
+          <w:szCs w:val="22"/>
+        </w:rPr>
         <w:t>The connector starts slowly because authorization, transfers, reconciliation, correction, and conflict resolution take time. Its long-horizon claim-quality advantage emerges from recurring evidence, accumulated provenance, repeated comparison, and shorter exposure to inaccurate claims. It becomes the most frequent default-weight winner at 1,000 and 2,000 days, but remains costly, generates conflicts, and never Pareto-dominates current supervision. The 80.5% cross-horizon reversal rate therefore supports conditional comparison: rankings depend on horizon, participation, evidence quality, administrative capacity, discounting, costs, and normative objectives.</w:t>
       </w:r>
     </w:p>
     <w:p>
       <w:pPr>
         <w:pStyle w:val="Normal"/>
-        <w:rPr/>
-      </w:pPr>
-      <w:r>
-        <w:rPr/>
+        <w:rPr>
+          <w:sz w:val="22"/>
+          <w:szCs w:val="22"/>
+        </w:rPr>
+      </w:pPr>
+      <w:r>
+        <w:rPr>
+          <w:sz w:val="22"/>
+          <w:szCs w:val="22"/>
+        </w:rPr>
         <w:t>The model is a computational laboratory rather than a policy recommendation engine, empirical forecast, or causal evaluation. Its conclusions concern mechanisms under explicit EXPERIMENT and STYLIZATION assumptions. Future work should calibrate behavioral, enforcement, measurement, and cost channels; extend facility and value-chain representation; increase stochastic replication; and develop country-specific legal modules. Financial-market extensions should first repair the price-impact diagnostic and would require a separately pre-registered, information-safe own-share-price feedback channel if market discipline became the research question.</w:t>
       </w:r>
     </w:p>
@@ -10492,23 +10866,121 @@
     <w:p>
       <w:pPr>
         <w:pStyle w:val="Normal"/>
-        <w:rPr/>
-      </w:pPr>
-      <w:r>
-        <w:rPr/>
+        <w:rPr>
+          <w:sz w:val="22"/>
+          <w:szCs w:val="22"/>
+        </w:rPr>
+      </w:pPr>
+      <w:r>
+        <w:rPr>
+          <w:sz w:val="22"/>
+          <w:szCs w:val="22"/>
+        </w:rPr>
         <w:t>The complete model, parameter registry, tests, run-level outputs, manifests, figures, and reproducibility instructions are contained in the attached repository. The archival provenance package in provenance/global_lhs_2026-07-15/ documents the global LHS campaign's recorded code version, 1645f3589408503894c7e8f44a92ffe382a9a5b4+dirty, together with the documented base commit, a partially reconstructed candidate source snapshot, execution configuration, recoverable environment information, limitations, and SHA-256 checksums. It preserves the original outputs unchanged but does not claim recovery of the original dirty worktree or bitwise reproducibility.</w:t>
-      </w:r>
-      <w:r>
-        <w:br w:type="page"/>
       </w:r>
     </w:p>
     <w:p>
       <w:pPr>
-        <w:pStyle w:val="Heading1"/>
+        <w:pStyle w:val="Normal"/>
+        <w:rPr>
+          <w:sz w:val="22"/>
+          <w:szCs w:val="22"/>
+        </w:rPr>
+      </w:pPr>
+      <w:r>
+        <w:rPr>
+          <w:sz w:val="22"/>
+          <w:szCs w:val="22"/>
+        </w:rPr>
+        <w:t>Replication materials are available at:</w:t>
+      </w:r>
+    </w:p>
+    <w:p>
+      <w:pPr>
+        <w:pStyle w:val="Normal"/>
         <w:rPr/>
       </w:pPr>
-      <w:r>
+      <w:hyperlink r:id="rId5">
+        <w:r>
+          <w:rPr>
+            <w:rStyle w:val="Hyperlink"/>
+            <w:sz w:val="22"/>
+            <w:szCs w:val="22"/>
+          </w:rPr>
+          <w:t>https://github.com/francescoromano1407-stack/Financial-market-simulation</w:t>
+        </w:r>
+      </w:hyperlink>
+    </w:p>
+    <w:p>
+      <w:pPr>
+        <w:pStyle w:val="Normal"/>
         <w:rPr/>
+      </w:pPr>
+      <w:r>
+        <w:rPr/>
+      </w:r>
+    </w:p>
+    <w:p>
+      <w:pPr>
+        <w:pStyle w:val="Normal"/>
+        <w:jc w:val="start"/>
+        <w:rPr/>
+      </w:pPr>
+      <w:r>
+        <w:rPr>
+          <w:b/>
+          <w:bCs/>
+          <w:sz w:val="30"/>
+          <w:szCs w:val="30"/>
+        </w:rPr>
+        <w:t>Generative AI Disclosure</w:t>
+      </w:r>
+    </w:p>
+    <w:p>
+      <w:pPr>
+        <w:pStyle w:val="Normal"/>
+        <w:jc w:val="start"/>
+        <w:rPr>
+          <w:sz w:val="22"/>
+          <w:szCs w:val="22"/>
+        </w:rPr>
+      </w:pPr>
+      <w:r>
+        <w:rPr>
+          <w:sz w:val="22"/>
+          <w:szCs w:val="22"/>
+        </w:rPr>
+        <w:t>Generative-AI tools were used to assist with language editing, clarity, organization of manuscript text, and preparation of selected code and repository materials. The author designed the research question and model, determined the assumptions, reviewed and verified the manuscript and references, executed and checked the computational analyses, and retains sole responsibility for all content, results, interpretations, and conclusions. Generative AI was not listed as an author and did not independently produce the study’s simulations, analyses, or conclusions. Candidate literature was identified with AI assistance and independently verified before inclusion.</w:t>
+      </w:r>
+    </w:p>
+    <w:p>
+      <w:pPr>
+        <w:pStyle w:val="Normal"/>
+        <w:jc w:val="start"/>
+        <w:rPr/>
+      </w:pPr>
+      <w:r>
+        <w:rPr/>
+      </w:r>
+    </w:p>
+    <w:p>
+      <w:pPr>
+        <w:pStyle w:val="Normal"/>
+        <w:jc w:val="start"/>
+        <w:rPr>
+          <w:b/>
+          <w:bCs/>
+          <w:sz w:val="30"/>
+          <w:szCs w:val="30"/>
+        </w:rPr>
+      </w:pPr>
+      <w:r>
+        <w:rPr>
+          <w:b/>
+          <w:bCs/>
+          <w:sz w:val="30"/>
+          <w:szCs w:val="30"/>
+        </w:rPr>
         <w:t>References</w:t>
       </w:r>
     </w:p>
@@ -10810,16 +11282,6 @@
         <w:rPr/>
       </w:pPr>
       <w:r>
-        <w:rPr/>
-        <w:t>Korobow, A., Johnson, C., and Axtell, R. L. (2007). An agent-based model of tax compliance with social networks. National Tax Journal, 60(3), 589-610. https://doi.org/10.17310/ntj.2007.3.16</w:t>
-      </w:r>
-    </w:p>
-    <w:p>
-      <w:pPr>
-        <w:pStyle w:val="Reference"/>
-        <w:rPr/>
-      </w:pPr>
-      <w:r>
         <w:rPr>
           <w:rFonts w:eastAsia="Times New Roman"/>
           <w:color w:val="1D2733"/>
@@ -10921,51 +11383,11 @@
     <w:p>
       <w:pPr>
         <w:pStyle w:val="Reference"/>
-        <w:rPr/>
-      </w:pPr>
-      <w:r>
-        <w:rPr/>
-        <w:t>Partnership for Carbon Transparency. (2025a). PACT Methodology V3: Methodology for calculating and exchanging cradle-to-gate product carbon footprints. https://www.carbon-transparency.org/resources/pact-methodology-v3</w:t>
-      </w:r>
-    </w:p>
-    <w:p>
-      <w:pPr>
-        <w:pStyle w:val="Reference"/>
-        <w:rPr/>
-      </w:pPr>
-      <w:r>
-        <w:rPr/>
-        <w:t>Partnership for Carbon Transparency. (2025b). Technical specifications for PCF data exchange, Version 3.0.3. https://docs.carbon-transparency.org/data-exchange-protocol/latest/</w:t>
-      </w:r>
-    </w:p>
-    <w:p>
-      <w:pPr>
-        <w:pStyle w:val="Reference"/>
-        <w:rPr/>
-      </w:pPr>
-      <w:r>
         <w:rPr>
           <w:rFonts w:eastAsia="Times New Roman"/>
           <w:color w:val="1D2733"/>
           <w:sz w:val="19"/>
         </w:rPr>
-        <w:t>Parguel, B., Benoit-Moreau, F., and Larceneux, F. (2011). How sustainability ratings might deter greenwashing: A closer look at ethical corporate communication. Journal of Business Ethics, 102(1), 15-28. https://doi.org/10.1007/s10551-011-0901-2</w:t>
-      </w:r>
-    </w:p>
-    <w:p>
-      <w:pPr>
-        <w:pStyle w:val="Reference"/>
-        <w:rPr/>
-      </w:pPr>
-      <w:r>
-        <w:rPr/>
-        <w:t>Pianosi, F., Beven, K., Freer, J., Hall, J. W., Rougier, J., Stephenson, D. B., and Wagener, T. (2016). Sensitivity analysis of environmental models: A systematic review with practical workflow. Environmental Modelling &amp; Software, 79, 214-232. https://doi.org/10.1016/j.envsoft.2016.02.008</w:t>
-      </w:r>
-    </w:p>
-    <w:p>
-      <w:pPr>
-        <w:pStyle w:val="Reference"/>
-        <w:rPr/>
       </w:pPr>
       <w:r>
         <w:rPr>
@@ -10973,8 +11395,19 @@
           <w:color w:val="1D2733"/>
           <w:sz w:val="19"/>
         </w:rPr>
-        <w:t>Seele, P., and Gatti, L. (2017). Greenwashing revisited: In search of a typology and accusation-based definition incorporating legitimacy strategies. Business Strategy and the Environment, 26(2), 239-252. https://doi.org/10.1002/bse.1912</w:t>
-      </w:r>
+        <w:t xml:space="preserve">Parguel, B., Benoit-Moreau, F., and Larceneux, F. (2011). How sustainability ratings might deter greenwashing: A closer look at ethical corporate communication. Journal of Business Ethics, 102(1), 15-28. </w:t>
+      </w:r>
+      <w:hyperlink r:id="rId6">
+        <w:r>
+          <w:rPr>
+            <w:rStyle w:val="Hyperlink"/>
+            <w:rFonts w:eastAsia="Times New Roman"/>
+            <w:color w:val="1D2733"/>
+            <w:sz w:val="19"/>
+          </w:rPr>
+          <w:t>https://doi.org/10.1007/s10551-011-0901-2</w:t>
+        </w:r>
+      </w:hyperlink>
     </w:p>
     <w:p>
       <w:pPr>
@@ -10982,20 +11415,73 @@
         <w:rPr/>
       </w:pPr>
       <w:r>
+        <w:rPr/>
+        <w:t>Partnership for Carbon Transparency. (2025a). PACT Methodology V3: Methodology for calculating and exchanging cradle-to-gate product carbon footprints. https://www.carbon-transparency.org/resources/pact-methodology-v3</w:t>
+      </w:r>
+    </w:p>
+    <w:p>
+      <w:pPr>
+        <w:pStyle w:val="Reference"/>
         <w:rPr>
           <w:rFonts w:eastAsia="Times New Roman"/>
           <w:color w:val="1D2733"/>
           <w:sz w:val="19"/>
         </w:rPr>
-        <w:t>Tesfatsion, L. (2006). Agent-based computational economics: A constructive approach to economic theory. In L. Tesfatsion and K. L. Judd (Eds.), Handbook of Computational Economics, Volume 2 (pp. 831-880). Elsevier. https://doi.org/10.1016/S1574-0021(05)02016-2</w:t>
-      </w:r>
-      <w:r>
-        <w:br w:type="page"/>
+      </w:pPr>
+      <w:r>
+        <w:rPr>
+          <w:rFonts w:eastAsia="Times New Roman"/>
+          <w:color w:val="1D2733"/>
+          <w:sz w:val="19"/>
+        </w:rPr>
+        <w:t>Partnership for Carbon Transparency. (2025b). Technical specifications for PCF data exchange, Version 3.0.3. https://docs.carbon-transparency.org/data-exchange-protocol/latest/</w:t>
       </w:r>
     </w:p>
     <w:p>
       <w:pPr>
+        <w:pStyle w:val="Reference"/>
+        <w:rPr/>
+      </w:pPr>
+      <w:r>
+        <w:rPr/>
+        <w:t>Pianosi, F., Beven, K., Freer, J., Hall, J. W., Rougier, J., Stephenson, D. B., and Wagener, T. (2016). Sensitivity analysis of environmental models: A systematic review with practical workflow. Environmental Modelling &amp; Software, 79, 214-232. https://doi.org/10.1016/j.envsoft.2016.02.008</w:t>
+      </w:r>
+    </w:p>
+    <w:p>
+      <w:pPr>
+        <w:pStyle w:val="Reference"/>
+        <w:rPr/>
+      </w:pPr>
+      <w:r>
+        <w:rPr>
+          <w:rFonts w:eastAsia="Times New Roman"/>
+          <w:color w:val="1D2733"/>
+          <w:sz w:val="19"/>
+        </w:rPr>
+        <w:t>Seele, P., and Gatti, L. (2017). Greenwashing revisited: In search of a typology and accusation-based definition incorporating legitimacy strategies. Business Strategy and the Environment, 26(2), 239-252. https://doi.org/10.1002/bse.1912</w:t>
+      </w:r>
+    </w:p>
+    <w:p>
+      <w:pPr>
+        <w:pStyle w:val="Reference"/>
+        <w:rPr/>
+      </w:pPr>
+      <w:r>
+        <w:rPr>
+          <w:rFonts w:eastAsia="Times New Roman"/>
+          <w:color w:val="1D2733"/>
+          <w:sz w:val="19"/>
+        </w:rPr>
+        <w:t>Tesfatsion, L. (2006). Agent-based computational economics: A constructive approach to economic theory. In L. Tesfatsion and K. L. Judd (Eds.), Handbook of Computational Economics, Volume 2 (pp. 831-880). Elsevier. https://doi.org/10.1016/S1574-0021(05)02016-2</w:t>
+      </w:r>
+      <w:r>
+        <w:br w:type="page"/>
+      </w:r>
+    </w:p>
+    <w:p>
+      <w:pPr>
         <w:pStyle w:val="Heading1"/>
+        <w:spacing w:before="0" w:after="140"/>
         <w:rPr/>
       </w:pPr>
       <w:r>
@@ -11060,8 +11546,8 @@
       </w:tblPr>
       <w:tblGrid>
         <w:gridCol w:w="1520"/>
-        <w:gridCol w:w="3179"/>
-        <w:gridCol w:w="1821"/>
+        <w:gridCol w:w="3175"/>
+        <w:gridCol w:w="1825"/>
         <w:gridCol w:w="2840"/>
       </w:tblGrid>
       <w:tr>
@@ -11101,7 +11587,7 @@
         </w:tc>
         <w:tc>
           <w:tcPr>
-            <w:tcW w:w="3179" w:type="dxa"/>
+            <w:tcW w:w="3175" w:type="dxa"/>
             <w:tcBorders>
               <w:top w:val="single" w:sz="4" w:space="0" w:color="D4DCE6"/>
               <w:start w:val="single" w:sz="4" w:space="0" w:color="D4DCE6"/>
@@ -11131,7 +11617,7 @@
         </w:tc>
         <w:tc>
           <w:tcPr>
-            <w:tcW w:w="1821" w:type="dxa"/>
+            <w:tcW w:w="1825" w:type="dxa"/>
             <w:tcBorders>
               <w:top w:val="single" w:sz="4" w:space="0" w:color="D4DCE6"/>
               <w:start w:val="single" w:sz="4" w:space="0" w:color="D4DCE6"/>
@@ -11225,7 +11711,7 @@
         </w:tc>
         <w:tc>
           <w:tcPr>
-            <w:tcW w:w="3179" w:type="dxa"/>
+            <w:tcW w:w="3175" w:type="dxa"/>
             <w:tcBorders>
               <w:top w:val="single" w:sz="4" w:space="0" w:color="D4DCE6"/>
               <w:start w:val="single" w:sz="4" w:space="0" w:color="D4DCE6"/>
@@ -11254,7 +11740,7 @@
         </w:tc>
         <w:tc>
           <w:tcPr>
-            <w:tcW w:w="1821" w:type="dxa"/>
+            <w:tcW w:w="1825" w:type="dxa"/>
             <w:tcBorders>
               <w:top w:val="single" w:sz="4" w:space="0" w:color="D4DCE6"/>
               <w:start w:val="single" w:sz="4" w:space="0" w:color="D4DCE6"/>
@@ -11347,7 +11833,7 @@
         </w:tc>
         <w:tc>
           <w:tcPr>
-            <w:tcW w:w="3179" w:type="dxa"/>
+            <w:tcW w:w="3175" w:type="dxa"/>
             <w:tcBorders>
               <w:top w:val="single" w:sz="4" w:space="0" w:color="D4DCE6"/>
               <w:start w:val="single" w:sz="4" w:space="0" w:color="D4DCE6"/>
@@ -11377,7 +11863,7 @@
         </w:tc>
         <w:tc>
           <w:tcPr>
-            <w:tcW w:w="1821" w:type="dxa"/>
+            <w:tcW w:w="1825" w:type="dxa"/>
             <w:tcBorders>
               <w:top w:val="single" w:sz="4" w:space="0" w:color="D4DCE6"/>
               <w:start w:val="single" w:sz="4" w:space="0" w:color="D4DCE6"/>
@@ -11471,7 +11957,7 @@
         </w:tc>
         <w:tc>
           <w:tcPr>
-            <w:tcW w:w="3179" w:type="dxa"/>
+            <w:tcW w:w="3175" w:type="dxa"/>
             <w:tcBorders>
               <w:top w:val="single" w:sz="4" w:space="0" w:color="D4DCE6"/>
               <w:start w:val="single" w:sz="4" w:space="0" w:color="D4DCE6"/>
@@ -11500,7 +11986,7 @@
         </w:tc>
         <w:tc>
           <w:tcPr>
-            <w:tcW w:w="1821" w:type="dxa"/>
+            <w:tcW w:w="1825" w:type="dxa"/>
             <w:tcBorders>
               <w:top w:val="single" w:sz="4" w:space="0" w:color="D4DCE6"/>
               <w:start w:val="single" w:sz="4" w:space="0" w:color="D4DCE6"/>
@@ -11593,7 +12079,7 @@
         </w:tc>
         <w:tc>
           <w:tcPr>
-            <w:tcW w:w="3179" w:type="dxa"/>
+            <w:tcW w:w="3175" w:type="dxa"/>
             <w:tcBorders>
               <w:top w:val="single" w:sz="4" w:space="0" w:color="D4DCE6"/>
               <w:start w:val="single" w:sz="4" w:space="0" w:color="D4DCE6"/>
@@ -11623,7 +12109,7 @@
         </w:tc>
         <w:tc>
           <w:tcPr>
-            <w:tcW w:w="1821" w:type="dxa"/>
+            <w:tcW w:w="1825" w:type="dxa"/>
             <w:tcBorders>
               <w:top w:val="single" w:sz="4" w:space="0" w:color="D4DCE6"/>
               <w:start w:val="single" w:sz="4" w:space="0" w:color="D4DCE6"/>
@@ -11717,7 +12203,7 @@
         </w:tc>
         <w:tc>
           <w:tcPr>
-            <w:tcW w:w="3179" w:type="dxa"/>
+            <w:tcW w:w="3175" w:type="dxa"/>
             <w:tcBorders>
               <w:top w:val="single" w:sz="4" w:space="0" w:color="D4DCE6"/>
               <w:start w:val="single" w:sz="4" w:space="0" w:color="D4DCE6"/>
@@ -11746,7 +12232,7 @@
         </w:tc>
         <w:tc>
           <w:tcPr>
-            <w:tcW w:w="1821" w:type="dxa"/>
+            <w:tcW w:w="1825" w:type="dxa"/>
             <w:tcBorders>
               <w:top w:val="single" w:sz="4" w:space="0" w:color="D4DCE6"/>
               <w:start w:val="single" w:sz="4" w:space="0" w:color="D4DCE6"/>
@@ -11839,7 +12325,7 @@
         </w:tc>
         <w:tc>
           <w:tcPr>
-            <w:tcW w:w="3179" w:type="dxa"/>
+            <w:tcW w:w="3175" w:type="dxa"/>
             <w:tcBorders>
               <w:top w:val="single" w:sz="4" w:space="0" w:color="D4DCE6"/>
               <w:start w:val="single" w:sz="4" w:space="0" w:color="D4DCE6"/>
@@ -11869,7 +12355,7 @@
         </w:tc>
         <w:tc>
           <w:tcPr>
-            <w:tcW w:w="1821" w:type="dxa"/>
+            <w:tcW w:w="1825" w:type="dxa"/>
             <w:tcBorders>
               <w:top w:val="single" w:sz="4" w:space="0" w:color="D4DCE6"/>
               <w:start w:val="single" w:sz="4" w:space="0" w:color="D4DCE6"/>
@@ -11963,7 +12449,7 @@
         </w:tc>
         <w:tc>
           <w:tcPr>
-            <w:tcW w:w="3179" w:type="dxa"/>
+            <w:tcW w:w="3175" w:type="dxa"/>
             <w:tcBorders>
               <w:top w:val="single" w:sz="4" w:space="0" w:color="D4DCE6"/>
               <w:start w:val="single" w:sz="4" w:space="0" w:color="D4DCE6"/>
@@ -11992,7 +12478,7 @@
         </w:tc>
         <w:tc>
           <w:tcPr>
-            <w:tcW w:w="1821" w:type="dxa"/>
+            <w:tcW w:w="1825" w:type="dxa"/>
             <w:tcBorders>
               <w:top w:val="single" w:sz="4" w:space="0" w:color="D4DCE6"/>
               <w:start w:val="single" w:sz="4" w:space="0" w:color="D4DCE6"/>
@@ -12085,7 +12571,7 @@
         </w:tc>
         <w:tc>
           <w:tcPr>
-            <w:tcW w:w="3179" w:type="dxa"/>
+            <w:tcW w:w="3175" w:type="dxa"/>
             <w:tcBorders>
               <w:top w:val="single" w:sz="4" w:space="0" w:color="D4DCE6"/>
               <w:start w:val="single" w:sz="4" w:space="0" w:color="D4DCE6"/>
@@ -12115,7 +12601,7 @@
         </w:tc>
         <w:tc>
           <w:tcPr>
-            <w:tcW w:w="1821" w:type="dxa"/>
+            <w:tcW w:w="1825" w:type="dxa"/>
             <w:tcBorders>
               <w:top w:val="single" w:sz="4" w:space="0" w:color="D4DCE6"/>
               <w:start w:val="single" w:sz="4" w:space="0" w:color="D4DCE6"/>
@@ -12497,12 +12983,12 @@
       </w:r>
     </w:p>
     <w:sectPr>
-      <w:headerReference w:type="even" r:id="rId5"/>
-      <w:headerReference w:type="default" r:id="rId6"/>
-      <w:headerReference w:type="first" r:id="rId7"/>
-      <w:footerReference w:type="even" r:id="rId8"/>
-      <w:footerReference w:type="default" r:id="rId9"/>
-      <w:footerReference w:type="first" r:id="rId10"/>
+      <w:headerReference w:type="even" r:id="rId7"/>
+      <w:headerReference w:type="default" r:id="rId8"/>
+      <w:headerReference w:type="first" r:id="rId9"/>
+      <w:footerReference w:type="even" r:id="rId10"/>
+      <w:footerReference w:type="default" r:id="rId11"/>
+      <w:footerReference w:type="first" r:id="rId12"/>
       <w:type w:val="nextPage"/>
       <w:pgSz w:w="12240" w:h="15840"/>
       <w:pgMar w:left="1440" w:right="1440" w:gutter="0" w:header="605" w:top="1325" w:footer="605" w:bottom="1267"/>
@@ -12576,7 +13062,7 @@
         <w:color w:val="1D2733"/>
         <w:sz w:val="22"/>
       </w:rPr>
-      <w:t>26</w:t>
+      <w:t>27</w:t>
     </w:r>
     <w:r>
       <w:rPr>
@@ -12686,6 +13172,7 @@
         </w:tabs>
         <w:ind w:start="1080" w:hanging="360"/>
       </w:pPr>
+      <w:rPr/>
     </w:lvl>
     <w:lvl w:ilvl="2">
       <w:start w:val="1"/>
@@ -12698,6 +13185,7 @@
         </w:tabs>
         <w:ind w:start="1440" w:hanging="360"/>
       </w:pPr>
+      <w:rPr/>
     </w:lvl>
     <w:lvl w:ilvl="3">
       <w:start w:val="1"/>
@@ -12710,6 +13198,7 @@
         </w:tabs>
         <w:ind w:start="1800" w:hanging="360"/>
       </w:pPr>
+      <w:rPr/>
     </w:lvl>
     <w:lvl w:ilvl="4">
       <w:start w:val="1"/>
@@ -12722,6 +13211,7 @@
         </w:tabs>
         <w:ind w:start="2160" w:hanging="360"/>
       </w:pPr>
+      <w:rPr/>
     </w:lvl>
     <w:lvl w:ilvl="5">
       <w:start w:val="1"/>
@@ -12734,6 +13224,7 @@
         </w:tabs>
         <w:ind w:start="2520" w:hanging="360"/>
       </w:pPr>
+      <w:rPr/>
     </w:lvl>
     <w:lvl w:ilvl="6">
       <w:start w:val="1"/>
@@ -12746,6 +13237,7 @@
         </w:tabs>
         <w:ind w:start="2880" w:hanging="360"/>
       </w:pPr>
+      <w:rPr/>
     </w:lvl>
     <w:lvl w:ilvl="7">
       <w:start w:val="1"/>
@@ -12758,6 +13250,7 @@
         </w:tabs>
         <w:ind w:start="3240" w:hanging="360"/>
       </w:pPr>
+      <w:rPr/>
     </w:lvl>
     <w:lvl w:ilvl="8">
       <w:start w:val="1"/>
@@ -12770,6 +13263,7 @@
         </w:tabs>
         <w:ind w:start="3600" w:hanging="360"/>
       </w:pPr>
+      <w:rPr/>
     </w:lvl>
   </w:abstractNum>
   <w:abstractNum w:abstractNumId="2">
@@ -12799,6 +13293,7 @@
         </w:tabs>
         <w:ind w:start="1080" w:hanging="360"/>
       </w:pPr>
+      <w:rPr/>
     </w:lvl>
     <w:lvl w:ilvl="2">
       <w:start w:val="1"/>
@@ -12811,6 +13306,7 @@
         </w:tabs>
         <w:ind w:start="1440" w:hanging="360"/>
       </w:pPr>
+      <w:rPr/>
     </w:lvl>
     <w:lvl w:ilvl="3">
       <w:start w:val="1"/>
@@ -12823,6 +13319,7 @@
         </w:tabs>
         <w:ind w:start="1800" w:hanging="360"/>
       </w:pPr>
+      <w:rPr/>
     </w:lvl>
     <w:lvl w:ilvl="4">
       <w:start w:val="1"/>
@@ -12835,6 +13332,7 @@
         </w:tabs>
         <w:ind w:start="2160" w:hanging="360"/>
       </w:pPr>
+      <w:rPr/>
     </w:lvl>
     <w:lvl w:ilvl="5">
       <w:start w:val="1"/>
@@ -12847,6 +13345,7 @@
         </w:tabs>
         <w:ind w:start="2520" w:hanging="360"/>
       </w:pPr>
+      <w:rPr/>
     </w:lvl>
     <w:lvl w:ilvl="6">
       <w:start w:val="1"/>
@@ -12859,6 +13358,7 @@
         </w:tabs>
         <w:ind w:start="2880" w:hanging="360"/>
       </w:pPr>
+      <w:rPr/>
     </w:lvl>
     <w:lvl w:ilvl="7">
       <w:start w:val="1"/>
@@ -12871,6 +13371,7 @@
         </w:tabs>
         <w:ind w:start="3240" w:hanging="360"/>
       </w:pPr>
+      <w:rPr/>
     </w:lvl>
     <w:lvl w:ilvl="8">
       <w:start w:val="1"/>
@@ -12883,6 +13384,7 @@
         </w:tabs>
         <w:ind w:start="3600" w:hanging="360"/>
       </w:pPr>
+      <w:rPr/>
     </w:lvl>
   </w:abstractNum>
   <w:abstractNum w:abstractNumId="3">
@@ -12912,6 +13414,7 @@
         </w:tabs>
         <w:ind w:start="1080" w:hanging="360"/>
       </w:pPr>
+      <w:rPr/>
     </w:lvl>
     <w:lvl w:ilvl="2">
       <w:start w:val="1"/>
@@ -12924,6 +13427,7 @@
         </w:tabs>
         <w:ind w:start="1440" w:hanging="360"/>
       </w:pPr>
+      <w:rPr/>
     </w:lvl>
     <w:lvl w:ilvl="3">
       <w:start w:val="1"/>
@@ -12936,6 +13440,7 @@
         </w:tabs>
         <w:ind w:start="1800" w:hanging="360"/>
       </w:pPr>
+      <w:rPr/>
     </w:lvl>
     <w:lvl w:ilvl="4">
       <w:start w:val="1"/>
@@ -12948,6 +13453,7 @@
         </w:tabs>
         <w:ind w:start="2160" w:hanging="360"/>
       </w:pPr>
+      <w:rPr/>
     </w:lvl>
     <w:lvl w:ilvl="5">
       <w:start w:val="1"/>
@@ -12960,6 +13466,7 @@
         </w:tabs>
         <w:ind w:start="2520" w:hanging="360"/>
       </w:pPr>
+      <w:rPr/>
     </w:lvl>
     <w:lvl w:ilvl="6">
       <w:start w:val="1"/>
@@ -12972,6 +13479,7 @@
         </w:tabs>
         <w:ind w:start="2880" w:hanging="360"/>
       </w:pPr>
+      <w:rPr/>
     </w:lvl>
     <w:lvl w:ilvl="7">
       <w:start w:val="1"/>
@@ -12984,6 +13492,7 @@
         </w:tabs>
         <w:ind w:start="3240" w:hanging="360"/>
       </w:pPr>
+      <w:rPr/>
     </w:lvl>
     <w:lvl w:ilvl="8">
       <w:start w:val="1"/>
@@ -12996,6 +13505,7 @@
         </w:tabs>
         <w:ind w:start="3600" w:hanging="360"/>
       </w:pPr>
+      <w:rPr/>
     </w:lvl>
   </w:abstractNum>
   <w:abstractNum w:abstractNumId="4">
@@ -13023,6 +13533,7 @@
         </w:tabs>
         <w:ind w:start="1080" w:hanging="360"/>
       </w:pPr>
+      <w:rPr/>
     </w:lvl>
     <w:lvl w:ilvl="2">
       <w:start w:val="1"/>
@@ -13035,6 +13546,7 @@
         </w:tabs>
         <w:ind w:start="1440" w:hanging="360"/>
       </w:pPr>
+      <w:rPr/>
     </w:lvl>
     <w:lvl w:ilvl="3">
       <w:start w:val="1"/>
@@ -13047,6 +13559,7 @@
         </w:tabs>
         <w:ind w:start="1800" w:hanging="360"/>
       </w:pPr>
+      <w:rPr/>
     </w:lvl>
     <w:lvl w:ilvl="4">
       <w:start w:val="1"/>
@@ -13059,6 +13572,7 @@
         </w:tabs>
         <w:ind w:start="2160" w:hanging="360"/>
       </w:pPr>
+      <w:rPr/>
     </w:lvl>
     <w:lvl w:ilvl="5">
       <w:start w:val="1"/>
@@ -13071,6 +13585,7 @@
         </w:tabs>
         <w:ind w:start="2520" w:hanging="360"/>
       </w:pPr>
+      <w:rPr/>
     </w:lvl>
     <w:lvl w:ilvl="6">
       <w:start w:val="1"/>
@@ -13083,6 +13598,7 @@
         </w:tabs>
         <w:ind w:start="2880" w:hanging="360"/>
       </w:pPr>
+      <w:rPr/>
     </w:lvl>
     <w:lvl w:ilvl="7">
       <w:start w:val="1"/>
@@ -13095,6 +13611,7 @@
         </w:tabs>
         <w:ind w:start="3240" w:hanging="360"/>
       </w:pPr>
+      <w:rPr/>
     </w:lvl>
     <w:lvl w:ilvl="8">
       <w:start w:val="1"/>
@@ -13107,6 +13624,7 @@
         </w:tabs>
         <w:ind w:start="3600" w:hanging="360"/>
       </w:pPr>
+      <w:rPr/>
     </w:lvl>
   </w:abstractNum>
   <w:abstractNum w:abstractNumId="5">
@@ -13134,6 +13652,7 @@
         </w:tabs>
         <w:ind w:start="1080" w:hanging="360"/>
       </w:pPr>
+      <w:rPr/>
     </w:lvl>
     <w:lvl w:ilvl="2">
       <w:start w:val="1"/>
@@ -13146,6 +13665,7 @@
         </w:tabs>
         <w:ind w:start="1440" w:hanging="360"/>
       </w:pPr>
+      <w:rPr/>
     </w:lvl>
     <w:lvl w:ilvl="3">
       <w:start w:val="1"/>
@@ -13158,6 +13678,7 @@
         </w:tabs>
         <w:ind w:start="1800" w:hanging="360"/>
       </w:pPr>
+      <w:rPr/>
     </w:lvl>
     <w:lvl w:ilvl="4">
       <w:start w:val="1"/>
@@ -13170,6 +13691,7 @@
         </w:tabs>
         <w:ind w:start="2160" w:hanging="360"/>
       </w:pPr>
+      <w:rPr/>
     </w:lvl>
     <w:lvl w:ilvl="5">
       <w:start w:val="1"/>
@@ -13182,6 +13704,7 @@
         </w:tabs>
         <w:ind w:start="2520" w:hanging="360"/>
       </w:pPr>
+      <w:rPr/>
     </w:lvl>
     <w:lvl w:ilvl="6">
       <w:start w:val="1"/>
@@ -13194,6 +13717,7 @@
         </w:tabs>
         <w:ind w:start="2880" w:hanging="360"/>
       </w:pPr>
+      <w:rPr/>
     </w:lvl>
     <w:lvl w:ilvl="7">
       <w:start w:val="1"/>
@@ -13206,6 +13730,7 @@
         </w:tabs>
         <w:ind w:start="3240" w:hanging="360"/>
       </w:pPr>
+      <w:rPr/>
     </w:lvl>
     <w:lvl w:ilvl="8">
       <w:start w:val="1"/>
@@ -13218,6 +13743,7 @@
         </w:tabs>
         <w:ind w:start="3600" w:hanging="360"/>
       </w:pPr>
+      <w:rPr/>
     </w:lvl>
   </w:abstractNum>
   <w:abstractNum w:abstractNumId="6">
@@ -13245,6 +13771,7 @@
         </w:tabs>
         <w:ind w:start="1080" w:hanging="360"/>
       </w:pPr>
+      <w:rPr/>
     </w:lvl>
     <w:lvl w:ilvl="2">
       <w:start w:val="1"/>
@@ -13257,6 +13784,7 @@
         </w:tabs>
         <w:ind w:start="1440" w:hanging="360"/>
       </w:pPr>
+      <w:rPr/>
     </w:lvl>
     <w:lvl w:ilvl="3">
       <w:start w:val="1"/>
@@ -13269,6 +13797,7 @@
         </w:tabs>
         <w:ind w:start="1800" w:hanging="360"/>
       </w:pPr>
+      <w:rPr/>
     </w:lvl>
     <w:lvl w:ilvl="4">
       <w:start w:val="1"/>
@@ -13281,6 +13810,7 @@
         </w:tabs>
         <w:ind w:start="2160" w:hanging="360"/>
       </w:pPr>
+      <w:rPr/>
     </w:lvl>
     <w:lvl w:ilvl="5">
       <w:start w:val="1"/>
@@ -13293,6 +13823,7 @@
         </w:tabs>
         <w:ind w:start="2520" w:hanging="360"/>
       </w:pPr>
+      <w:rPr/>
     </w:lvl>
     <w:lvl w:ilvl="6">
       <w:start w:val="1"/>
@@ -13305,6 +13836,7 @@
         </w:tabs>
         <w:ind w:start="2880" w:hanging="360"/>
       </w:pPr>
+      <w:rPr/>
     </w:lvl>
     <w:lvl w:ilvl="7">
       <w:start w:val="1"/>
@@ -13317,6 +13849,7 @@
         </w:tabs>
         <w:ind w:start="3240" w:hanging="360"/>
       </w:pPr>
+      <w:rPr/>
     </w:lvl>
     <w:lvl w:ilvl="8">
       <w:start w:val="1"/>
@@ -13329,6 +13862,7 @@
         </w:tabs>
         <w:ind w:start="3600" w:hanging="360"/>
       </w:pPr>
+      <w:rPr/>
     </w:lvl>
   </w:abstractNum>
   <w:abstractNum w:abstractNumId="7">
@@ -13479,7 +14013,7 @@
   <w:docDefaults>
     <w:rPrDefault>
       <w:rPr>
-        <w:rFonts w:ascii="Cambria" w:hAnsi="Cambria" w:eastAsia="ＭＳ 明朝" w:cs="" w:asciiTheme="minorHAnsi" w:cstheme="minorBidi" w:eastAsiaTheme="minorEastAsia" w:hAnsiTheme="minorHAnsi"/>
+        <w:rFonts w:ascii="Cambria" w:hAnsi="Cambria" w:eastAsia="" w:cs="" w:asciiTheme="minorHAnsi" w:cstheme="minorBidi" w:eastAsiaTheme="minorEastAsia" w:hAnsiTheme="minorHAnsi"/>
         <w:sz w:val="22"/>
         <w:szCs w:val="22"/>
         <w:lang w:val="en-US" w:eastAsia="en-US" w:bidi="ar-SA"/>
@@ -13636,6 +14170,7 @@
     <w:rsid w:val="00fc693f"/>
     <w:pPr>
       <w:widowControl/>
+      <w:suppressAutoHyphens w:val="true"/>
       <w:bidi w:val="0"/>
       <w:spacing w:lineRule="auto" w:line="276" w:before="0" w:after="120"/>
       <w:jc w:val="both"/>
@@ -13664,7 +14199,7 @@
       <w:outlineLvl w:val="0"/>
     </w:pPr>
     <w:rPr>
-      <w:rFonts w:ascii="Calibri" w:hAnsi="Calibri" w:eastAsia="ＭＳ ゴシック" w:cs="" w:asciiTheme="majorHAnsi" w:cstheme="majorBidi" w:eastAsiaTheme="majorEastAsia" w:hAnsiTheme="majorHAnsi"/>
+      <w:rFonts w:ascii="Calibri" w:hAnsi="Calibri" w:eastAsia="" w:cs="" w:asciiTheme="majorHAnsi" w:cstheme="majorBidi" w:eastAsiaTheme="majorEastAsia" w:hAnsiTheme="majorHAnsi"/>
       <w:b/>
       <w:bCs/>
       <w:color w:val="17365D"/>
@@ -13688,7 +14223,7 @@
       <w:outlineLvl w:val="1"/>
     </w:pPr>
     <w:rPr>
-      <w:rFonts w:ascii="Calibri" w:hAnsi="Calibri" w:eastAsia="ＭＳ ゴシック" w:cs="" w:asciiTheme="majorHAnsi" w:cstheme="majorBidi" w:eastAsiaTheme="majorEastAsia" w:hAnsiTheme="majorHAnsi"/>
+      <w:rFonts w:ascii="Calibri" w:hAnsi="Calibri" w:eastAsia="" w:cs="" w:asciiTheme="majorHAnsi" w:cstheme="majorBidi" w:eastAsiaTheme="majorEastAsia" w:hAnsiTheme="majorHAnsi"/>
       <w:b/>
       <w:bCs/>
       <w:color w:val="315F8C"/>
@@ -13712,7 +14247,7 @@
       <w:outlineLvl w:val="2"/>
     </w:pPr>
     <w:rPr>
-      <w:rFonts w:ascii="Calibri" w:hAnsi="Calibri" w:eastAsia="ＭＳ ゴシック" w:cs="" w:asciiTheme="majorHAnsi" w:cstheme="majorBidi" w:eastAsiaTheme="majorEastAsia" w:hAnsiTheme="majorHAnsi"/>
+      <w:rFonts w:ascii="Calibri" w:hAnsi="Calibri" w:eastAsia="" w:cs="" w:asciiTheme="majorHAnsi" w:cstheme="majorBidi" w:eastAsiaTheme="majorEastAsia" w:hAnsiTheme="majorHAnsi"/>
       <w:b/>
       <w:bCs/>
       <w:color w:val="17365D"/>
@@ -13736,7 +14271,7 @@
       <w:outlineLvl w:val="3"/>
     </w:pPr>
     <w:rPr>
-      <w:rFonts w:ascii="Calibri" w:hAnsi="Calibri" w:eastAsia="ＭＳ ゴシック" w:cs="" w:asciiTheme="majorHAnsi" w:cstheme="majorBidi" w:eastAsiaTheme="majorEastAsia" w:hAnsiTheme="majorHAnsi"/>
+      <w:rFonts w:ascii="Calibri" w:hAnsi="Calibri" w:eastAsia="" w:cs="" w:asciiTheme="majorHAnsi" w:cstheme="majorBidi" w:eastAsiaTheme="majorEastAsia" w:hAnsiTheme="majorHAnsi"/>
       <w:b/>
       <w:bCs/>
       <w:i/>
@@ -13761,7 +14296,7 @@
       <w:outlineLvl w:val="4"/>
     </w:pPr>
     <w:rPr>
-      <w:rFonts w:ascii="Calibri" w:hAnsi="Calibri" w:eastAsia="ＭＳ ゴシック" w:cs="" w:asciiTheme="majorHAnsi" w:cstheme="majorBidi" w:eastAsiaTheme="majorEastAsia" w:hAnsiTheme="majorHAnsi"/>
+      <w:rFonts w:ascii="Calibri" w:hAnsi="Calibri" w:eastAsia="" w:cs="" w:asciiTheme="majorHAnsi" w:cstheme="majorBidi" w:eastAsiaTheme="majorEastAsia" w:hAnsiTheme="majorHAnsi"/>
       <w:color w:themeColor="accent1" w:themeShade="7f" w:val="243F60"/>
     </w:rPr>
   </w:style>
@@ -13782,7 +14317,7 @@
       <w:outlineLvl w:val="5"/>
     </w:pPr>
     <w:rPr>
-      <w:rFonts w:ascii="Calibri" w:hAnsi="Calibri" w:eastAsia="ＭＳ ゴシック" w:cs="" w:asciiTheme="majorHAnsi" w:cstheme="majorBidi" w:eastAsiaTheme="majorEastAsia" w:hAnsiTheme="majorHAnsi"/>
+      <w:rFonts w:ascii="Calibri" w:hAnsi="Calibri" w:eastAsia="" w:cs="" w:asciiTheme="majorHAnsi" w:cstheme="majorBidi" w:eastAsiaTheme="majorEastAsia" w:hAnsiTheme="majorHAnsi"/>
       <w:i/>
       <w:iCs/>
       <w:color w:themeColor="accent1" w:themeShade="7f" w:val="243F60"/>
@@ -13805,7 +14340,7 @@
       <w:outlineLvl w:val="6"/>
     </w:pPr>
     <w:rPr>
-      <w:rFonts w:ascii="Calibri" w:hAnsi="Calibri" w:eastAsia="ＭＳ ゴシック" w:cs="" w:asciiTheme="majorHAnsi" w:cstheme="majorBidi" w:eastAsiaTheme="majorEastAsia" w:hAnsiTheme="majorHAnsi"/>
+      <w:rFonts w:ascii="Calibri" w:hAnsi="Calibri" w:eastAsia="" w:cs="" w:asciiTheme="majorHAnsi" w:cstheme="majorBidi" w:eastAsiaTheme="majorEastAsia" w:hAnsiTheme="majorHAnsi"/>
       <w:i/>
       <w:iCs/>
       <w:color w:themeColor="text1" w:themeTint="bf" w:val="404040"/>
@@ -13828,7 +14363,7 @@
       <w:outlineLvl w:val="7"/>
     </w:pPr>
     <w:rPr>
-      <w:rFonts w:ascii="Calibri" w:hAnsi="Calibri" w:eastAsia="ＭＳ ゴシック" w:cs="" w:asciiTheme="majorHAnsi" w:cstheme="majorBidi" w:eastAsiaTheme="majorEastAsia" w:hAnsiTheme="majorHAnsi"/>
+      <w:rFonts w:ascii="Calibri" w:hAnsi="Calibri" w:eastAsia="" w:cs="" w:asciiTheme="majorHAnsi" w:cstheme="majorBidi" w:eastAsiaTheme="majorEastAsia" w:hAnsiTheme="majorHAnsi"/>
       <w:color w:themeColor="accent1" w:val="4F81BD"/>
       <w:sz w:val="20"/>
       <w:szCs w:val="20"/>
@@ -13851,7 +14386,7 @@
       <w:outlineLvl w:val="8"/>
     </w:pPr>
     <w:rPr>
-      <w:rFonts w:ascii="Calibri" w:hAnsi="Calibri" w:eastAsia="ＭＳ ゴシック" w:cs="" w:asciiTheme="majorHAnsi" w:cstheme="majorBidi" w:eastAsiaTheme="majorEastAsia" w:hAnsiTheme="majorHAnsi"/>
+      <w:rFonts w:ascii="Calibri" w:hAnsi="Calibri" w:eastAsia="" w:cs="" w:asciiTheme="majorHAnsi" w:cstheme="majorBidi" w:eastAsiaTheme="majorEastAsia" w:hAnsiTheme="majorHAnsi"/>
       <w:i/>
       <w:iCs/>
       <w:color w:themeColor="text1" w:themeTint="bf" w:val="404040"/>
@@ -13890,7 +14425,7 @@
     <w:qFormat/>
     <w:rsid w:val="00fc693f"/>
     <w:rPr>
-      <w:rFonts w:ascii="Calibri" w:hAnsi="Calibri" w:eastAsia="ＭＳ ゴシック" w:cs="" w:asciiTheme="majorHAnsi" w:cstheme="majorBidi" w:eastAsiaTheme="majorEastAsia" w:hAnsiTheme="majorHAnsi"/>
+      <w:rFonts w:ascii="Calibri" w:hAnsi="Calibri" w:eastAsia="" w:cs="" w:asciiTheme="majorHAnsi" w:cstheme="majorBidi" w:eastAsiaTheme="majorEastAsia" w:hAnsiTheme="majorHAnsi"/>
       <w:b/>
       <w:bCs/>
       <w:color w:themeColor="accent1" w:themeShade="bf" w:val="365F91"/>
@@ -13905,7 +14440,7 @@
     <w:qFormat/>
     <w:rsid w:val="00fc693f"/>
     <w:rPr>
-      <w:rFonts w:ascii="Calibri" w:hAnsi="Calibri" w:eastAsia="ＭＳ ゴシック" w:cs="" w:asciiTheme="majorHAnsi" w:cstheme="majorBidi" w:eastAsiaTheme="majorEastAsia" w:hAnsiTheme="majorHAnsi"/>
+      <w:rFonts w:ascii="Calibri" w:hAnsi="Calibri" w:eastAsia="" w:cs="" w:asciiTheme="majorHAnsi" w:cstheme="majorBidi" w:eastAsiaTheme="majorEastAsia" w:hAnsiTheme="majorHAnsi"/>
       <w:b/>
       <w:bCs/>
       <w:color w:themeColor="accent1" w:val="4F81BD"/>
@@ -13920,7 +14455,7 @@
     <w:qFormat/>
     <w:rsid w:val="00fc693f"/>
     <w:rPr>
-      <w:rFonts w:ascii="Calibri" w:hAnsi="Calibri" w:eastAsia="ＭＳ ゴシック" w:cs="" w:asciiTheme="majorHAnsi" w:cstheme="majorBidi" w:eastAsiaTheme="majorEastAsia" w:hAnsiTheme="majorHAnsi"/>
+      <w:rFonts w:ascii="Calibri" w:hAnsi="Calibri" w:eastAsia="" w:cs="" w:asciiTheme="majorHAnsi" w:cstheme="majorBidi" w:eastAsiaTheme="majorEastAsia" w:hAnsiTheme="majorHAnsi"/>
       <w:b/>
       <w:bCs/>
       <w:color w:themeColor="accent1" w:val="4F81BD"/>
@@ -13933,7 +14468,7 @@
     <w:qFormat/>
     <w:rsid w:val="00fc693f"/>
     <w:rPr>
-      <w:rFonts w:ascii="Calibri" w:hAnsi="Calibri" w:eastAsia="ＭＳ ゴシック" w:cs="" w:asciiTheme="majorHAnsi" w:cstheme="majorBidi" w:eastAsiaTheme="majorEastAsia" w:hAnsiTheme="majorHAnsi"/>
+      <w:rFonts w:ascii="Calibri" w:hAnsi="Calibri" w:eastAsia="" w:cs="" w:asciiTheme="majorHAnsi" w:cstheme="majorBidi" w:eastAsiaTheme="majorEastAsia" w:hAnsiTheme="majorHAnsi"/>
       <w:color w:themeColor="text2" w:themeShade="bf" w:val="17365D"/>
       <w:spacing w:val="5"/>
       <w:kern w:val="2"/>
@@ -13948,7 +14483,7 @@
     <w:qFormat/>
     <w:rsid w:val="00fc693f"/>
     <w:rPr>
-      <w:rFonts w:ascii="Calibri" w:hAnsi="Calibri" w:eastAsia="ＭＳ ゴシック" w:cs="" w:asciiTheme="majorHAnsi" w:cstheme="majorBidi" w:eastAsiaTheme="majorEastAsia" w:hAnsiTheme="majorHAnsi"/>
+      <w:rFonts w:ascii="Calibri" w:hAnsi="Calibri" w:eastAsia="" w:cs="" w:asciiTheme="majorHAnsi" w:cstheme="majorBidi" w:eastAsiaTheme="majorEastAsia" w:hAnsiTheme="majorHAnsi"/>
       <w:i/>
       <w:iCs/>
       <w:color w:themeColor="accent1" w:val="4F81BD"/>
@@ -14020,7 +14555,7 @@
     <w:qFormat/>
     <w:rsid w:val="00fc693f"/>
     <w:rPr>
-      <w:rFonts w:ascii="Calibri" w:hAnsi="Calibri" w:eastAsia="ＭＳ ゴシック" w:cs="" w:asciiTheme="majorHAnsi" w:cstheme="majorBidi" w:eastAsiaTheme="majorEastAsia" w:hAnsiTheme="majorHAnsi"/>
+      <w:rFonts w:ascii="Calibri" w:hAnsi="Calibri" w:eastAsia="" w:cs="" w:asciiTheme="majorHAnsi" w:cstheme="majorBidi" w:eastAsiaTheme="majorEastAsia" w:hAnsiTheme="majorHAnsi"/>
       <w:b/>
       <w:bCs/>
       <w:i/>
@@ -14036,7 +14571,7 @@
     <w:qFormat/>
     <w:rsid w:val="00fc693f"/>
     <w:rPr>
-      <w:rFonts w:ascii="Calibri" w:hAnsi="Calibri" w:eastAsia="ＭＳ ゴシック" w:cs="" w:asciiTheme="majorHAnsi" w:cstheme="majorBidi" w:eastAsiaTheme="majorEastAsia" w:hAnsiTheme="majorHAnsi"/>
+      <w:rFonts w:ascii="Calibri" w:hAnsi="Calibri" w:eastAsia="" w:cs="" w:asciiTheme="majorHAnsi" w:cstheme="majorBidi" w:eastAsiaTheme="majorEastAsia" w:hAnsiTheme="majorHAnsi"/>
       <w:color w:themeColor="accent1" w:themeShade="7f" w:val="243F60"/>
     </w:rPr>
   </w:style>
@@ -14048,7 +14583,7 @@
     <w:qFormat/>
     <w:rsid w:val="00fc693f"/>
     <w:rPr>
-      <w:rFonts w:ascii="Calibri" w:hAnsi="Calibri" w:eastAsia="ＭＳ ゴシック" w:cs="" w:asciiTheme="majorHAnsi" w:cstheme="majorBidi" w:eastAsiaTheme="majorEastAsia" w:hAnsiTheme="majorHAnsi"/>
+      <w:rFonts w:ascii="Calibri" w:hAnsi="Calibri" w:eastAsia="" w:cs="" w:asciiTheme="majorHAnsi" w:cstheme="majorBidi" w:eastAsiaTheme="majorEastAsia" w:hAnsiTheme="majorHAnsi"/>
       <w:i/>
       <w:iCs/>
       <w:color w:themeColor="accent1" w:themeShade="7f" w:val="243F60"/>
@@ -14062,7 +14597,7 @@
     <w:qFormat/>
     <w:rsid w:val="00fc693f"/>
     <w:rPr>
-      <w:rFonts w:ascii="Calibri" w:hAnsi="Calibri" w:eastAsia="ＭＳ ゴシック" w:cs="" w:asciiTheme="majorHAnsi" w:cstheme="majorBidi" w:eastAsiaTheme="majorEastAsia" w:hAnsiTheme="majorHAnsi"/>
+      <w:rFonts w:ascii="Calibri" w:hAnsi="Calibri" w:eastAsia="" w:cs="" w:asciiTheme="majorHAnsi" w:cstheme="majorBidi" w:eastAsiaTheme="majorEastAsia" w:hAnsiTheme="majorHAnsi"/>
       <w:i/>
       <w:iCs/>
       <w:color w:themeColor="text1" w:themeTint="bf" w:val="404040"/>
@@ -14076,7 +14611,7 @@
     <w:qFormat/>
     <w:rsid w:val="00fc693f"/>
     <w:rPr>
-      <w:rFonts w:ascii="Calibri" w:hAnsi="Calibri" w:eastAsia="ＭＳ ゴシック" w:cs="" w:asciiTheme="majorHAnsi" w:cstheme="majorBidi" w:eastAsiaTheme="majorEastAsia" w:hAnsiTheme="majorHAnsi"/>
+      <w:rFonts w:ascii="Calibri" w:hAnsi="Calibri" w:eastAsia="" w:cs="" w:asciiTheme="majorHAnsi" w:cstheme="majorBidi" w:eastAsiaTheme="majorEastAsia" w:hAnsiTheme="majorHAnsi"/>
       <w:color w:themeColor="accent1" w:val="4F81BD"/>
       <w:sz w:val="20"/>
       <w:szCs w:val="20"/>
@@ -14090,7 +14625,7 @@
     <w:qFormat/>
     <w:rsid w:val="00fc693f"/>
     <w:rPr>
-      <w:rFonts w:ascii="Calibri" w:hAnsi="Calibri" w:eastAsia="ＭＳ ゴシック" w:cs="" w:asciiTheme="majorHAnsi" w:cstheme="majorBidi" w:eastAsiaTheme="majorEastAsia" w:hAnsiTheme="majorHAnsi"/>
+      <w:rFonts w:ascii="Calibri" w:hAnsi="Calibri" w:eastAsia="" w:cs="" w:asciiTheme="majorHAnsi" w:cstheme="majorBidi" w:eastAsiaTheme="majorEastAsia" w:hAnsiTheme="majorHAnsi"/>
       <w:i/>
       <w:iCs/>
       <w:color w:themeColor="text1" w:themeTint="bf" w:val="404040"/>
@@ -14201,6 +14736,13 @@
       <w:spacing w:val="5"/>
     </w:rPr>
   </w:style>
+  <w:style w:type="character" w:styleId="Hyperlink">
+    <w:name w:val="Hyperlink"/>
+    <w:rPr>
+      <w:color w:val="000080"/>
+      <w:u w:val="single"/>
+    </w:rPr>
+  </w:style>
   <w:style w:type="paragraph" w:styleId="Titolo">
     <w:name w:val="Titolo"/>
     <w:basedOn w:val="Normal"/>
@@ -14273,8 +14815,41 @@
       <w:rFonts w:cs="Arial"/>
     </w:rPr>
   </w:style>
+  <w:style w:type="paragraph" w:styleId="Titolouser">
+    <w:name w:val="Titolo (user)"/>
+    <w:basedOn w:val="Normal"/>
+    <w:next w:val="BodyText"/>
+    <w:qFormat/>
+    <w:pPr>
+      <w:keepNext w:val="true"/>
+      <w:spacing w:before="240" w:after="120"/>
+    </w:pPr>
+    <w:rPr>
+      <w:rFonts w:ascii="Liberation Sans" w:hAnsi="Liberation Sans" w:eastAsia="Microsoft YaHei" w:cs="Arial"/>
+      <w:sz w:val="28"/>
+      <w:szCs w:val="28"/>
+    </w:rPr>
+  </w:style>
+  <w:style w:type="paragraph" w:styleId="Indiceuser">
+    <w:name w:val="Indice (user)"/>
+    <w:basedOn w:val="Normal"/>
+    <w:qFormat/>
+    <w:pPr>
+      <w:suppressLineNumbers/>
+    </w:pPr>
+    <w:rPr>
+      <w:rFonts w:cs="Arial"/>
+    </w:rPr>
+  </w:style>
   <w:style w:type="paragraph" w:styleId="Intestazioneepidipagina">
     <w:name w:val="Intestazione e piè di pagina"/>
+    <w:basedOn w:val="Normal"/>
+    <w:qFormat/>
+    <w:pPr/>
+    <w:rPr/>
+  </w:style>
+  <w:style w:type="paragraph" w:styleId="Intestazioneepidipaginauser">
+    <w:name w:val="Intestazione e piè di pagina (user)"/>
     <w:basedOn w:val="Normal"/>
     <w:qFormat/>
     <w:pPr/>
@@ -14321,12 +14896,13 @@
     <w:rsid w:val="00fc693f"/>
     <w:pPr>
       <w:widowControl/>
+      <w:suppressAutoHyphens w:val="true"/>
       <w:bidi w:val="0"/>
       <w:spacing w:lineRule="auto" w:line="240" w:before="0" w:after="0"/>
       <w:jc w:val="start"/>
     </w:pPr>
     <w:rPr>
-      <w:rFonts w:ascii="Cambria" w:hAnsi="Cambria" w:eastAsia="ＭＳ 明朝" w:cs="" w:asciiTheme="minorHAnsi" w:cstheme="minorBidi" w:eastAsiaTheme="minorEastAsia" w:hAnsiTheme="minorHAnsi"/>
+      <w:rFonts w:ascii="Cambria" w:hAnsi="Cambria" w:eastAsia="" w:cs="" w:asciiTheme="minorHAnsi" w:cstheme="minorBidi" w:eastAsiaTheme="minorEastAsia" w:hAnsiTheme="minorHAnsi"/>
       <w:color w:val="auto"/>
       <w:kern w:val="0"/>
       <w:sz w:val="22"/>
@@ -14350,7 +14926,7 @@
       <w:contextualSpacing/>
     </w:pPr>
     <w:rPr>
-      <w:rFonts w:ascii="Calibri" w:hAnsi="Calibri" w:eastAsia="ＭＳ ゴシック" w:cs="" w:asciiTheme="majorHAnsi" w:cstheme="majorBidi" w:eastAsiaTheme="majorEastAsia" w:hAnsiTheme="majorHAnsi"/>
+      <w:rFonts w:ascii="Calibri" w:hAnsi="Calibri" w:eastAsia="" w:cs="" w:asciiTheme="majorHAnsi" w:cstheme="majorBidi" w:eastAsiaTheme="majorEastAsia" w:hAnsiTheme="majorHAnsi"/>
       <w:color w:themeColor="text2" w:themeShade="bf" w:val="17365D"/>
       <w:spacing w:val="5"/>
       <w:kern w:val="2"/>
@@ -14368,7 +14944,7 @@
     <w:rsid w:val="00fc693f"/>
     <w:pPr/>
     <w:rPr>
-      <w:rFonts w:ascii="Calibri" w:hAnsi="Calibri" w:eastAsia="ＭＳ ゴシック" w:cs="" w:asciiTheme="majorHAnsi" w:cstheme="majorBidi" w:eastAsiaTheme="majorEastAsia" w:hAnsiTheme="majorHAnsi"/>
+      <w:rFonts w:ascii="Calibri" w:hAnsi="Calibri" w:eastAsia="" w:cs="" w:asciiTheme="majorHAnsi" w:cstheme="majorBidi" w:eastAsiaTheme="majorEastAsia" w:hAnsiTheme="majorHAnsi"/>
       <w:i/>
       <w:iCs/>
       <w:color w:themeColor="accent1" w:val="4F81BD"/>
@@ -14601,12 +15177,13 @@
         <w:tab w:val="left" w:pos="3456" w:leader="none"/>
         <w:tab w:val="left" w:pos="4032" w:leader="none"/>
       </w:tabs>
+      <w:suppressAutoHyphens w:val="true"/>
       <w:bidi w:val="0"/>
       <w:spacing w:lineRule="auto" w:line="276" w:before="0" w:after="200"/>
       <w:jc w:val="start"/>
     </w:pPr>
     <w:rPr>
-      <w:rFonts w:ascii="Courier" w:hAnsi="Courier" w:eastAsia="ＭＳ 明朝" w:cs="" w:cstheme="minorBidi" w:eastAsiaTheme="minorEastAsia"/>
+      <w:rFonts w:ascii="Courier" w:hAnsi="Courier" w:eastAsia="" w:cs="" w:cstheme="minorBidi" w:eastAsiaTheme="minorEastAsia"/>
       <w:color w:val="auto"/>
       <w:kern w:val="0"/>
       <w:sz w:val="20"/>
@@ -14678,12 +15255,13 @@
     <w:pPr>
       <w:keepLines/>
       <w:widowControl/>
+      <w:suppressAutoHyphens w:val="true"/>
       <w:bidi w:val="0"/>
       <w:spacing w:lineRule="auto" w:line="276" w:before="60" w:after="140"/>
       <w:jc w:val="start"/>
     </w:pPr>
     <w:rPr>
-      <w:rFonts w:ascii="Cambria" w:hAnsi="Cambria" w:eastAsia="ＭＳ 明朝" w:cs="" w:asciiTheme="minorHAnsi" w:cstheme="minorBidi" w:eastAsiaTheme="minorEastAsia" w:hAnsiTheme="minorHAnsi"/>
+      <w:rFonts w:ascii="Cambria" w:hAnsi="Cambria" w:eastAsia="" w:cs="" w:asciiTheme="minorHAnsi" w:cstheme="minorBidi" w:eastAsiaTheme="minorEastAsia" w:hAnsiTheme="minorHAnsi"/>
       <w:color w:val="auto"/>
       <w:kern w:val="0"/>
       <w:sz w:val="22"/>
@@ -14696,12 +15274,13 @@
     <w:qFormat/>
     <w:pPr>
       <w:widowControl/>
+      <w:suppressAutoHyphens w:val="true"/>
       <w:bidi w:val="0"/>
       <w:spacing w:lineRule="auto" w:line="240" w:before="40" w:after="80"/>
       <w:jc w:val="start"/>
     </w:pPr>
     <w:rPr>
-      <w:rFonts w:ascii="Cambria" w:hAnsi="Cambria" w:eastAsia="ＭＳ 明朝" w:cs="" w:asciiTheme="minorHAnsi" w:cstheme="minorBidi" w:eastAsiaTheme="minorEastAsia" w:hAnsiTheme="minorHAnsi"/>
+      <w:rFonts w:ascii="Cambria" w:hAnsi="Cambria" w:eastAsia="" w:cs="" w:asciiTheme="minorHAnsi" w:cstheme="minorBidi" w:eastAsiaTheme="minorEastAsia" w:hAnsiTheme="minorHAnsi"/>
       <w:color w:val="auto"/>
       <w:kern w:val="0"/>
       <w:sz w:val="22"/>
@@ -14714,13 +15293,14 @@
     <w:qFormat/>
     <w:pPr>
       <w:widowControl/>
+      <w:suppressAutoHyphens w:val="true"/>
       <w:bidi w:val="0"/>
       <w:spacing w:lineRule="auto" w:line="240" w:before="0" w:after="80"/>
       <w:ind w:hanging="432" w:start="432"/>
       <w:jc w:val="start"/>
     </w:pPr>
     <w:rPr>
-      <w:rFonts w:ascii="Times New Roman" w:hAnsi="Times New Roman" w:eastAsia="ＭＳ 明朝" w:cs="" w:cstheme="minorBidi" w:eastAsiaTheme="minorEastAsia"/>
+      <w:rFonts w:ascii="Times New Roman" w:hAnsi="Times New Roman" w:eastAsia="" w:cs="" w:cstheme="minorBidi" w:eastAsiaTheme="minorEastAsia"/>
       <w:color w:val="auto"/>
       <w:kern w:val="0"/>
       <w:sz w:val="19"/>
@@ -17860,7 +18440,6 @@
       <w:pPr>
         <w:spacing w:before="0" w:after="0" w:line="240" w:lineRule="auto"/>
       </w:pPr>
-      <w:rPr/>
       <w:tblPr/>
       <w:tcPr>
         <w:tcBorders>
@@ -18006,7 +18585,6 @@
       <w:pPr>
         <w:spacing w:before="0" w:after="0" w:line="240" w:lineRule="auto"/>
       </w:pPr>
-      <w:rPr/>
       <w:tblPr/>
       <w:tcPr>
         <w:tcBorders>
@@ -18152,7 +18730,6 @@
       <w:pPr>
         <w:spacing w:before="0" w:after="0" w:line="240" w:lineRule="auto"/>
       </w:pPr>
-      <w:rPr/>
       <w:tblPr/>
       <w:tcPr>
         <w:tcBorders>
@@ -18298,7 +18875,6 @@
       <w:pPr>
         <w:spacing w:before="0" w:after="0" w:line="240" w:lineRule="auto"/>
       </w:pPr>
-      <w:rPr/>
       <w:tblPr/>
       <w:tcPr>
         <w:tcBorders>
@@ -18444,7 +19020,6 @@
       <w:pPr>
         <w:spacing w:before="0" w:after="0" w:line="240" w:lineRule="auto"/>
       </w:pPr>
-      <w:rPr/>
       <w:tblPr/>
       <w:tcPr>
         <w:tcBorders>
@@ -18590,7 +19165,6 @@
       <w:pPr>
         <w:spacing w:before="0" w:after="0" w:line="240" w:lineRule="auto"/>
       </w:pPr>
-      <w:rPr/>
       <w:tblPr/>
       <w:tcPr>
         <w:tcBorders>
@@ -18736,7 +19310,6 @@
       <w:pPr>
         <w:spacing w:before="0" w:after="0" w:line="240" w:lineRule="auto"/>
       </w:pPr>
-      <w:rPr/>
       <w:tblPr/>
       <w:tcPr>
         <w:tcBorders>

</xml_diff>

<commit_message>
Clarify generative AI disclosure
</commit_message>
<xml_diff>
--- a/Economy_financial/Francesco_Romano_EU_Environmental_Claims_ABM_Paper_revised.docx
+++ b/Economy_financial/Francesco_Romano_EU_Environmental_Claims_ABM_Paper_revised.docx
@@ -386,8 +386,8 @@
       </w:tblPr>
       <w:tblGrid>
         <w:gridCol w:w="1500"/>
-        <w:gridCol w:w="3795"/>
-        <w:gridCol w:w="1665"/>
+        <w:gridCol w:w="3794"/>
+        <w:gridCol w:w="1666"/>
         <w:gridCol w:w="2400"/>
       </w:tblGrid>
       <w:tr>
@@ -427,7 +427,7 @@
         </w:tc>
         <w:tc>
           <w:tcPr>
-            <w:tcW w:w="3795" w:type="dxa"/>
+            <w:tcW w:w="3794" w:type="dxa"/>
             <w:tcBorders>
               <w:top w:val="single" w:sz="4" w:space="0" w:color="D4DCE6"/>
               <w:start w:val="single" w:sz="4" w:space="0" w:color="D4DCE6"/>
@@ -457,7 +457,7 @@
         </w:tc>
         <w:tc>
           <w:tcPr>
-            <w:tcW w:w="1665" w:type="dxa"/>
+            <w:tcW w:w="1666" w:type="dxa"/>
             <w:tcBorders>
               <w:top w:val="single" w:sz="4" w:space="0" w:color="D4DCE6"/>
               <w:start w:val="single" w:sz="4" w:space="0" w:color="D4DCE6"/>
@@ -551,7 +551,7 @@
         </w:tc>
         <w:tc>
           <w:tcPr>
-            <w:tcW w:w="3795" w:type="dxa"/>
+            <w:tcW w:w="3794" w:type="dxa"/>
             <w:tcBorders>
               <w:top w:val="single" w:sz="4" w:space="0" w:color="D4DCE6"/>
               <w:start w:val="single" w:sz="4" w:space="0" w:color="D4DCE6"/>
@@ -580,7 +580,7 @@
         </w:tc>
         <w:tc>
           <w:tcPr>
-            <w:tcW w:w="1665" w:type="dxa"/>
+            <w:tcW w:w="1666" w:type="dxa"/>
             <w:tcBorders>
               <w:top w:val="single" w:sz="4" w:space="0" w:color="D4DCE6"/>
               <w:start w:val="single" w:sz="4" w:space="0" w:color="D4DCE6"/>
@@ -673,7 +673,7 @@
         </w:tc>
         <w:tc>
           <w:tcPr>
-            <w:tcW w:w="3795" w:type="dxa"/>
+            <w:tcW w:w="3794" w:type="dxa"/>
             <w:tcBorders>
               <w:top w:val="single" w:sz="4" w:space="0" w:color="D4DCE6"/>
               <w:start w:val="single" w:sz="4" w:space="0" w:color="D4DCE6"/>
@@ -703,7 +703,7 @@
         </w:tc>
         <w:tc>
           <w:tcPr>
-            <w:tcW w:w="1665" w:type="dxa"/>
+            <w:tcW w:w="1666" w:type="dxa"/>
             <w:tcBorders>
               <w:top w:val="single" w:sz="4" w:space="0" w:color="D4DCE6"/>
               <w:start w:val="single" w:sz="4" w:space="0" w:color="D4DCE6"/>
@@ -797,7 +797,7 @@
         </w:tc>
         <w:tc>
           <w:tcPr>
-            <w:tcW w:w="3795" w:type="dxa"/>
+            <w:tcW w:w="3794" w:type="dxa"/>
             <w:tcBorders>
               <w:top w:val="single" w:sz="4" w:space="0" w:color="D4DCE6"/>
               <w:start w:val="single" w:sz="4" w:space="0" w:color="D4DCE6"/>
@@ -826,7 +826,7 @@
         </w:tc>
         <w:tc>
           <w:tcPr>
-            <w:tcW w:w="1665" w:type="dxa"/>
+            <w:tcW w:w="1666" w:type="dxa"/>
             <w:tcBorders>
               <w:top w:val="single" w:sz="4" w:space="0" w:color="D4DCE6"/>
               <w:start w:val="single" w:sz="4" w:space="0" w:color="D4DCE6"/>
@@ -919,7 +919,7 @@
         </w:tc>
         <w:tc>
           <w:tcPr>
-            <w:tcW w:w="3795" w:type="dxa"/>
+            <w:tcW w:w="3794" w:type="dxa"/>
             <w:tcBorders>
               <w:top w:val="single" w:sz="4" w:space="0" w:color="D4DCE6"/>
               <w:start w:val="single" w:sz="4" w:space="0" w:color="D4DCE6"/>
@@ -949,7 +949,7 @@
         </w:tc>
         <w:tc>
           <w:tcPr>
-            <w:tcW w:w="1665" w:type="dxa"/>
+            <w:tcW w:w="1666" w:type="dxa"/>
             <w:tcBorders>
               <w:top w:val="single" w:sz="4" w:space="0" w:color="D4DCE6"/>
               <w:start w:val="single" w:sz="4" w:space="0" w:color="D4DCE6"/>
@@ -1043,7 +1043,7 @@
         </w:tc>
         <w:tc>
           <w:tcPr>
-            <w:tcW w:w="3795" w:type="dxa"/>
+            <w:tcW w:w="3794" w:type="dxa"/>
             <w:tcBorders>
               <w:top w:val="single" w:sz="4" w:space="0" w:color="D4DCE6"/>
               <w:start w:val="single" w:sz="4" w:space="0" w:color="D4DCE6"/>
@@ -1072,7 +1072,7 @@
         </w:tc>
         <w:tc>
           <w:tcPr>
-            <w:tcW w:w="1665" w:type="dxa"/>
+            <w:tcW w:w="1666" w:type="dxa"/>
             <w:tcBorders>
               <w:top w:val="single" w:sz="4" w:space="0" w:color="D4DCE6"/>
               <w:start w:val="single" w:sz="4" w:space="0" w:color="D4DCE6"/>
@@ -1169,7 +1169,7 @@
         </w:tc>
         <w:tc>
           <w:tcPr>
-            <w:tcW w:w="3795" w:type="dxa"/>
+            <w:tcW w:w="3794" w:type="dxa"/>
             <w:tcBorders>
               <w:top w:val="single" w:sz="4" w:space="0" w:color="D4DCE6"/>
               <w:start w:val="single" w:sz="4" w:space="0" w:color="D4DCE6"/>
@@ -1199,7 +1199,7 @@
         </w:tc>
         <w:tc>
           <w:tcPr>
-            <w:tcW w:w="1665" w:type="dxa"/>
+            <w:tcW w:w="1666" w:type="dxa"/>
             <w:tcBorders>
               <w:top w:val="single" w:sz="4" w:space="0" w:color="D4DCE6"/>
               <w:start w:val="single" w:sz="4" w:space="0" w:color="D4DCE6"/>
@@ -1297,7 +1297,7 @@
         </w:tc>
         <w:tc>
           <w:tcPr>
-            <w:tcW w:w="3795" w:type="dxa"/>
+            <w:tcW w:w="3794" w:type="dxa"/>
             <w:tcBorders>
               <w:top w:val="single" w:sz="4" w:space="0" w:color="D4DCE6"/>
               <w:start w:val="single" w:sz="4" w:space="0" w:color="D4DCE6"/>
@@ -1326,7 +1326,7 @@
         </w:tc>
         <w:tc>
           <w:tcPr>
-            <w:tcW w:w="1665" w:type="dxa"/>
+            <w:tcW w:w="1666" w:type="dxa"/>
             <w:tcBorders>
               <w:top w:val="single" w:sz="4" w:space="0" w:color="D4DCE6"/>
               <w:start w:val="single" w:sz="4" w:space="0" w:color="D4DCE6"/>
@@ -1419,7 +1419,7 @@
         </w:tc>
         <w:tc>
           <w:tcPr>
-            <w:tcW w:w="3795" w:type="dxa"/>
+            <w:tcW w:w="3794" w:type="dxa"/>
             <w:tcBorders>
               <w:top w:val="single" w:sz="4" w:space="0" w:color="D4DCE6"/>
               <w:start w:val="single" w:sz="4" w:space="0" w:color="D4DCE6"/>
@@ -1449,7 +1449,7 @@
         </w:tc>
         <w:tc>
           <w:tcPr>
-            <w:tcW w:w="1665" w:type="dxa"/>
+            <w:tcW w:w="1666" w:type="dxa"/>
             <w:tcBorders>
               <w:top w:val="single" w:sz="4" w:space="0" w:color="D4DCE6"/>
               <w:start w:val="single" w:sz="4" w:space="0" w:color="D4DCE6"/>
@@ -1862,10 +1862,10 @@
         <w:tblLook w:val="04a0" w:firstRow="1" w:noVBand="1" w:lastRow="0" w:firstColumn="1" w:lastColumn="0" w:noHBand="0"/>
       </w:tblPr>
       <w:tblGrid>
-        <w:gridCol w:w="1245"/>
-        <w:gridCol w:w="1205"/>
-        <w:gridCol w:w="4045"/>
-        <w:gridCol w:w="2865"/>
+        <w:gridCol w:w="1244"/>
+        <w:gridCol w:w="1206"/>
+        <w:gridCol w:w="4044"/>
+        <w:gridCol w:w="2866"/>
       </w:tblGrid>
       <w:tr>
         <w:trPr>
@@ -1874,7 +1874,7 @@
         </w:trPr>
         <w:tc>
           <w:tcPr>
-            <w:tcW w:w="1245" w:type="dxa"/>
+            <w:tcW w:w="1244" w:type="dxa"/>
             <w:tcBorders>
               <w:top w:val="single" w:sz="4" w:space="0" w:color="D4DCE6"/>
               <w:start w:val="single" w:sz="4" w:space="0" w:color="D4DCE6"/>
@@ -1904,7 +1904,7 @@
         </w:tc>
         <w:tc>
           <w:tcPr>
-            <w:tcW w:w="1205" w:type="dxa"/>
+            <w:tcW w:w="1206" w:type="dxa"/>
             <w:tcBorders>
               <w:top w:val="single" w:sz="4" w:space="0" w:color="D4DCE6"/>
               <w:start w:val="single" w:sz="4" w:space="0" w:color="D4DCE6"/>
@@ -1934,7 +1934,7 @@
         </w:tc>
         <w:tc>
           <w:tcPr>
-            <w:tcW w:w="4045" w:type="dxa"/>
+            <w:tcW w:w="4044" w:type="dxa"/>
             <w:tcBorders>
               <w:top w:val="single" w:sz="4" w:space="0" w:color="D4DCE6"/>
               <w:start w:val="single" w:sz="4" w:space="0" w:color="D4DCE6"/>
@@ -1964,7 +1964,7 @@
         </w:tc>
         <w:tc>
           <w:tcPr>
-            <w:tcW w:w="2865" w:type="dxa"/>
+            <w:tcW w:w="2866" w:type="dxa"/>
             <w:tcBorders>
               <w:top w:val="single" w:sz="4" w:space="0" w:color="D4DCE6"/>
               <w:start w:val="single" w:sz="4" w:space="0" w:color="D4DCE6"/>
@@ -1999,7 +1999,7 @@
         </w:trPr>
         <w:tc>
           <w:tcPr>
-            <w:tcW w:w="1245" w:type="dxa"/>
+            <w:tcW w:w="1244" w:type="dxa"/>
             <w:tcBorders>
               <w:top w:val="single" w:sz="4" w:space="0" w:color="D4DCE6"/>
               <w:start w:val="single" w:sz="4" w:space="0" w:color="D4DCE6"/>
@@ -2028,7 +2028,7 @@
         </w:tc>
         <w:tc>
           <w:tcPr>
-            <w:tcW w:w="1205" w:type="dxa"/>
+            <w:tcW w:w="1206" w:type="dxa"/>
             <w:tcBorders>
               <w:top w:val="single" w:sz="4" w:space="0" w:color="D4DCE6"/>
               <w:start w:val="single" w:sz="4" w:space="0" w:color="D4DCE6"/>
@@ -2057,7 +2057,7 @@
         </w:tc>
         <w:tc>
           <w:tcPr>
-            <w:tcW w:w="4045" w:type="dxa"/>
+            <w:tcW w:w="4044" w:type="dxa"/>
             <w:tcBorders>
               <w:top w:val="single" w:sz="4" w:space="0" w:color="D4DCE6"/>
               <w:start w:val="single" w:sz="4" w:space="0" w:color="D4DCE6"/>
@@ -2086,7 +2086,7 @@
         </w:tc>
         <w:tc>
           <w:tcPr>
-            <w:tcW w:w="2865" w:type="dxa"/>
+            <w:tcW w:w="2866" w:type="dxa"/>
             <w:tcBorders>
               <w:top w:val="single" w:sz="4" w:space="0" w:color="D4DCE6"/>
               <w:start w:val="single" w:sz="4" w:space="0" w:color="D4DCE6"/>
@@ -2120,7 +2120,7 @@
         </w:trPr>
         <w:tc>
           <w:tcPr>
-            <w:tcW w:w="1245" w:type="dxa"/>
+            <w:tcW w:w="1244" w:type="dxa"/>
             <w:tcBorders>
               <w:top w:val="single" w:sz="4" w:space="0" w:color="D4DCE6"/>
               <w:start w:val="single" w:sz="4" w:space="0" w:color="D4DCE6"/>
@@ -2150,7 +2150,7 @@
         </w:tc>
         <w:tc>
           <w:tcPr>
-            <w:tcW w:w="1205" w:type="dxa"/>
+            <w:tcW w:w="1206" w:type="dxa"/>
             <w:tcBorders>
               <w:top w:val="single" w:sz="4" w:space="0" w:color="D4DCE6"/>
               <w:start w:val="single" w:sz="4" w:space="0" w:color="D4DCE6"/>
@@ -2180,7 +2180,7 @@
         </w:tc>
         <w:tc>
           <w:tcPr>
-            <w:tcW w:w="4045" w:type="dxa"/>
+            <w:tcW w:w="4044" w:type="dxa"/>
             <w:tcBorders>
               <w:top w:val="single" w:sz="4" w:space="0" w:color="D4DCE6"/>
               <w:start w:val="single" w:sz="4" w:space="0" w:color="D4DCE6"/>
@@ -2210,7 +2210,7 @@
         </w:tc>
         <w:tc>
           <w:tcPr>
-            <w:tcW w:w="2865" w:type="dxa"/>
+            <w:tcW w:w="2866" w:type="dxa"/>
             <w:tcBorders>
               <w:top w:val="single" w:sz="4" w:space="0" w:color="D4DCE6"/>
               <w:start w:val="single" w:sz="4" w:space="0" w:color="D4DCE6"/>
@@ -2245,7 +2245,7 @@
         </w:trPr>
         <w:tc>
           <w:tcPr>
-            <w:tcW w:w="1245" w:type="dxa"/>
+            <w:tcW w:w="1244" w:type="dxa"/>
             <w:tcBorders>
               <w:top w:val="single" w:sz="4" w:space="0" w:color="D4DCE6"/>
               <w:start w:val="single" w:sz="4" w:space="0" w:color="D4DCE6"/>
@@ -2274,7 +2274,7 @@
         </w:tc>
         <w:tc>
           <w:tcPr>
-            <w:tcW w:w="1205" w:type="dxa"/>
+            <w:tcW w:w="1206" w:type="dxa"/>
             <w:tcBorders>
               <w:top w:val="single" w:sz="4" w:space="0" w:color="D4DCE6"/>
               <w:start w:val="single" w:sz="4" w:space="0" w:color="D4DCE6"/>
@@ -2303,7 +2303,7 @@
         </w:tc>
         <w:tc>
           <w:tcPr>
-            <w:tcW w:w="4045" w:type="dxa"/>
+            <w:tcW w:w="4044" w:type="dxa"/>
             <w:tcBorders>
               <w:top w:val="single" w:sz="4" w:space="0" w:color="D4DCE6"/>
               <w:start w:val="single" w:sz="4" w:space="0" w:color="D4DCE6"/>
@@ -2332,7 +2332,7 @@
         </w:tc>
         <w:tc>
           <w:tcPr>
-            <w:tcW w:w="2865" w:type="dxa"/>
+            <w:tcW w:w="2866" w:type="dxa"/>
             <w:tcBorders>
               <w:top w:val="single" w:sz="4" w:space="0" w:color="D4DCE6"/>
               <w:start w:val="single" w:sz="4" w:space="0" w:color="D4DCE6"/>
@@ -2366,7 +2366,7 @@
         </w:trPr>
         <w:tc>
           <w:tcPr>
-            <w:tcW w:w="1245" w:type="dxa"/>
+            <w:tcW w:w="1244" w:type="dxa"/>
             <w:tcBorders>
               <w:top w:val="single" w:sz="4" w:space="0" w:color="D4DCE6"/>
               <w:start w:val="single" w:sz="4" w:space="0" w:color="D4DCE6"/>
@@ -2396,7 +2396,7 @@
         </w:tc>
         <w:tc>
           <w:tcPr>
-            <w:tcW w:w="1205" w:type="dxa"/>
+            <w:tcW w:w="1206" w:type="dxa"/>
             <w:tcBorders>
               <w:top w:val="single" w:sz="4" w:space="0" w:color="D4DCE6"/>
               <w:start w:val="single" w:sz="4" w:space="0" w:color="D4DCE6"/>
@@ -2426,7 +2426,7 @@
         </w:tc>
         <w:tc>
           <w:tcPr>
-            <w:tcW w:w="4045" w:type="dxa"/>
+            <w:tcW w:w="4044" w:type="dxa"/>
             <w:tcBorders>
               <w:top w:val="single" w:sz="4" w:space="0" w:color="D4DCE6"/>
               <w:start w:val="single" w:sz="4" w:space="0" w:color="D4DCE6"/>
@@ -2456,7 +2456,7 @@
         </w:tc>
         <w:tc>
           <w:tcPr>
-            <w:tcW w:w="2865" w:type="dxa"/>
+            <w:tcW w:w="2866" w:type="dxa"/>
             <w:tcBorders>
               <w:top w:val="single" w:sz="4" w:space="0" w:color="D4DCE6"/>
               <w:start w:val="single" w:sz="4" w:space="0" w:color="D4DCE6"/>
@@ -2491,7 +2491,7 @@
         </w:trPr>
         <w:tc>
           <w:tcPr>
-            <w:tcW w:w="1245" w:type="dxa"/>
+            <w:tcW w:w="1244" w:type="dxa"/>
             <w:tcBorders>
               <w:top w:val="single" w:sz="4" w:space="0" w:color="D4DCE6"/>
               <w:start w:val="single" w:sz="4" w:space="0" w:color="D4DCE6"/>
@@ -2520,7 +2520,7 @@
         </w:tc>
         <w:tc>
           <w:tcPr>
-            <w:tcW w:w="1205" w:type="dxa"/>
+            <w:tcW w:w="1206" w:type="dxa"/>
             <w:tcBorders>
               <w:top w:val="single" w:sz="4" w:space="0" w:color="D4DCE6"/>
               <w:start w:val="single" w:sz="4" w:space="0" w:color="D4DCE6"/>
@@ -2549,7 +2549,7 @@
         </w:tc>
         <w:tc>
           <w:tcPr>
-            <w:tcW w:w="4045" w:type="dxa"/>
+            <w:tcW w:w="4044" w:type="dxa"/>
             <w:tcBorders>
               <w:top w:val="single" w:sz="4" w:space="0" w:color="D4DCE6"/>
               <w:start w:val="single" w:sz="4" w:space="0" w:color="D4DCE6"/>
@@ -2578,7 +2578,7 @@
         </w:tc>
         <w:tc>
           <w:tcPr>
-            <w:tcW w:w="2865" w:type="dxa"/>
+            <w:tcW w:w="2866" w:type="dxa"/>
             <w:tcBorders>
               <w:top w:val="single" w:sz="4" w:space="0" w:color="D4DCE6"/>
               <w:start w:val="single" w:sz="4" w:space="0" w:color="D4DCE6"/>
@@ -2612,7 +2612,7 @@
         </w:trPr>
         <w:tc>
           <w:tcPr>
-            <w:tcW w:w="1245" w:type="dxa"/>
+            <w:tcW w:w="1244" w:type="dxa"/>
             <w:tcBorders>
               <w:top w:val="single" w:sz="4" w:space="0" w:color="D4DCE6"/>
               <w:start w:val="single" w:sz="4" w:space="0" w:color="D4DCE6"/>
@@ -2642,7 +2642,7 @@
         </w:tc>
         <w:tc>
           <w:tcPr>
-            <w:tcW w:w="1205" w:type="dxa"/>
+            <w:tcW w:w="1206" w:type="dxa"/>
             <w:tcBorders>
               <w:top w:val="single" w:sz="4" w:space="0" w:color="D4DCE6"/>
               <w:start w:val="single" w:sz="4" w:space="0" w:color="D4DCE6"/>
@@ -2672,7 +2672,7 @@
         </w:tc>
         <w:tc>
           <w:tcPr>
-            <w:tcW w:w="4045" w:type="dxa"/>
+            <w:tcW w:w="4044" w:type="dxa"/>
             <w:tcBorders>
               <w:top w:val="single" w:sz="4" w:space="0" w:color="D4DCE6"/>
               <w:start w:val="single" w:sz="4" w:space="0" w:color="D4DCE6"/>
@@ -2702,7 +2702,7 @@
         </w:tc>
         <w:tc>
           <w:tcPr>
-            <w:tcW w:w="2865" w:type="dxa"/>
+            <w:tcW w:w="2866" w:type="dxa"/>
             <w:tcBorders>
               <w:top w:val="single" w:sz="4" w:space="0" w:color="D4DCE6"/>
               <w:start w:val="single" w:sz="4" w:space="0" w:color="D4DCE6"/>
@@ -2737,7 +2737,7 @@
         </w:trPr>
         <w:tc>
           <w:tcPr>
-            <w:tcW w:w="1245" w:type="dxa"/>
+            <w:tcW w:w="1244" w:type="dxa"/>
             <w:tcBorders>
               <w:top w:val="single" w:sz="4" w:space="0" w:color="D4DCE6"/>
               <w:start w:val="single" w:sz="4" w:space="0" w:color="D4DCE6"/>
@@ -2766,7 +2766,7 @@
         </w:tc>
         <w:tc>
           <w:tcPr>
-            <w:tcW w:w="1205" w:type="dxa"/>
+            <w:tcW w:w="1206" w:type="dxa"/>
             <w:tcBorders>
               <w:top w:val="single" w:sz="4" w:space="0" w:color="D4DCE6"/>
               <w:start w:val="single" w:sz="4" w:space="0" w:color="D4DCE6"/>
@@ -2795,7 +2795,7 @@
         </w:tc>
         <w:tc>
           <w:tcPr>
-            <w:tcW w:w="4045" w:type="dxa"/>
+            <w:tcW w:w="4044" w:type="dxa"/>
             <w:tcBorders>
               <w:top w:val="single" w:sz="4" w:space="0" w:color="D4DCE6"/>
               <w:start w:val="single" w:sz="4" w:space="0" w:color="D4DCE6"/>
@@ -2824,7 +2824,7 @@
         </w:tc>
         <w:tc>
           <w:tcPr>
-            <w:tcW w:w="2865" w:type="dxa"/>
+            <w:tcW w:w="2866" w:type="dxa"/>
             <w:tcBorders>
               <w:top w:val="single" w:sz="4" w:space="0" w:color="D4DCE6"/>
               <w:start w:val="single" w:sz="4" w:space="0" w:color="D4DCE6"/>
@@ -3598,8 +3598,8 @@
         <w:tblLook w:val="04a0" w:firstRow="1" w:noVBand="1" w:lastRow="0" w:firstColumn="1" w:lastColumn="0" w:noHBand="0"/>
       </w:tblPr>
       <w:tblGrid>
-        <w:gridCol w:w="615"/>
-        <w:gridCol w:w="2205"/>
+        <w:gridCol w:w="614"/>
+        <w:gridCol w:w="2206"/>
         <w:gridCol w:w="4536"/>
         <w:gridCol w:w="2004"/>
       </w:tblGrid>
@@ -3610,7 +3610,7 @@
         </w:trPr>
         <w:tc>
           <w:tcPr>
-            <w:tcW w:w="615" w:type="dxa"/>
+            <w:tcW w:w="614" w:type="dxa"/>
             <w:tcBorders>
               <w:top w:val="single" w:sz="4" w:space="0" w:color="D4DCE6"/>
               <w:start w:val="single" w:sz="4" w:space="0" w:color="D4DCE6"/>
@@ -3640,7 +3640,7 @@
         </w:tc>
         <w:tc>
           <w:tcPr>
-            <w:tcW w:w="2205" w:type="dxa"/>
+            <w:tcW w:w="2206" w:type="dxa"/>
             <w:tcBorders>
               <w:top w:val="single" w:sz="4" w:space="0" w:color="D4DCE6"/>
               <w:start w:val="single" w:sz="4" w:space="0" w:color="D4DCE6"/>
@@ -3735,7 +3735,7 @@
         </w:trPr>
         <w:tc>
           <w:tcPr>
-            <w:tcW w:w="615" w:type="dxa"/>
+            <w:tcW w:w="614" w:type="dxa"/>
             <w:tcBorders>
               <w:top w:val="single" w:sz="4" w:space="0" w:color="D4DCE6"/>
               <w:start w:val="single" w:sz="4" w:space="0" w:color="D4DCE6"/>
@@ -3764,7 +3764,7 @@
         </w:tc>
         <w:tc>
           <w:tcPr>
-            <w:tcW w:w="2205" w:type="dxa"/>
+            <w:tcW w:w="2206" w:type="dxa"/>
             <w:tcBorders>
               <w:top w:val="single" w:sz="4" w:space="0" w:color="D4DCE6"/>
               <w:start w:val="single" w:sz="4" w:space="0" w:color="D4DCE6"/>
@@ -3856,7 +3856,7 @@
         </w:trPr>
         <w:tc>
           <w:tcPr>
-            <w:tcW w:w="615" w:type="dxa"/>
+            <w:tcW w:w="614" w:type="dxa"/>
             <w:tcBorders>
               <w:top w:val="single" w:sz="4" w:space="0" w:color="D4DCE6"/>
               <w:start w:val="single" w:sz="4" w:space="0" w:color="D4DCE6"/>
@@ -3886,7 +3886,7 @@
         </w:tc>
         <w:tc>
           <w:tcPr>
-            <w:tcW w:w="2205" w:type="dxa"/>
+            <w:tcW w:w="2206" w:type="dxa"/>
             <w:tcBorders>
               <w:top w:val="single" w:sz="4" w:space="0" w:color="D4DCE6"/>
               <w:start w:val="single" w:sz="4" w:space="0" w:color="D4DCE6"/>
@@ -3981,7 +3981,7 @@
         </w:trPr>
         <w:tc>
           <w:tcPr>
-            <w:tcW w:w="615" w:type="dxa"/>
+            <w:tcW w:w="614" w:type="dxa"/>
             <w:tcBorders>
               <w:top w:val="single" w:sz="4" w:space="0" w:color="D4DCE6"/>
               <w:start w:val="single" w:sz="4" w:space="0" w:color="D4DCE6"/>
@@ -4010,7 +4010,7 @@
         </w:tc>
         <w:tc>
           <w:tcPr>
-            <w:tcW w:w="2205" w:type="dxa"/>
+            <w:tcW w:w="2206" w:type="dxa"/>
             <w:tcBorders>
               <w:top w:val="single" w:sz="4" w:space="0" w:color="D4DCE6"/>
               <w:start w:val="single" w:sz="4" w:space="0" w:color="D4DCE6"/>
@@ -4298,11 +4298,11 @@
         <w:tblLook w:val="04a0" w:firstRow="1" w:noVBand="1" w:lastRow="0" w:firstColumn="1" w:lastColumn="0" w:noHBand="0"/>
       </w:tblPr>
       <w:tblGrid>
-        <w:gridCol w:w="1595"/>
-        <w:gridCol w:w="1505"/>
+        <w:gridCol w:w="1594"/>
+        <w:gridCol w:w="1506"/>
         <w:gridCol w:w="1500"/>
-        <w:gridCol w:w="1295"/>
-        <w:gridCol w:w="1505"/>
+        <w:gridCol w:w="1294"/>
+        <w:gridCol w:w="1506"/>
         <w:gridCol w:w="1960"/>
       </w:tblGrid>
       <w:tr>
@@ -4312,7 +4312,7 @@
         </w:trPr>
         <w:tc>
           <w:tcPr>
-            <w:tcW w:w="1595" w:type="dxa"/>
+            <w:tcW w:w="1594" w:type="dxa"/>
             <w:tcBorders>
               <w:top w:val="single" w:sz="4" w:space="0" w:color="D4DCE6"/>
               <w:start w:val="single" w:sz="4" w:space="0" w:color="D4DCE6"/>
@@ -4342,7 +4342,7 @@
         </w:tc>
         <w:tc>
           <w:tcPr>
-            <w:tcW w:w="1505" w:type="dxa"/>
+            <w:tcW w:w="1506" w:type="dxa"/>
             <w:tcBorders>
               <w:top w:val="single" w:sz="4" w:space="0" w:color="D4DCE6"/>
               <w:start w:val="single" w:sz="4" w:space="0" w:color="D4DCE6"/>
@@ -4402,7 +4402,7 @@
         </w:tc>
         <w:tc>
           <w:tcPr>
-            <w:tcW w:w="1295" w:type="dxa"/>
+            <w:tcW w:w="1294" w:type="dxa"/>
             <w:tcBorders>
               <w:top w:val="single" w:sz="4" w:space="0" w:color="D4DCE6"/>
               <w:start w:val="single" w:sz="4" w:space="0" w:color="D4DCE6"/>
@@ -4432,7 +4432,7 @@
         </w:tc>
         <w:tc>
           <w:tcPr>
-            <w:tcW w:w="1505" w:type="dxa"/>
+            <w:tcW w:w="1506" w:type="dxa"/>
             <w:tcBorders>
               <w:top w:val="single" w:sz="4" w:space="0" w:color="D4DCE6"/>
               <w:start w:val="single" w:sz="4" w:space="0" w:color="D4DCE6"/>
@@ -4497,7 +4497,7 @@
         </w:trPr>
         <w:tc>
           <w:tcPr>
-            <w:tcW w:w="1595" w:type="dxa"/>
+            <w:tcW w:w="1594" w:type="dxa"/>
             <w:tcBorders>
               <w:top w:val="single" w:sz="4" w:space="0" w:color="D4DCE6"/>
               <w:start w:val="single" w:sz="4" w:space="0" w:color="D4DCE6"/>
@@ -4526,7 +4526,7 @@
         </w:tc>
         <w:tc>
           <w:tcPr>
-            <w:tcW w:w="1505" w:type="dxa"/>
+            <w:tcW w:w="1506" w:type="dxa"/>
             <w:tcBorders>
               <w:top w:val="single" w:sz="4" w:space="0" w:color="D4DCE6"/>
               <w:start w:val="single" w:sz="4" w:space="0" w:color="D4DCE6"/>
@@ -4584,7 +4584,7 @@
         </w:tc>
         <w:tc>
           <w:tcPr>
-            <w:tcW w:w="1295" w:type="dxa"/>
+            <w:tcW w:w="1294" w:type="dxa"/>
             <w:tcBorders>
               <w:top w:val="single" w:sz="4" w:space="0" w:color="D4DCE6"/>
               <w:start w:val="single" w:sz="4" w:space="0" w:color="D4DCE6"/>
@@ -4613,7 +4613,7 @@
         </w:tc>
         <w:tc>
           <w:tcPr>
-            <w:tcW w:w="1505" w:type="dxa"/>
+            <w:tcW w:w="1506" w:type="dxa"/>
             <w:tcBorders>
               <w:top w:val="single" w:sz="4" w:space="0" w:color="D4DCE6"/>
               <w:start w:val="single" w:sz="4" w:space="0" w:color="D4DCE6"/>
@@ -4676,7 +4676,7 @@
         </w:trPr>
         <w:tc>
           <w:tcPr>
-            <w:tcW w:w="1595" w:type="dxa"/>
+            <w:tcW w:w="1594" w:type="dxa"/>
             <w:tcBorders>
               <w:top w:val="single" w:sz="4" w:space="0" w:color="D4DCE6"/>
               <w:start w:val="single" w:sz="4" w:space="0" w:color="D4DCE6"/>
@@ -4706,7 +4706,7 @@
         </w:tc>
         <w:tc>
           <w:tcPr>
-            <w:tcW w:w="1505" w:type="dxa"/>
+            <w:tcW w:w="1506" w:type="dxa"/>
             <w:tcBorders>
               <w:top w:val="single" w:sz="4" w:space="0" w:color="D4DCE6"/>
               <w:start w:val="single" w:sz="4" w:space="0" w:color="D4DCE6"/>
@@ -4766,7 +4766,7 @@
         </w:tc>
         <w:tc>
           <w:tcPr>
-            <w:tcW w:w="1295" w:type="dxa"/>
+            <w:tcW w:w="1294" w:type="dxa"/>
             <w:tcBorders>
               <w:top w:val="single" w:sz="4" w:space="0" w:color="D4DCE6"/>
               <w:start w:val="single" w:sz="4" w:space="0" w:color="D4DCE6"/>
@@ -4796,7 +4796,7 @@
         </w:tc>
         <w:tc>
           <w:tcPr>
-            <w:tcW w:w="1505" w:type="dxa"/>
+            <w:tcW w:w="1506" w:type="dxa"/>
             <w:tcBorders>
               <w:top w:val="single" w:sz="4" w:space="0" w:color="D4DCE6"/>
               <w:start w:val="single" w:sz="4" w:space="0" w:color="D4DCE6"/>
@@ -4861,7 +4861,7 @@
         </w:trPr>
         <w:tc>
           <w:tcPr>
-            <w:tcW w:w="1595" w:type="dxa"/>
+            <w:tcW w:w="1594" w:type="dxa"/>
             <w:tcBorders>
               <w:top w:val="single" w:sz="4" w:space="0" w:color="D4DCE6"/>
               <w:start w:val="single" w:sz="4" w:space="0" w:color="D4DCE6"/>
@@ -4890,7 +4890,7 @@
         </w:tc>
         <w:tc>
           <w:tcPr>
-            <w:tcW w:w="1505" w:type="dxa"/>
+            <w:tcW w:w="1506" w:type="dxa"/>
             <w:tcBorders>
               <w:top w:val="single" w:sz="4" w:space="0" w:color="D4DCE6"/>
               <w:start w:val="single" w:sz="4" w:space="0" w:color="D4DCE6"/>
@@ -4948,7 +4948,7 @@
         </w:tc>
         <w:tc>
           <w:tcPr>
-            <w:tcW w:w="1295" w:type="dxa"/>
+            <w:tcW w:w="1294" w:type="dxa"/>
             <w:tcBorders>
               <w:top w:val="single" w:sz="4" w:space="0" w:color="D4DCE6"/>
               <w:start w:val="single" w:sz="4" w:space="0" w:color="D4DCE6"/>
@@ -4977,7 +4977,7 @@
         </w:tc>
         <w:tc>
           <w:tcPr>
-            <w:tcW w:w="1505" w:type="dxa"/>
+            <w:tcW w:w="1506" w:type="dxa"/>
             <w:tcBorders>
               <w:top w:val="single" w:sz="4" w:space="0" w:color="D4DCE6"/>
               <w:start w:val="single" w:sz="4" w:space="0" w:color="D4DCE6"/>
@@ -5040,7 +5040,7 @@
         </w:trPr>
         <w:tc>
           <w:tcPr>
-            <w:tcW w:w="1595" w:type="dxa"/>
+            <w:tcW w:w="1594" w:type="dxa"/>
             <w:tcBorders>
               <w:top w:val="single" w:sz="4" w:space="0" w:color="D4DCE6"/>
               <w:start w:val="single" w:sz="4" w:space="0" w:color="D4DCE6"/>
@@ -5070,7 +5070,7 @@
         </w:tc>
         <w:tc>
           <w:tcPr>
-            <w:tcW w:w="1505" w:type="dxa"/>
+            <w:tcW w:w="1506" w:type="dxa"/>
             <w:tcBorders>
               <w:top w:val="single" w:sz="4" w:space="0" w:color="D4DCE6"/>
               <w:start w:val="single" w:sz="4" w:space="0" w:color="D4DCE6"/>
@@ -5130,7 +5130,7 @@
         </w:tc>
         <w:tc>
           <w:tcPr>
-            <w:tcW w:w="1295" w:type="dxa"/>
+            <w:tcW w:w="1294" w:type="dxa"/>
             <w:tcBorders>
               <w:top w:val="single" w:sz="4" w:space="0" w:color="D4DCE6"/>
               <w:start w:val="single" w:sz="4" w:space="0" w:color="D4DCE6"/>
@@ -5160,7 +5160,7 @@
         </w:tc>
         <w:tc>
           <w:tcPr>
-            <w:tcW w:w="1505" w:type="dxa"/>
+            <w:tcW w:w="1506" w:type="dxa"/>
             <w:tcBorders>
               <w:top w:val="single" w:sz="4" w:space="0" w:color="D4DCE6"/>
               <w:start w:val="single" w:sz="4" w:space="0" w:color="D4DCE6"/>
@@ -5225,7 +5225,7 @@
         </w:trPr>
         <w:tc>
           <w:tcPr>
-            <w:tcW w:w="1595" w:type="dxa"/>
+            <w:tcW w:w="1594" w:type="dxa"/>
             <w:tcBorders>
               <w:top w:val="single" w:sz="4" w:space="0" w:color="D4DCE6"/>
               <w:start w:val="single" w:sz="4" w:space="0" w:color="D4DCE6"/>
@@ -5254,7 +5254,7 @@
         </w:tc>
         <w:tc>
           <w:tcPr>
-            <w:tcW w:w="1505" w:type="dxa"/>
+            <w:tcW w:w="1506" w:type="dxa"/>
             <w:tcBorders>
               <w:top w:val="single" w:sz="4" w:space="0" w:color="D4DCE6"/>
               <w:start w:val="single" w:sz="4" w:space="0" w:color="D4DCE6"/>
@@ -5312,7 +5312,7 @@
         </w:tc>
         <w:tc>
           <w:tcPr>
-            <w:tcW w:w="1295" w:type="dxa"/>
+            <w:tcW w:w="1294" w:type="dxa"/>
             <w:tcBorders>
               <w:top w:val="single" w:sz="4" w:space="0" w:color="D4DCE6"/>
               <w:start w:val="single" w:sz="4" w:space="0" w:color="D4DCE6"/>
@@ -5341,7 +5341,7 @@
         </w:tc>
         <w:tc>
           <w:tcPr>
-            <w:tcW w:w="1505" w:type="dxa"/>
+            <w:tcW w:w="1506" w:type="dxa"/>
             <w:tcBorders>
               <w:top w:val="single" w:sz="4" w:space="0" w:color="D4DCE6"/>
               <w:start w:val="single" w:sz="4" w:space="0" w:color="D4DCE6"/>
@@ -5634,9 +5634,9 @@
       <w:tblGrid>
         <w:gridCol w:w="1257"/>
         <w:gridCol w:w="2121"/>
-        <w:gridCol w:w="1977"/>
+        <w:gridCol w:w="1976"/>
         <w:gridCol w:w="1900"/>
-        <w:gridCol w:w="2105"/>
+        <w:gridCol w:w="2106"/>
       </w:tblGrid>
       <w:tr>
         <w:trPr>
@@ -5705,7 +5705,7 @@
         </w:tc>
         <w:tc>
           <w:tcPr>
-            <w:tcW w:w="1977" w:type="dxa"/>
+            <w:tcW w:w="1976" w:type="dxa"/>
             <w:tcBorders>
               <w:top w:val="single" w:sz="4" w:space="0" w:color="D4DCE6"/>
               <w:start w:val="single" w:sz="4" w:space="0" w:color="D4DCE6"/>
@@ -5765,7 +5765,7 @@
         </w:tc>
         <w:tc>
           <w:tcPr>
-            <w:tcW w:w="2105" w:type="dxa"/>
+            <w:tcW w:w="2106" w:type="dxa"/>
             <w:tcBorders>
               <w:top w:val="single" w:sz="4" w:space="0" w:color="D4DCE6"/>
               <w:start w:val="single" w:sz="4" w:space="0" w:color="D4DCE6"/>
@@ -5858,7 +5858,7 @@
         </w:tc>
         <w:tc>
           <w:tcPr>
-            <w:tcW w:w="1977" w:type="dxa"/>
+            <w:tcW w:w="1976" w:type="dxa"/>
             <w:tcBorders>
               <w:top w:val="single" w:sz="4" w:space="0" w:color="D4DCE6"/>
               <w:start w:val="single" w:sz="4" w:space="0" w:color="D4DCE6"/>
@@ -5916,7 +5916,7 @@
         </w:tc>
         <w:tc>
           <w:tcPr>
-            <w:tcW w:w="2105" w:type="dxa"/>
+            <w:tcW w:w="2106" w:type="dxa"/>
             <w:tcBorders>
               <w:top w:val="single" w:sz="4" w:space="0" w:color="D4DCE6"/>
               <w:start w:val="single" w:sz="4" w:space="0" w:color="D4DCE6"/>
@@ -6010,7 +6010,7 @@
         </w:tc>
         <w:tc>
           <w:tcPr>
-            <w:tcW w:w="1977" w:type="dxa"/>
+            <w:tcW w:w="1976" w:type="dxa"/>
             <w:tcBorders>
               <w:top w:val="single" w:sz="4" w:space="0" w:color="D4DCE6"/>
               <w:start w:val="single" w:sz="4" w:space="0" w:color="D4DCE6"/>
@@ -6070,7 +6070,7 @@
         </w:tc>
         <w:tc>
           <w:tcPr>
-            <w:tcW w:w="2105" w:type="dxa"/>
+            <w:tcW w:w="2106" w:type="dxa"/>
             <w:tcBorders>
               <w:top w:val="single" w:sz="4" w:space="0" w:color="D4DCE6"/>
               <w:start w:val="single" w:sz="4" w:space="0" w:color="D4DCE6"/>
@@ -6163,7 +6163,7 @@
         </w:tc>
         <w:tc>
           <w:tcPr>
-            <w:tcW w:w="1977" w:type="dxa"/>
+            <w:tcW w:w="1976" w:type="dxa"/>
             <w:tcBorders>
               <w:top w:val="single" w:sz="4" w:space="0" w:color="D4DCE6"/>
               <w:start w:val="single" w:sz="4" w:space="0" w:color="D4DCE6"/>
@@ -6221,7 +6221,7 @@
         </w:tc>
         <w:tc>
           <w:tcPr>
-            <w:tcW w:w="2105" w:type="dxa"/>
+            <w:tcW w:w="2106" w:type="dxa"/>
             <w:tcBorders>
               <w:top w:val="single" w:sz="4" w:space="0" w:color="D4DCE6"/>
               <w:start w:val="single" w:sz="4" w:space="0" w:color="D4DCE6"/>
@@ -6315,7 +6315,7 @@
         </w:tc>
         <w:tc>
           <w:tcPr>
-            <w:tcW w:w="1977" w:type="dxa"/>
+            <w:tcW w:w="1976" w:type="dxa"/>
             <w:tcBorders>
               <w:top w:val="single" w:sz="4" w:space="0" w:color="D4DCE6"/>
               <w:start w:val="single" w:sz="4" w:space="0" w:color="D4DCE6"/>
@@ -6375,7 +6375,7 @@
         </w:tc>
         <w:tc>
           <w:tcPr>
-            <w:tcW w:w="2105" w:type="dxa"/>
+            <w:tcW w:w="2106" w:type="dxa"/>
             <w:tcBorders>
               <w:top w:val="single" w:sz="4" w:space="0" w:color="D4DCE6"/>
               <w:start w:val="single" w:sz="4" w:space="0" w:color="D4DCE6"/>
@@ -6596,8 +6596,8 @@
         <w:tblLook w:val="04a0" w:firstRow="1" w:noVBand="1" w:lastRow="0" w:firstColumn="1" w:lastColumn="0" w:noHBand="0"/>
       </w:tblPr>
       <w:tblGrid>
-        <w:gridCol w:w="645"/>
-        <w:gridCol w:w="1285"/>
+        <w:gridCol w:w="644"/>
+        <w:gridCol w:w="1286"/>
         <w:gridCol w:w="1560"/>
         <w:gridCol w:w="1570"/>
         <w:gridCol w:w="1900"/>
@@ -6610,7 +6610,7 @@
         </w:trPr>
         <w:tc>
           <w:tcPr>
-            <w:tcW w:w="645" w:type="dxa"/>
+            <w:tcW w:w="644" w:type="dxa"/>
             <w:tcBorders>
               <w:top w:val="single" w:sz="4" w:space="0" w:color="D4DCE6"/>
               <w:start w:val="single" w:sz="4" w:space="0" w:color="D4DCE6"/>
@@ -6640,7 +6640,7 @@
         </w:tc>
         <w:tc>
           <w:tcPr>
-            <w:tcW w:w="1285" w:type="dxa"/>
+            <w:tcW w:w="1286" w:type="dxa"/>
             <w:tcBorders>
               <w:top w:val="single" w:sz="4" w:space="0" w:color="D4DCE6"/>
               <w:start w:val="single" w:sz="4" w:space="0" w:color="D4DCE6"/>
@@ -6795,7 +6795,7 @@
         </w:trPr>
         <w:tc>
           <w:tcPr>
-            <w:tcW w:w="645" w:type="dxa"/>
+            <w:tcW w:w="644" w:type="dxa"/>
             <w:tcBorders>
               <w:top w:val="single" w:sz="4" w:space="0" w:color="D4DCE6"/>
               <w:start w:val="single" w:sz="4" w:space="0" w:color="D4DCE6"/>
@@ -6824,7 +6824,7 @@
         </w:tc>
         <w:tc>
           <w:tcPr>
-            <w:tcW w:w="1285" w:type="dxa"/>
+            <w:tcW w:w="1286" w:type="dxa"/>
             <w:tcBorders>
               <w:top w:val="single" w:sz="4" w:space="0" w:color="D4DCE6"/>
               <w:start w:val="single" w:sz="4" w:space="0" w:color="D4DCE6"/>
@@ -6974,7 +6974,7 @@
         </w:trPr>
         <w:tc>
           <w:tcPr>
-            <w:tcW w:w="645" w:type="dxa"/>
+            <w:tcW w:w="644" w:type="dxa"/>
             <w:tcBorders>
               <w:top w:val="single" w:sz="4" w:space="0" w:color="D4DCE6"/>
               <w:start w:val="single" w:sz="4" w:space="0" w:color="D4DCE6"/>
@@ -7004,7 +7004,7 @@
         </w:tc>
         <w:tc>
           <w:tcPr>
-            <w:tcW w:w="1285" w:type="dxa"/>
+            <w:tcW w:w="1286" w:type="dxa"/>
             <w:tcBorders>
               <w:top w:val="single" w:sz="4" w:space="0" w:color="D4DCE6"/>
               <w:start w:val="single" w:sz="4" w:space="0" w:color="D4DCE6"/>
@@ -7159,7 +7159,7 @@
         </w:trPr>
         <w:tc>
           <w:tcPr>
-            <w:tcW w:w="645" w:type="dxa"/>
+            <w:tcW w:w="644" w:type="dxa"/>
             <w:tcBorders>
               <w:top w:val="single" w:sz="4" w:space="0" w:color="D4DCE6"/>
               <w:start w:val="single" w:sz="4" w:space="0" w:color="D4DCE6"/>
@@ -7188,7 +7188,7 @@
         </w:tc>
         <w:tc>
           <w:tcPr>
-            <w:tcW w:w="1285" w:type="dxa"/>
+            <w:tcW w:w="1286" w:type="dxa"/>
             <w:tcBorders>
               <w:top w:val="single" w:sz="4" w:space="0" w:color="D4DCE6"/>
               <w:start w:val="single" w:sz="4" w:space="0" w:color="D4DCE6"/>
@@ -7338,7 +7338,7 @@
         </w:trPr>
         <w:tc>
           <w:tcPr>
-            <w:tcW w:w="645" w:type="dxa"/>
+            <w:tcW w:w="644" w:type="dxa"/>
             <w:tcBorders>
               <w:top w:val="single" w:sz="4" w:space="0" w:color="D4DCE6"/>
               <w:start w:val="single" w:sz="4" w:space="0" w:color="D4DCE6"/>
@@ -7368,7 +7368,7 @@
         </w:tc>
         <w:tc>
           <w:tcPr>
-            <w:tcW w:w="1285" w:type="dxa"/>
+            <w:tcW w:w="1286" w:type="dxa"/>
             <w:tcBorders>
               <w:top w:val="single" w:sz="4" w:space="0" w:color="D4DCE6"/>
               <w:start w:val="single" w:sz="4" w:space="0" w:color="D4DCE6"/>
@@ -7523,7 +7523,7 @@
         </w:trPr>
         <w:tc>
           <w:tcPr>
-            <w:tcW w:w="645" w:type="dxa"/>
+            <w:tcW w:w="644" w:type="dxa"/>
             <w:tcBorders>
               <w:top w:val="single" w:sz="4" w:space="0" w:color="D4DCE6"/>
               <w:start w:val="single" w:sz="4" w:space="0" w:color="D4DCE6"/>
@@ -7552,7 +7552,7 @@
         </w:tc>
         <w:tc>
           <w:tcPr>
-            <w:tcW w:w="1285" w:type="dxa"/>
+            <w:tcW w:w="1286" w:type="dxa"/>
             <w:tcBorders>
               <w:top w:val="single" w:sz="4" w:space="0" w:color="D4DCE6"/>
               <w:start w:val="single" w:sz="4" w:space="0" w:color="D4DCE6"/>
@@ -7702,7 +7702,7 @@
         </w:trPr>
         <w:tc>
           <w:tcPr>
-            <w:tcW w:w="645" w:type="dxa"/>
+            <w:tcW w:w="644" w:type="dxa"/>
             <w:tcBorders>
               <w:top w:val="single" w:sz="4" w:space="0" w:color="D4DCE6"/>
               <w:start w:val="single" w:sz="4" w:space="0" w:color="D4DCE6"/>
@@ -7732,7 +7732,7 @@
         </w:tc>
         <w:tc>
           <w:tcPr>
-            <w:tcW w:w="1285" w:type="dxa"/>
+            <w:tcW w:w="1286" w:type="dxa"/>
             <w:tcBorders>
               <w:top w:val="single" w:sz="4" w:space="0" w:color="D4DCE6"/>
               <w:start w:val="single" w:sz="4" w:space="0" w:color="D4DCE6"/>
@@ -7887,7 +7887,7 @@
         </w:trPr>
         <w:tc>
           <w:tcPr>
-            <w:tcW w:w="645" w:type="dxa"/>
+            <w:tcW w:w="644" w:type="dxa"/>
             <w:tcBorders>
               <w:top w:val="single" w:sz="4" w:space="0" w:color="D4DCE6"/>
               <w:start w:val="single" w:sz="4" w:space="0" w:color="D4DCE6"/>
@@ -7916,7 +7916,7 @@
         </w:tc>
         <w:tc>
           <w:tcPr>
-            <w:tcW w:w="1285" w:type="dxa"/>
+            <w:tcW w:w="1286" w:type="dxa"/>
             <w:tcBorders>
               <w:top w:val="single" w:sz="4" w:space="0" w:color="D4DCE6"/>
               <w:start w:val="single" w:sz="4" w:space="0" w:color="D4DCE6"/>
@@ -8066,7 +8066,7 @@
         </w:trPr>
         <w:tc>
           <w:tcPr>
-            <w:tcW w:w="645" w:type="dxa"/>
+            <w:tcW w:w="644" w:type="dxa"/>
             <w:tcBorders>
               <w:top w:val="single" w:sz="4" w:space="0" w:color="D4DCE6"/>
               <w:start w:val="single" w:sz="4" w:space="0" w:color="D4DCE6"/>
@@ -8096,7 +8096,7 @@
         </w:tc>
         <w:tc>
           <w:tcPr>
-            <w:tcW w:w="1285" w:type="dxa"/>
+            <w:tcW w:w="1286" w:type="dxa"/>
             <w:tcBorders>
               <w:top w:val="single" w:sz="4" w:space="0" w:color="D4DCE6"/>
               <w:start w:val="single" w:sz="4" w:space="0" w:color="D4DCE6"/>
@@ -9420,8 +9420,8 @@
       </w:tblPr>
       <w:tblGrid>
         <w:gridCol w:w="2204"/>
-        <w:gridCol w:w="2337"/>
-        <w:gridCol w:w="2344"/>
+        <w:gridCol w:w="2336"/>
+        <w:gridCol w:w="2345"/>
         <w:gridCol w:w="2337"/>
       </w:tblGrid>
       <w:tr>
@@ -9464,7 +9464,7 @@
         </w:tc>
         <w:tc>
           <w:tcPr>
-            <w:tcW w:w="2337" w:type="dxa"/>
+            <w:tcW w:w="2336" w:type="dxa"/>
             <w:tcBorders/>
             <w:shd w:fill="1F4E78" w:val="clear"/>
           </w:tcPr>
@@ -9497,7 +9497,7 @@
         </w:tc>
         <w:tc>
           <w:tcPr>
-            <w:tcW w:w="2344" w:type="dxa"/>
+            <w:tcW w:w="2345" w:type="dxa"/>
             <w:tcBorders/>
             <w:shd w:fill="1F4E78" w:val="clear"/>
           </w:tcPr>
@@ -9592,7 +9592,7 @@
         </w:tc>
         <w:tc>
           <w:tcPr>
-            <w:tcW w:w="2337" w:type="dxa"/>
+            <w:tcW w:w="2336" w:type="dxa"/>
             <w:tcBorders/>
           </w:tcPr>
           <w:p>
@@ -9622,7 +9622,7 @@
         </w:tc>
         <w:tc>
           <w:tcPr>
-            <w:tcW w:w="2344" w:type="dxa"/>
+            <w:tcW w:w="2345" w:type="dxa"/>
             <w:tcBorders/>
           </w:tcPr>
           <w:p>
@@ -9717,7 +9717,7 @@
         </w:tc>
         <w:tc>
           <w:tcPr>
-            <w:tcW w:w="2337" w:type="dxa"/>
+            <w:tcW w:w="2336" w:type="dxa"/>
             <w:tcBorders/>
           </w:tcPr>
           <w:p>
@@ -9747,7 +9747,7 @@
         </w:tc>
         <w:tc>
           <w:tcPr>
-            <w:tcW w:w="2344" w:type="dxa"/>
+            <w:tcW w:w="2345" w:type="dxa"/>
             <w:tcBorders/>
           </w:tcPr>
           <w:p>
@@ -9842,7 +9842,7 @@
         </w:tc>
         <w:tc>
           <w:tcPr>
-            <w:tcW w:w="2337" w:type="dxa"/>
+            <w:tcW w:w="2336" w:type="dxa"/>
             <w:tcBorders/>
           </w:tcPr>
           <w:p>
@@ -9872,7 +9872,7 @@
         </w:tc>
         <w:tc>
           <w:tcPr>
-            <w:tcW w:w="2344" w:type="dxa"/>
+            <w:tcW w:w="2345" w:type="dxa"/>
             <w:tcBorders/>
           </w:tcPr>
           <w:p>
@@ -9967,7 +9967,7 @@
         </w:tc>
         <w:tc>
           <w:tcPr>
-            <w:tcW w:w="2337" w:type="dxa"/>
+            <w:tcW w:w="2336" w:type="dxa"/>
             <w:tcBorders/>
           </w:tcPr>
           <w:p>
@@ -9997,7 +9997,7 @@
         </w:tc>
         <w:tc>
           <w:tcPr>
-            <w:tcW w:w="2344" w:type="dxa"/>
+            <w:tcW w:w="2345" w:type="dxa"/>
             <w:tcBorders/>
           </w:tcPr>
           <w:p>
@@ -10092,7 +10092,7 @@
         </w:tc>
         <w:tc>
           <w:tcPr>
-            <w:tcW w:w="2337" w:type="dxa"/>
+            <w:tcW w:w="2336" w:type="dxa"/>
             <w:tcBorders/>
           </w:tcPr>
           <w:p>
@@ -10122,7 +10122,7 @@
         </w:tc>
         <w:tc>
           <w:tcPr>
-            <w:tcW w:w="2344" w:type="dxa"/>
+            <w:tcW w:w="2345" w:type="dxa"/>
             <w:tcBorders/>
           </w:tcPr>
           <w:p>
@@ -10217,7 +10217,7 @@
         </w:tc>
         <w:tc>
           <w:tcPr>
-            <w:tcW w:w="2337" w:type="dxa"/>
+            <w:tcW w:w="2336" w:type="dxa"/>
             <w:tcBorders/>
           </w:tcPr>
           <w:p>
@@ -10247,7 +10247,7 @@
         </w:tc>
         <w:tc>
           <w:tcPr>
-            <w:tcW w:w="2344" w:type="dxa"/>
+            <w:tcW w:w="2345" w:type="dxa"/>
             <w:tcBorders/>
           </w:tcPr>
           <w:p>
@@ -10342,7 +10342,7 @@
         </w:tc>
         <w:tc>
           <w:tcPr>
-            <w:tcW w:w="2337" w:type="dxa"/>
+            <w:tcW w:w="2336" w:type="dxa"/>
             <w:tcBorders/>
           </w:tcPr>
           <w:p>
@@ -10372,7 +10372,7 @@
         </w:tc>
         <w:tc>
           <w:tcPr>
-            <w:tcW w:w="2344" w:type="dxa"/>
+            <w:tcW w:w="2345" w:type="dxa"/>
             <w:tcBorders/>
           </w:tcPr>
           <w:p>
@@ -10468,7 +10468,7 @@
         </w:tc>
         <w:tc>
           <w:tcPr>
-            <w:tcW w:w="2337" w:type="dxa"/>
+            <w:tcW w:w="2336" w:type="dxa"/>
             <w:tcBorders/>
           </w:tcPr>
           <w:p>
@@ -10498,7 +10498,7 @@
         </w:tc>
         <w:tc>
           <w:tcPr>
-            <w:tcW w:w="2344" w:type="dxa"/>
+            <w:tcW w:w="2345" w:type="dxa"/>
             <w:tcBorders/>
           </w:tcPr>
           <w:p>
@@ -10950,7 +10950,7 @@
           <w:sz w:val="22"/>
           <w:szCs w:val="22"/>
         </w:rPr>
-        <w:t>Generative-AI tools were used to assist with language editing, clarity, organization of manuscript text, and preparation of selected code and repository materials. The author designed the research question and model, determined the assumptions, reviewed and verified the manuscript and references, executed and checked the computational analyses, and retains sole responsibility for all content, results, interpretations, and conclusions. Generative AI was not listed as an author and did not independently produce the study’s simulations, analyses, or conclusions. Candidate literature was identified with AI assistance and independently verified before inclusion.</w:t>
+        <w:t xml:space="preserve">Generative-AI tools were used to generate and revise manuscript prose and to generate and revise the simulation code and repository documentation. The author conceived the research question, designed the model, determined its assumptions, and retains sole responsibility for the study. All cited sources were independently verified before inclusion. The simulation code was tested, and the reported computational outputs were checked against the archived results. The simulations and numerical analyses were executed by the model code using standard computational software; generative AI was not used to execute simulations or generate the reported numerical results. Generative AI was not listed as an author and did not independently determine the study’s interpretations or conclusions. </w:t>
       </w:r>
     </w:p>
     <w:p>
@@ -11546,8 +11546,8 @@
       </w:tblPr>
       <w:tblGrid>
         <w:gridCol w:w="1520"/>
-        <w:gridCol w:w="3175"/>
-        <w:gridCol w:w="1825"/>
+        <w:gridCol w:w="3174"/>
+        <w:gridCol w:w="1826"/>
         <w:gridCol w:w="2840"/>
       </w:tblGrid>
       <w:tr>
@@ -11587,7 +11587,7 @@
         </w:tc>
         <w:tc>
           <w:tcPr>
-            <w:tcW w:w="3175" w:type="dxa"/>
+            <w:tcW w:w="3174" w:type="dxa"/>
             <w:tcBorders>
               <w:top w:val="single" w:sz="4" w:space="0" w:color="D4DCE6"/>
               <w:start w:val="single" w:sz="4" w:space="0" w:color="D4DCE6"/>
@@ -11617,7 +11617,7 @@
         </w:tc>
         <w:tc>
           <w:tcPr>
-            <w:tcW w:w="1825" w:type="dxa"/>
+            <w:tcW w:w="1826" w:type="dxa"/>
             <w:tcBorders>
               <w:top w:val="single" w:sz="4" w:space="0" w:color="D4DCE6"/>
               <w:start w:val="single" w:sz="4" w:space="0" w:color="D4DCE6"/>
@@ -11711,7 +11711,7 @@
         </w:tc>
         <w:tc>
           <w:tcPr>
-            <w:tcW w:w="3175" w:type="dxa"/>
+            <w:tcW w:w="3174" w:type="dxa"/>
             <w:tcBorders>
               <w:top w:val="single" w:sz="4" w:space="0" w:color="D4DCE6"/>
               <w:start w:val="single" w:sz="4" w:space="0" w:color="D4DCE6"/>
@@ -11740,7 +11740,7 @@
         </w:tc>
         <w:tc>
           <w:tcPr>
-            <w:tcW w:w="1825" w:type="dxa"/>
+            <w:tcW w:w="1826" w:type="dxa"/>
             <w:tcBorders>
               <w:top w:val="single" w:sz="4" w:space="0" w:color="D4DCE6"/>
               <w:start w:val="single" w:sz="4" w:space="0" w:color="D4DCE6"/>
@@ -11833,7 +11833,7 @@
         </w:tc>
         <w:tc>
           <w:tcPr>
-            <w:tcW w:w="3175" w:type="dxa"/>
+            <w:tcW w:w="3174" w:type="dxa"/>
             <w:tcBorders>
               <w:top w:val="single" w:sz="4" w:space="0" w:color="D4DCE6"/>
               <w:start w:val="single" w:sz="4" w:space="0" w:color="D4DCE6"/>
@@ -11863,7 +11863,7 @@
         </w:tc>
         <w:tc>
           <w:tcPr>
-            <w:tcW w:w="1825" w:type="dxa"/>
+            <w:tcW w:w="1826" w:type="dxa"/>
             <w:tcBorders>
               <w:top w:val="single" w:sz="4" w:space="0" w:color="D4DCE6"/>
               <w:start w:val="single" w:sz="4" w:space="0" w:color="D4DCE6"/>
@@ -11957,7 +11957,7 @@
         </w:tc>
         <w:tc>
           <w:tcPr>
-            <w:tcW w:w="3175" w:type="dxa"/>
+            <w:tcW w:w="3174" w:type="dxa"/>
             <w:tcBorders>
               <w:top w:val="single" w:sz="4" w:space="0" w:color="D4DCE6"/>
               <w:start w:val="single" w:sz="4" w:space="0" w:color="D4DCE6"/>
@@ -11986,7 +11986,7 @@
         </w:tc>
         <w:tc>
           <w:tcPr>
-            <w:tcW w:w="1825" w:type="dxa"/>
+            <w:tcW w:w="1826" w:type="dxa"/>
             <w:tcBorders>
               <w:top w:val="single" w:sz="4" w:space="0" w:color="D4DCE6"/>
               <w:start w:val="single" w:sz="4" w:space="0" w:color="D4DCE6"/>
@@ -12079,7 +12079,7 @@
         </w:tc>
         <w:tc>
           <w:tcPr>
-            <w:tcW w:w="3175" w:type="dxa"/>
+            <w:tcW w:w="3174" w:type="dxa"/>
             <w:tcBorders>
               <w:top w:val="single" w:sz="4" w:space="0" w:color="D4DCE6"/>
               <w:start w:val="single" w:sz="4" w:space="0" w:color="D4DCE6"/>
@@ -12109,7 +12109,7 @@
         </w:tc>
         <w:tc>
           <w:tcPr>
-            <w:tcW w:w="1825" w:type="dxa"/>
+            <w:tcW w:w="1826" w:type="dxa"/>
             <w:tcBorders>
               <w:top w:val="single" w:sz="4" w:space="0" w:color="D4DCE6"/>
               <w:start w:val="single" w:sz="4" w:space="0" w:color="D4DCE6"/>
@@ -12203,7 +12203,7 @@
         </w:tc>
         <w:tc>
           <w:tcPr>
-            <w:tcW w:w="3175" w:type="dxa"/>
+            <w:tcW w:w="3174" w:type="dxa"/>
             <w:tcBorders>
               <w:top w:val="single" w:sz="4" w:space="0" w:color="D4DCE6"/>
               <w:start w:val="single" w:sz="4" w:space="0" w:color="D4DCE6"/>
@@ -12232,7 +12232,7 @@
         </w:tc>
         <w:tc>
           <w:tcPr>
-            <w:tcW w:w="1825" w:type="dxa"/>
+            <w:tcW w:w="1826" w:type="dxa"/>
             <w:tcBorders>
               <w:top w:val="single" w:sz="4" w:space="0" w:color="D4DCE6"/>
               <w:start w:val="single" w:sz="4" w:space="0" w:color="D4DCE6"/>
@@ -12325,7 +12325,7 @@
         </w:tc>
         <w:tc>
           <w:tcPr>
-            <w:tcW w:w="3175" w:type="dxa"/>
+            <w:tcW w:w="3174" w:type="dxa"/>
             <w:tcBorders>
               <w:top w:val="single" w:sz="4" w:space="0" w:color="D4DCE6"/>
               <w:start w:val="single" w:sz="4" w:space="0" w:color="D4DCE6"/>
@@ -12355,7 +12355,7 @@
         </w:tc>
         <w:tc>
           <w:tcPr>
-            <w:tcW w:w="1825" w:type="dxa"/>
+            <w:tcW w:w="1826" w:type="dxa"/>
             <w:tcBorders>
               <w:top w:val="single" w:sz="4" w:space="0" w:color="D4DCE6"/>
               <w:start w:val="single" w:sz="4" w:space="0" w:color="D4DCE6"/>
@@ -12449,7 +12449,7 @@
         </w:tc>
         <w:tc>
           <w:tcPr>
-            <w:tcW w:w="3175" w:type="dxa"/>
+            <w:tcW w:w="3174" w:type="dxa"/>
             <w:tcBorders>
               <w:top w:val="single" w:sz="4" w:space="0" w:color="D4DCE6"/>
               <w:start w:val="single" w:sz="4" w:space="0" w:color="D4DCE6"/>
@@ -12478,7 +12478,7 @@
         </w:tc>
         <w:tc>
           <w:tcPr>
-            <w:tcW w:w="1825" w:type="dxa"/>
+            <w:tcW w:w="1826" w:type="dxa"/>
             <w:tcBorders>
               <w:top w:val="single" w:sz="4" w:space="0" w:color="D4DCE6"/>
               <w:start w:val="single" w:sz="4" w:space="0" w:color="D4DCE6"/>
@@ -12571,7 +12571,7 @@
         </w:tc>
         <w:tc>
           <w:tcPr>
-            <w:tcW w:w="3175" w:type="dxa"/>
+            <w:tcW w:w="3174" w:type="dxa"/>
             <w:tcBorders>
               <w:top w:val="single" w:sz="4" w:space="0" w:color="D4DCE6"/>
               <w:start w:val="single" w:sz="4" w:space="0" w:color="D4DCE6"/>
@@ -12601,7 +12601,7 @@
         </w:tc>
         <w:tc>
           <w:tcPr>
-            <w:tcW w:w="1825" w:type="dxa"/>
+            <w:tcW w:w="1826" w:type="dxa"/>
             <w:tcBorders>
               <w:top w:val="single" w:sz="4" w:space="0" w:color="D4DCE6"/>
               <w:start w:val="single" w:sz="4" w:space="0" w:color="D4DCE6"/>
@@ -14841,15 +14841,15 @@
       <w:rFonts w:cs="Arial"/>
     </w:rPr>
   </w:style>
-  <w:style w:type="paragraph" w:styleId="Intestazioneepidipagina">
-    <w:name w:val="Intestazione e piè di pagina"/>
+  <w:style w:type="paragraph" w:styleId="Intestazioneepidipaginauser">
+    <w:name w:val="Intestazione e piè di pagina (user)"/>
     <w:basedOn w:val="Normal"/>
     <w:qFormat/>
     <w:pPr/>
     <w:rPr/>
   </w:style>
-  <w:style w:type="paragraph" w:styleId="Intestazioneepidipaginauser">
-    <w:name w:val="Intestazione e piè di pagina (user)"/>
+  <w:style w:type="paragraph" w:styleId="Intestazioneepidipagina">
+    <w:name w:val="Intestazione e piè di pagina"/>
     <w:basedOn w:val="Normal"/>
     <w:qFormat/>
     <w:pPr/>
@@ -15231,7 +15231,7 @@
   </w:style>
   <w:style w:type="paragraph" w:styleId="IndexHeading">
     <w:name w:val="index heading"/>
-    <w:basedOn w:val="Titolo"/>
+    <w:basedOn w:val="Titolouser"/>
     <w:pPr/>
     <w:rPr/>
   </w:style>
@@ -15308,8 +15308,8 @@
       <w:lang w:val="en-US" w:eastAsia="en-US" w:bidi="ar-SA"/>
     </w:rPr>
   </w:style>
-  <w:style w:type="numbering" w:styleId="Nessunelenco" w:default="1">
-    <w:name w:val="Nessun elenco"/>
+  <w:style w:type="numbering" w:styleId="Nessunelencouser" w:default="1">
+    <w:name w:val="Nessun elenco (user)"/>
     <w:uiPriority w:val="99"/>
     <w:semiHidden/>
     <w:unhideWhenUsed/>

</xml_diff>